<commit_message>
data set finalised, prepreprocessing EDA done findings in csv
</commit_message>
<xml_diff>
--- a/admin/Report/thesis paper/Final Report.docx
+++ b/admin/Report/thesis paper/Final Report.docx
@@ -646,15 +646,16 @@
       <w:r>
         <w:t>Contents</w:t>
       </w:r>
+      <w:bookmarkEnd w:id="20"/>
       <w:commentRangeEnd w:id="21"/>
       <w:r>
         <w:rPr>
           <w:rStyle w:val="CommentReference"/>
-          <w:rFonts w:eastAsiaTheme="minorHAnsi" w:cs="Times New Roman"/>
+          <w:sz w:val="24"/>
+          <w:szCs w:val="26"/>
         </w:rPr>
         <w:commentReference w:id="21"/>
       </w:r>
-      <w:bookmarkEnd w:id="20"/>
     </w:p>
     <w:p>
       <w:pPr>
@@ -2734,7 +2735,8 @@
       <w:r>
         <w:rPr>
           <w:rStyle w:val="CommentReference"/>
-          <w:rFonts w:eastAsiaTheme="minorHAnsi" w:cs="Times New Roman"/>
+          <w:sz w:val="24"/>
+          <w:szCs w:val="26"/>
         </w:rPr>
         <w:commentReference w:id="23"/>
       </w:r>
@@ -2749,7 +2751,8 @@
       <w:r>
         <w:rPr>
           <w:rStyle w:val="CommentReference"/>
-          <w:rFonts w:eastAsiaTheme="minorHAnsi" w:cs="Times New Roman"/>
+          <w:sz w:val="24"/>
+          <w:szCs w:val="26"/>
         </w:rPr>
         <w:commentReference w:id="24"/>
       </w:r>
@@ -2941,7 +2944,8 @@
       <w:r>
         <w:rPr>
           <w:rStyle w:val="CommentReference"/>
-          <w:rFonts w:eastAsiaTheme="minorHAnsi" w:cs="Times New Roman"/>
+          <w:sz w:val="24"/>
+          <w:szCs w:val="26"/>
         </w:rPr>
         <w:commentReference w:id="26"/>
       </w:r>
@@ -2956,7 +2960,8 @@
       <w:r>
         <w:rPr>
           <w:rStyle w:val="CommentReference"/>
-          <w:rFonts w:eastAsiaTheme="minorHAnsi" w:cs="Times New Roman"/>
+          <w:sz w:val="24"/>
+          <w:szCs w:val="26"/>
         </w:rPr>
         <w:commentReference w:id="27"/>
       </w:r>
@@ -3145,134 +3150,24 @@
       <w:r>
         <w:rPr>
           <w:rStyle w:val="CommentReference"/>
+          <w:sz w:val="24"/>
+          <w:szCs w:val="26"/>
         </w:rPr>
         <w:commentReference w:id="29"/>
       </w:r>
       <w:r>
         <w:t>.</w:t>
       </w:r>
-      <w:r>
-        <w:br/>
-      </w:r>
-      <w:r>
-        <w:t>About Chapters</w:t>
-      </w:r>
       <w:bookmarkEnd w:id="28"/>
-    </w:p>
-    <w:p>
-      <w:pPr>
-        <w:pStyle w:val="Quote"/>
-      </w:pPr>
-      <w:r>
-        <w:t>Here’s a</w:t>
-      </w:r>
-      <w:r>
-        <w:t xml:space="preserve">n </w:t>
-      </w:r>
-      <w:r>
-        <w:t xml:space="preserve">example of an </w:t>
-      </w:r>
-      <w:r>
-        <w:t xml:space="preserve">epigraph </w:t>
-      </w:r>
-      <w:r>
-        <w:t xml:space="preserve">at the beginning of a chapter.  </w:t>
-      </w:r>
-      <w:r>
-        <w:t xml:space="preserve">Including epigraphs is not a requirement, and so please simply </w:t>
-      </w:r>
-      <w:r>
-        <w:t>delete this text if</w:t>
-      </w:r>
-      <w:r>
-        <w:t xml:space="preserve"> you are</w:t>
-      </w:r>
-      <w:r>
-        <w:t xml:space="preserve"> not using </w:t>
-      </w:r>
-      <w:r>
-        <w:t>any in your thesis</w:t>
-      </w:r>
-      <w:r>
-        <w:t>.</w:t>
-      </w:r>
-      <w:r>
-        <w:t xml:space="preserve"> </w:t>
-      </w:r>
-    </w:p>
-    <w:p>
-      <w:pPr>
-        <w:pStyle w:val="EpigraphAuthor"/>
-      </w:pPr>
-      <w:r>
-        <w:t>—</w:t>
-      </w:r>
-      <w:r>
-        <w:t>Epigraph</w:t>
-      </w:r>
-      <w:commentRangeStart w:id="30"/>
-      <w:r>
-        <w:t xml:space="preserve"> author</w:t>
-      </w:r>
-      <w:commentRangeEnd w:id="30"/>
-      <w:r>
-        <w:rPr>
-          <w:rStyle w:val="CommentReference"/>
-          <w:shd w:val="clear" w:color="auto" w:fill="auto"/>
-        </w:rPr>
-        <w:commentReference w:id="30"/>
-      </w:r>
-    </w:p>
-    <w:p>
-      <w:pPr>
-        <w:pStyle w:val="BodyText"/>
-      </w:pPr>
-      <w:r>
-        <w:t>There are two ways to add a new chapter. First, you can simply type the name of your new chapter on a separate line and apply the </w:t>
-      </w:r>
-      <w:r>
-        <w:rPr>
-          <w:i/>
-          <w:iCs/>
-        </w:rPr>
-        <w:t>Chapter Title</w:t>
-      </w:r>
-      <w:r>
-        <w:t> (or </w:t>
-      </w:r>
-      <w:r>
-        <w:rPr>
-          <w:i/>
-          <w:iCs/>
-        </w:rPr>
-        <w:t>Heading 2</w:t>
-      </w:r>
-      <w:r>
-        <w:t>) style. That will automatically drop your chapter title down to the next page and you may then begin your next chapter. Alternatively, you can copy this section, from the chapter title down to the section break, and then paste it immediately following the section break.</w:t>
-      </w:r>
-    </w:p>
-    <w:p>
-      <w:pPr>
-        <w:pStyle w:val="BodyText"/>
-      </w:pPr>
-      <w:r>
-        <w:t>Whether you need a section break is largely determined by what you plan to do with the structure of your thesis. If you need more than one column (say, for columns of statistics), for example, you’ll want a section break, then another to switch back to one column.</w:t>
-      </w:r>
-      <w:r>
-        <w:rPr>
-          <w:rStyle w:val="FootnoteReference"/>
-        </w:rPr>
-        <w:footnoteReference w:id="1"/>
-      </w:r>
     </w:p>
     <w:p>
       <w:pPr>
         <w:pStyle w:val="BodyText"/>
         <w:sectPr>
-          <w:headerReference w:type="default" r:id="rId21"/>
-          <w:footerReference w:type="default" r:id="rId22"/>
-          <w:headerReference w:type="first" r:id="rId23"/>
-          <w:footerReference w:type="first" r:id="rId24"/>
+          <w:headerReference w:type="default" r:id="rId20"/>
+          <w:footerReference w:type="default" r:id="rId21"/>
+          <w:headerReference w:type="first" r:id="rId22"/>
+          <w:footerReference w:type="first" r:id="rId23"/>
           <w:pgSz w:w="12240" w:h="15840"/>
           <w:pgMar w:top="1440" w:right="1440" w:bottom="1440" w:left="2160" w:header="720" w:footer="720" w:gutter="0"/>
           <w:pgNumType w:start="1"/>
@@ -3282,95 +3177,52 @@
         </w:sectPr>
       </w:pPr>
       <w:r>
-        <w:t>To insert a new section break, go to the </w:t>
-      </w:r>
-      <w:r>
-        <w:rPr>
-          <w:b/>
-          <w:bCs/>
-        </w:rPr>
-        <w:t>Layout</w:t>
-      </w:r>
-      <w:r>
-        <w:rPr>
-          <w:b/>
-          <w:bCs/>
-        </w:rPr>
-        <w:t xml:space="preserve"> </w:t>
-      </w:r>
-      <w:r>
-        <w:t>tab in the Ribbon. In the Page Setup section, choose the </w:t>
-      </w:r>
-      <w:r>
-        <w:rPr>
-          <w:i/>
-          <w:iCs/>
-        </w:rPr>
-        <w:t>Breaks</w:t>
-      </w:r>
-      <w:r>
-        <w:t> dropdown menu; from the second half of the list, choose </w:t>
-      </w:r>
-      <w:r>
-        <w:rPr>
-          <w:i/>
-          <w:iCs/>
-        </w:rPr>
-        <w:t>Section Break: Next Page</w:t>
-      </w:r>
-      <w:r>
-        <w:t> or </w:t>
-      </w:r>
-      <w:r>
-        <w:rPr>
-          <w:i/>
-          <w:iCs/>
-        </w:rPr>
-        <w:t>Section Break: Continuous</w:t>
-      </w:r>
-      <w:r>
-        <w:t> if you don’t want a page break.</w:t>
+        <w:t xml:space="preserve">Current AI systems demonstrate high performance on ethically complex benchmarks, but this performance reflects pattern-level imitation of human moral judgments rather than ethical discernment grounded in first-person normativity. No widely used dataset fully captures the fluid, multifactorial, and non-truth-apt nature of real-world ethics, particularly under non-cognitivist meta-ethical frameworks. This absence suggests that ethical reasoning benchmarks implicitly assume cognitivism and that dataset-based evaluation may be structurally incapable of detecting consciousness-relevant ethical </w:t>
+      </w:r>
+      <w:r>
+        <w:t>properties.</w:t>
       </w:r>
       <w:r>
         <w:rPr>
           <w:rStyle w:val="FootnoteReference"/>
         </w:rPr>
-        <w:footnoteReference w:id="2"/>
+        <w:footnoteReference w:id="1"/>
       </w:r>
     </w:p>
     <w:p>
       <w:pPr>
         <w:pStyle w:val="Heading2"/>
       </w:pPr>
-      <w:bookmarkStart w:id="31" w:name="_Toc476584781"/>
-      <w:bookmarkStart w:id="32" w:name="_Toc171427380"/>
+      <w:bookmarkStart w:id="30" w:name="_Toc476584781"/>
+      <w:bookmarkStart w:id="31" w:name="_Toc171427380"/>
       <w:r>
         <w:lastRenderedPageBreak/>
         <w:t xml:space="preserve">Chapter </w:t>
       </w:r>
-      <w:commentRangeStart w:id="33"/>
+      <w:commentRangeStart w:id="32"/>
       <w:r>
         <w:t>II</w:t>
       </w:r>
-      <w:commentRangeEnd w:id="33"/>
+      <w:commentRangeEnd w:id="32"/>
       <w:r>
         <w:rPr>
           <w:rStyle w:val="CommentReference"/>
-          <w:rFonts w:eastAsiaTheme="minorHAnsi" w:cs="Times New Roman"/>
-        </w:rPr>
-        <w:commentReference w:id="33"/>
+          <w:sz w:val="24"/>
+          <w:szCs w:val="26"/>
+        </w:rPr>
+        <w:commentReference w:id="32"/>
       </w:r>
       <w:r>
         <w:t>.</w:t>
       </w:r>
+      <w:bookmarkEnd w:id="30"/>
+      <w:r>
+        <w:br/>
+      </w:r>
+      <w:r>
+        <w:t>Chapter Styles</w:t>
+      </w:r>
       <w:bookmarkEnd w:id="31"/>
-      <w:r>
-        <w:br/>
-      </w:r>
-      <w:r>
-        <w:t>Chapter Styles</w:t>
-      </w:r>
-      <w:bookmarkEnd w:id="32"/>
     </w:p>
     <w:p>
       <w:pPr>
@@ -3390,22 +3242,14 @@
       <w:pPr>
         <w:pStyle w:val="Heading3"/>
       </w:pPr>
-      <w:bookmarkStart w:id="34" w:name="_Toc171427381"/>
+      <w:bookmarkStart w:id="33" w:name="_Toc171427381"/>
       <w:r>
         <w:t>Heading 3</w:t>
       </w:r>
       <w:r>
-        <w:t xml:space="preserve">, </w:t>
-      </w:r>
-      <w:proofErr w:type="spellStart"/>
-      <w:r>
-        <w:t>SectionTitle</w:t>
-      </w:r>
-      <w:proofErr w:type="spellEnd"/>
-      <w:r>
-        <w:t>/A-Head</w:t>
-      </w:r>
-      <w:bookmarkEnd w:id="34"/>
+        <w:t>, SectionTitle/A-Head</w:t>
+      </w:r>
+      <w:bookmarkEnd w:id="33"/>
     </w:p>
     <w:p>
       <w:pPr>
@@ -3489,14 +3333,14 @@
       <w:pPr>
         <w:pStyle w:val="Heading4"/>
       </w:pPr>
-      <w:bookmarkStart w:id="35" w:name="_Toc171427382"/>
+      <w:bookmarkStart w:id="34" w:name="_Toc171427382"/>
       <w:r>
         <w:t>Heading</w:t>
       </w:r>
       <w:r>
         <w:t xml:space="preserve"> 4, B-Head</w:t>
       </w:r>
-      <w:bookmarkEnd w:id="35"/>
+      <w:bookmarkEnd w:id="34"/>
     </w:p>
     <w:p>
       <w:pPr>
@@ -3518,11 +3362,82 @@
       <w:pPr>
         <w:pStyle w:val="Heading4"/>
       </w:pPr>
-      <w:bookmarkStart w:id="36" w:name="_Toc171427383"/>
+      <w:bookmarkStart w:id="35" w:name="_Toc171427383"/>
       <w:r>
         <w:lastRenderedPageBreak/>
         <w:t>B-Head Style</w:t>
       </w:r>
+      <w:bookmarkEnd w:id="35"/>
+    </w:p>
+    <w:p>
+      <w:pPr>
+        <w:pStyle w:val="BodyText"/>
+      </w:pPr>
+      <w:r>
+        <w:t xml:space="preserve">The B-Head style (shown in the Quick Styles menu as “B-Head”) is used as a header for a subsection within a section of a chapter. For an example, see “B-Head Style” above. Note: there should always be introductory text for the </w:t>
+      </w:r>
+      <w:r>
+        <w:t>section</w:t>
+      </w:r>
+      <w:r>
+        <w:t xml:space="preserve"> before the </w:t>
+      </w:r>
+      <w:r>
+        <w:t>B-Head</w:t>
+      </w:r>
+      <w:r>
+        <w:t xml:space="preserve">. The style immediately following the </w:t>
+      </w:r>
+      <w:r>
+        <w:t>B-Head</w:t>
+      </w:r>
+      <w:r>
+        <w:t xml:space="preserve"> style will default to the Body Text style, to be used for the introduction of the </w:t>
+      </w:r>
+      <w:r>
+        <w:t>sub</w:t>
+      </w:r>
+      <w:r>
+        <w:t>section.</w:t>
+      </w:r>
+    </w:p>
+    <w:p>
+      <w:pPr>
+        <w:pStyle w:val="BodyText"/>
+      </w:pPr>
+      <w:r>
+        <w:t>B-Heads</w:t>
+      </w:r>
+      <w:r>
+        <w:t xml:space="preserve"> will automatically be added to the Table of Contents, directly below the previous </w:t>
+      </w:r>
+      <w:r>
+        <w:t>section</w:t>
+      </w:r>
+      <w:r>
+        <w:t xml:space="preserve"> title and with a </w:t>
+      </w:r>
+      <w:r>
+        <w:t>one</w:t>
+      </w:r>
+      <w:r>
+        <w:t>-inch indent, each time you update the whole TOC.</w:t>
+      </w:r>
+    </w:p>
+    <w:p>
+      <w:pPr>
+        <w:pStyle w:val="Heading4"/>
+      </w:pPr>
+      <w:bookmarkStart w:id="36" w:name="_Toc171427384"/>
+      <w:r>
+        <w:t>B</w:t>
+      </w:r>
+      <w:r>
+        <w:t>-Head</w:t>
+      </w:r>
+      <w:r>
+        <w:t xml:space="preserve"> Style</w:t>
+      </w:r>
       <w:bookmarkEnd w:id="36"/>
     </w:p>
     <w:p>
@@ -3530,143 +3445,72 @@
         <w:pStyle w:val="BodyText"/>
       </w:pPr>
       <w:r>
-        <w:t xml:space="preserve">The B-Head style (shown in the Quick Styles menu as “B-Head”) is used as a header for a subsection within a section of a chapter. For an example, see “B-Head Style” above. Note: there should always be introductory text for the </w:t>
-      </w:r>
-      <w:r>
-        <w:t>section</w:t>
-      </w:r>
-      <w:r>
-        <w:t xml:space="preserve"> before the </w:t>
-      </w:r>
-      <w:r>
-        <w:t>B-Head</w:t>
-      </w:r>
-      <w:r>
-        <w:t xml:space="preserve">. The style immediately following the </w:t>
-      </w:r>
-      <w:r>
-        <w:t>B-Head</w:t>
-      </w:r>
-      <w:r>
-        <w:t xml:space="preserve"> style will default to the Body Text style, to be used for the introduction of the </w:t>
-      </w:r>
-      <w:r>
-        <w:t>sub</w:t>
-      </w:r>
-      <w:r>
-        <w:t>section.</w:t>
-      </w:r>
+        <w:t>The Body Text style (shown in the Quick Styles menu as “Body Text”) is used for standard paragraph styles. This paragraph is using the Body Text style; the default style for the next paragraph is also Body Text.</w:t>
+      </w:r>
+    </w:p>
+    <w:p>
+      <w:pPr>
+        <w:pStyle w:val="Heading4"/>
+      </w:pPr>
+      <w:bookmarkStart w:id="37" w:name="_Toc171427385"/>
+      <w:r>
+        <w:t>C-Head</w:t>
+      </w:r>
+      <w:r>
+        <w:t xml:space="preserve"> Style and A</w:t>
+      </w:r>
+      <w:r>
+        <w:t xml:space="preserve">ccompanying </w:t>
+      </w:r>
+      <w:r>
+        <w:t>P</w:t>
+      </w:r>
+      <w:r>
+        <w:t>aragraph</w:t>
+      </w:r>
+      <w:bookmarkEnd w:id="37"/>
     </w:p>
     <w:p>
       <w:pPr>
         <w:pStyle w:val="BodyText"/>
       </w:pPr>
       <w:r>
-        <w:t>B-Heads</w:t>
-      </w:r>
-      <w:r>
-        <w:t xml:space="preserve"> will automatically be added to the Table of Contents, directly below the previous </w:t>
-      </w:r>
-      <w:r>
-        <w:t>section</w:t>
-      </w:r>
-      <w:r>
-        <w:t xml:space="preserve"> title and with a </w:t>
-      </w:r>
-      <w:r>
-        <w:t>one</w:t>
-      </w:r>
-      <w:r>
-        <w:t>-inch indent, each time you update the whole TOC.</w:t>
-      </w:r>
-    </w:p>
-    <w:p>
-      <w:pPr>
-        <w:pStyle w:val="Heading4"/>
-      </w:pPr>
-      <w:bookmarkStart w:id="37" w:name="_Toc171427384"/>
-      <w:r>
-        <w:t>B</w:t>
-      </w:r>
-      <w:r>
-        <w:t>-Head</w:t>
-      </w:r>
-      <w:r>
-        <w:t xml:space="preserve"> Style</w:t>
-      </w:r>
-      <w:bookmarkEnd w:id="37"/>
-    </w:p>
-    <w:p>
-      <w:pPr>
-        <w:pStyle w:val="BodyText"/>
-      </w:pPr>
-      <w:r>
-        <w:t>The Body Text style (shown in the Quick Styles menu as “Body Text”) is used for standard paragraph styles. This paragraph is using the Body Text style; the default style for the next paragraph is also Body Text.</w:t>
-      </w:r>
-    </w:p>
-    <w:p>
-      <w:pPr>
-        <w:pStyle w:val="Heading4"/>
-      </w:pPr>
-      <w:bookmarkStart w:id="38" w:name="_Toc171427385"/>
-      <w:r>
+        <w:t>The C-Head style (shown in the Quick Styles menu as “</w:t>
+      </w:r>
+      <w:r>
+        <w:t>C</w:t>
+      </w:r>
+      <w:r>
+        <w:t xml:space="preserve">-Head”) is used as a header for a subsection within a </w:t>
+      </w:r>
+      <w:r>
+        <w:t>subsection</w:t>
+      </w:r>
+      <w:r>
+        <w:t>. For example</w:t>
+      </w:r>
+      <w:r>
+        <w:t>:</w:t>
+      </w:r>
+    </w:p>
+    <w:p>
+      <w:pPr>
+        <w:pStyle w:val="C-BodyText"/>
+      </w:pPr>
+      <w:bookmarkStart w:id="38" w:name="_Toc171427386"/>
+      <w:r>
+        <w:rPr>
+          <w:rStyle w:val="Heading5Char"/>
+        </w:rPr>
+        <w:t xml:space="preserve">Body Text with </w:t>
+      </w:r>
+      <w:r>
+        <w:rPr>
+          <w:rStyle w:val="Heading5Char"/>
+        </w:rPr>
         <w:t>C-Head</w:t>
       </w:r>
-      <w:r>
-        <w:t xml:space="preserve"> Style and A</w:t>
-      </w:r>
-      <w:r>
-        <w:t xml:space="preserve">ccompanying </w:t>
-      </w:r>
-      <w:r>
-        <w:t>P</w:t>
-      </w:r>
-      <w:r>
-        <w:t>aragraph</w:t>
-      </w:r>
       <w:bookmarkEnd w:id="38"/>
-    </w:p>
-    <w:p>
-      <w:pPr>
-        <w:pStyle w:val="BodyText"/>
-      </w:pPr>
-      <w:r>
-        <w:t>The C-Head style (shown in the Quick Styles menu as “</w:t>
-      </w:r>
-      <w:r>
-        <w:t>C</w:t>
-      </w:r>
-      <w:r>
-        <w:t xml:space="preserve">-Head”) is used as a header for a subsection within a </w:t>
-      </w:r>
-      <w:r>
-        <w:t>subsection</w:t>
-      </w:r>
-      <w:r>
-        <w:t>. For example</w:t>
-      </w:r>
-      <w:r>
-        <w:t>:</w:t>
-      </w:r>
-    </w:p>
-    <w:p>
-      <w:pPr>
-        <w:pStyle w:val="C-BodyText"/>
-      </w:pPr>
-      <w:bookmarkStart w:id="39" w:name="_Toc171427386"/>
-      <w:r>
-        <w:rPr>
-          <w:rStyle w:val="Heading5Char"/>
-        </w:rPr>
-        <w:t xml:space="preserve">Body Text with </w:t>
-      </w:r>
-      <w:r>
-        <w:rPr>
-          <w:rStyle w:val="Heading5Char"/>
-        </w:rPr>
-        <w:t>C-Head</w:t>
-      </w:r>
-      <w:bookmarkEnd w:id="39"/>
       <w:r>
         <w:t>. This is a C-Head and accompanying paragraph.</w:t>
       </w:r>
@@ -3736,11 +3580,11 @@
       <w:pPr>
         <w:pStyle w:val="Heading4"/>
       </w:pPr>
-      <w:bookmarkStart w:id="40" w:name="_Toc171427387"/>
+      <w:bookmarkStart w:id="39" w:name="_Toc171427387"/>
       <w:r>
         <w:t>Numbered List Style</w:t>
       </w:r>
-      <w:bookmarkEnd w:id="40"/>
+      <w:bookmarkEnd w:id="39"/>
     </w:p>
     <w:p>
       <w:pPr>
@@ -3808,110 +3652,110 @@
       <w:pPr>
         <w:pStyle w:val="Heading4"/>
       </w:pPr>
-      <w:bookmarkStart w:id="41" w:name="_Toc171427388"/>
+      <w:bookmarkStart w:id="40" w:name="_Toc171427388"/>
       <w:r>
         <w:t>Bulleted List Style</w:t>
       </w:r>
+      <w:bookmarkEnd w:id="40"/>
+    </w:p>
+    <w:p>
+      <w:pPr>
+        <w:pStyle w:val="BodyText"/>
+      </w:pPr>
+      <w:r>
+        <w:t>To create a bulleted list, select the lines of text which you want to make a list (whether they’re already in a Word list structure or not) and choose the “Bulleted List” style in the Quick Styles menu. If the list was in a Word list structure previously, it will simply update the styles. If the list was previously formatted by hand, you will need to check that list items begin and end at the correct points and that any typed bullets are removed.</w:t>
+      </w:r>
+    </w:p>
+    <w:p>
+      <w:pPr>
+        <w:pStyle w:val="BulletedList"/>
+      </w:pPr>
+      <w:r>
+        <w:t xml:space="preserve">This is the </w:t>
+      </w:r>
+      <w:r>
+        <w:t>Bulleted</w:t>
+      </w:r>
+      <w:r>
+        <w:t xml:space="preserve"> list style.</w:t>
+      </w:r>
+    </w:p>
+    <w:p>
+      <w:pPr>
+        <w:pStyle w:val="BulletedList"/>
+      </w:pPr>
+      <w:r>
+        <w:t>To add a list item, simply hit Enter at the end of the previous list item.</w:t>
+      </w:r>
+    </w:p>
+    <w:p>
+      <w:pPr>
+        <w:pStyle w:val="BulletedList"/>
+      </w:pPr>
+      <w:r>
+        <w:t>To end the list, hit Enter and then select the “Body Text” style from the Quick Styles menu.</w:t>
+      </w:r>
+    </w:p>
+    <w:p>
+      <w:pPr>
+        <w:pStyle w:val="BodyText"/>
+      </w:pPr>
+      <w:r>
+        <w:t>This is what some body text after a bulleted list would look l</w:t>
+      </w:r>
+      <w:r>
+        <w:t>i</w:t>
+      </w:r>
+      <w:r>
+        <w:t>ke.</w:t>
+      </w:r>
+    </w:p>
+    <w:p>
+      <w:pPr>
+        <w:pStyle w:val="Heading4"/>
+      </w:pPr>
+      <w:bookmarkStart w:id="41" w:name="_Block_Quote_Style"/>
+      <w:bookmarkStart w:id="42" w:name="_Toc171427389"/>
       <w:bookmarkEnd w:id="41"/>
+      <w:r>
+        <w:t>Block Quote Style</w:t>
+      </w:r>
+      <w:bookmarkEnd w:id="42"/>
     </w:p>
     <w:p>
       <w:pPr>
         <w:pStyle w:val="BodyText"/>
       </w:pPr>
       <w:r>
-        <w:t>To create a bulleted list, select the lines of text which you want to make a list (whether they’re already in a Word list structure or not) and choose the “Bulleted List” style in the Quick Styles menu. If the list was in a Word list structure previously, it will simply update the styles. If the list was previously formatted by hand, you will need to check that list items begin and end at the correct points and that any typed bullets are removed.</w:t>
-      </w:r>
-    </w:p>
-    <w:p>
-      <w:pPr>
-        <w:pStyle w:val="BulletedList"/>
-      </w:pPr>
-      <w:r>
-        <w:t xml:space="preserve">This is the </w:t>
-      </w:r>
-      <w:r>
-        <w:t>Bulleted</w:t>
-      </w:r>
-      <w:r>
-        <w:t xml:space="preserve"> list style.</w:t>
-      </w:r>
-    </w:p>
-    <w:p>
-      <w:pPr>
-        <w:pStyle w:val="BulletedList"/>
-      </w:pPr>
-      <w:r>
-        <w:t>To add a list item, simply hit Enter at the end of the previous list item.</w:t>
-      </w:r>
-    </w:p>
-    <w:p>
-      <w:pPr>
-        <w:pStyle w:val="BulletedList"/>
-      </w:pPr>
-      <w:r>
-        <w:t>To end the list, hit Enter and then select the “Body Text” style from the Quick Styles menu.</w:t>
-      </w:r>
-    </w:p>
-    <w:p>
-      <w:pPr>
-        <w:pStyle w:val="BodyText"/>
-      </w:pPr>
-      <w:r>
-        <w:t>This is what some body text after a bulleted list would look l</w:t>
-      </w:r>
-      <w:r>
-        <w:t>i</w:t>
-      </w:r>
-      <w:r>
-        <w:t>ke.</w:t>
+        <w:t>The Block Quote Style is used for quoting large selections of text, rather than a word or phrase.</w:t>
+      </w:r>
+    </w:p>
+    <w:p>
+      <w:pPr>
+        <w:pStyle w:val="BlockQuote"/>
+      </w:pPr>
+      <w:r>
+        <w:t>Blockquotes are further indented to distinguish them from body text. They’re also single-spaced rather than double-spaced.</w:t>
+      </w:r>
+    </w:p>
+    <w:p>
+      <w:pPr>
+        <w:pStyle w:val="BlockQuote"/>
+      </w:pPr>
+      <w:r>
+        <w:t>A multi-paragraph block quote will look like this, with a space between the paragraphs to differentiate them.</w:t>
       </w:r>
     </w:p>
     <w:p>
       <w:pPr>
         <w:pStyle w:val="Heading4"/>
       </w:pPr>
-      <w:bookmarkStart w:id="42" w:name="_Block_Quote_Style"/>
-      <w:bookmarkStart w:id="43" w:name="_Toc171427389"/>
-      <w:bookmarkEnd w:id="42"/>
-      <w:r>
-        <w:t>Block Quote Style</w:t>
-      </w:r>
-      <w:bookmarkEnd w:id="43"/>
-    </w:p>
-    <w:p>
-      <w:pPr>
-        <w:pStyle w:val="BodyText"/>
-      </w:pPr>
-      <w:r>
-        <w:t>The Block Quote Style is used for quoting large selections of text, rather than a word or phrase.</w:t>
-      </w:r>
-    </w:p>
-    <w:p>
-      <w:pPr>
-        <w:pStyle w:val="BlockQuote"/>
-      </w:pPr>
-      <w:r>
-        <w:t>Blockquotes are further indented to distinguish them from body text. They’re also single-spaced rather than double-spaced.</w:t>
-      </w:r>
-    </w:p>
-    <w:p>
-      <w:pPr>
-        <w:pStyle w:val="BlockQuote"/>
-      </w:pPr>
-      <w:r>
-        <w:t>A multi-paragraph block quote will look like this, with a space between the paragraphs to differentiate them.</w:t>
-      </w:r>
-    </w:p>
-    <w:p>
-      <w:pPr>
-        <w:pStyle w:val="Heading4"/>
-      </w:pPr>
-      <w:bookmarkStart w:id="44" w:name="_Toc171427390"/>
+      <w:bookmarkStart w:id="43" w:name="_Toc171427390"/>
       <w:r>
         <w:lastRenderedPageBreak/>
         <w:t>Figures</w:t>
       </w:r>
-      <w:bookmarkEnd w:id="44"/>
+      <w:bookmarkEnd w:id="43"/>
     </w:p>
     <w:p>
       <w:pPr>
@@ -3927,15 +3771,7 @@
         <w:t xml:space="preserve">ou can </w:t>
       </w:r>
       <w:r>
-        <w:t xml:space="preserve">either copy and paste a figure into the document or use the Insert Pictures command in the Insert ribbon. Once you have the image inserted, click on the picture and select the dropdown menu that appears: make sure the “In Line </w:t>
-      </w:r>
-      <w:proofErr w:type="gramStart"/>
-      <w:r>
-        <w:t>With</w:t>
-      </w:r>
-      <w:proofErr w:type="gramEnd"/>
-      <w:r>
-        <w:t xml:space="preserve"> Text” option is selected</w:t>
+        <w:t>either copy and paste a figure into the document or use the Insert Pictures command in the Insert ribbon. Once you have the image inserted, click on the picture and select the dropdown menu that appears: make sure the “In Line With Text” option is selected</w:t>
       </w:r>
       <w:r>
         <w:t>, in order to keep the picture aligned properly and associated with the correct text. Example</w:t>
@@ -3964,11 +3800,11 @@
         <w:t xml:space="preserve"> from the Styles list.</w:t>
       </w:r>
     </w:p>
+    <w:bookmarkStart w:id="44" w:name="_Toc473816963"/>
     <w:p>
       <w:pPr>
         <w:pStyle w:val="BodyText"/>
       </w:pPr>
-      <w:bookmarkStart w:id="45" w:name="_Toc473816963"/>
       <w:r>
         <w:rPr>
           <w:noProof/>
@@ -4036,7 +3872,7 @@
       <w:pPr>
         <w:pStyle w:val="FigureTitle"/>
       </w:pPr>
-      <w:bookmarkStart w:id="46" w:name="_Toc500510491"/>
+      <w:bookmarkStart w:id="45" w:name="_Toc500510491"/>
       <w:r>
         <w:t xml:space="preserve">Figure 1. </w:t>
       </w:r>
@@ -4049,50 +3885,50 @@
       <w:r>
         <w:t>.</w:t>
       </w:r>
+      <w:bookmarkEnd w:id="44"/>
       <w:bookmarkEnd w:id="45"/>
+    </w:p>
+    <w:p>
+      <w:pPr>
+        <w:pStyle w:val="FigureDescription"/>
+      </w:pPr>
+      <w:r>
+        <w:t>Description of Figure 1, legend brief citation, etc.</w:t>
+      </w:r>
+    </w:p>
+    <w:p>
+      <w:pPr>
+        <w:pStyle w:val="C-BodyText"/>
+      </w:pPr>
+      <w:bookmarkStart w:id="46" w:name="_Toc171427391"/>
+      <w:r>
+        <w:rPr>
+          <w:rStyle w:val="Heading5Char"/>
+        </w:rPr>
+        <w:t>Figure Title Style.</w:t>
+      </w:r>
       <w:bookmarkEnd w:id="46"/>
-    </w:p>
-    <w:p>
-      <w:pPr>
-        <w:pStyle w:val="FigureDescription"/>
-      </w:pPr>
-      <w:r>
-        <w:t>Description of Figure 1, legend brief citation, etc.</w:t>
+      <w:r>
+        <w:t xml:space="preserve"> The Figure Title </w:t>
+      </w:r>
+      <w:r>
+        <w:t>s</w:t>
+      </w:r>
+      <w:r>
+        <w:t>tyle, which appears in the Quick Styles menu as “Figure Title,” is used to name a figure in a way that will appear in the TOC. The title will automatically be added to the List of Figures following an update of the entire table.</w:t>
+      </w:r>
+      <w:r>
+        <w:t xml:space="preserve"> Remember to place a tab between the figure number and the title, as shown above, in order to preserve formatting in the TOC.</w:t>
+      </w:r>
+      <w:r>
+        <w:t xml:space="preserve"> Note: the style of the paragraph following Figure Title defaults to Figure Description.</w:t>
       </w:r>
     </w:p>
     <w:p>
       <w:pPr>
         <w:pStyle w:val="C-BodyText"/>
       </w:pPr>
-      <w:bookmarkStart w:id="47" w:name="_Toc171427391"/>
-      <w:r>
-        <w:rPr>
-          <w:rStyle w:val="Heading5Char"/>
-        </w:rPr>
-        <w:t>Figure Title Style.</w:t>
-      </w:r>
-      <w:bookmarkEnd w:id="47"/>
-      <w:r>
-        <w:t xml:space="preserve"> The Figure Title </w:t>
-      </w:r>
-      <w:r>
-        <w:t>s</w:t>
-      </w:r>
-      <w:r>
-        <w:t>tyle, which appears in the Quick Styles menu as “Figure Title,” is used to name a figure in a way that will appear in the TOC. The title will automatically be added to the List of Figures following an update of the entire table.</w:t>
-      </w:r>
-      <w:r>
-        <w:t xml:space="preserve"> Remember to place a tab between the figure number and the title, as shown above, in order to preserve formatting in the TOC.</w:t>
-      </w:r>
-      <w:r>
-        <w:t xml:space="preserve"> Note: the style of the paragraph following Figure Title defaults to Figure Description.</w:t>
-      </w:r>
-    </w:p>
-    <w:p>
-      <w:pPr>
-        <w:pStyle w:val="C-BodyText"/>
-      </w:pPr>
-      <w:bookmarkStart w:id="48" w:name="_Toc171427392"/>
+      <w:bookmarkStart w:id="47" w:name="_Toc171427392"/>
       <w:r>
         <w:rPr>
           <w:rStyle w:val="Heading5Char"/>
@@ -4100,61 +3936,53 @@
         <w:lastRenderedPageBreak/>
         <w:t>Figure Description Style.</w:t>
       </w:r>
+      <w:bookmarkEnd w:id="47"/>
+      <w:r>
+        <w:t xml:space="preserve"> The Figure Description style, which appears in the Quick Styles menu as “Figure Description,” is used to briefly describe the accompanying figure</w:t>
+      </w:r>
+      <w:r>
+        <w:t>; the space after it separates it from the body text below the figure.</w:t>
+      </w:r>
+    </w:p>
+    <w:p>
+      <w:pPr>
+        <w:pStyle w:val="Heading4"/>
+      </w:pPr>
+      <w:bookmarkStart w:id="48" w:name="_Toc171427393"/>
+      <w:r>
+        <w:t>Tables</w:t>
+      </w:r>
       <w:bookmarkEnd w:id="48"/>
-      <w:r>
-        <w:t xml:space="preserve"> The Figure Description style, which appears in the Quick Styles menu as “Figure Description,” is used to briefly describe the accompanying figure</w:t>
-      </w:r>
-      <w:r>
-        <w:t>; the space after it separates it from the body text below the figure.</w:t>
-      </w:r>
-    </w:p>
-    <w:p>
-      <w:pPr>
-        <w:pStyle w:val="Heading4"/>
-      </w:pPr>
-      <w:bookmarkStart w:id="49" w:name="_Toc171427393"/>
-      <w:r>
-        <w:t>Tables</w:t>
+    </w:p>
+    <w:p>
+      <w:pPr>
+        <w:pStyle w:val="BodyText"/>
+      </w:pPr>
+      <w:r>
+        <w:t>Tables can copied and pasted from another document or created in the Word document itself using the Insert Table command on the Insert tab of the ribbon. A sample table:</w:t>
+      </w:r>
+    </w:p>
+    <w:p>
+      <w:pPr>
+        <w:pStyle w:val="TableTitle"/>
+      </w:pPr>
+      <w:bookmarkStart w:id="49" w:name="_Toc500509875"/>
+      <w:r>
+        <w:t>Table 1</w:t>
+      </w:r>
+      <w:r>
+        <w:t xml:space="preserve">. </w:t>
+      </w:r>
+      <w:r>
+        <w:tab/>
+      </w:r>
+      <w:r>
+        <w:t>Table Title</w:t>
+      </w:r>
+      <w:r>
+        <w:t>.</w:t>
       </w:r>
       <w:bookmarkEnd w:id="49"/>
-    </w:p>
-    <w:p>
-      <w:pPr>
-        <w:pStyle w:val="BodyText"/>
-      </w:pPr>
-      <w:r>
-        <w:t xml:space="preserve">Tables can </w:t>
-      </w:r>
-      <w:proofErr w:type="gramStart"/>
-      <w:r>
-        <w:t>copied</w:t>
-      </w:r>
-      <w:proofErr w:type="gramEnd"/>
-      <w:r>
-        <w:t xml:space="preserve"> and pasted from another document or created in the Word document itself using the Insert Table command on the Insert tab of the ribbon. A sample table:</w:t>
-      </w:r>
-    </w:p>
-    <w:p>
-      <w:pPr>
-        <w:pStyle w:val="TableTitle"/>
-      </w:pPr>
-      <w:bookmarkStart w:id="50" w:name="_Toc500509875"/>
-      <w:r>
-        <w:t>Table 1</w:t>
-      </w:r>
-      <w:r>
-        <w:t xml:space="preserve">. </w:t>
-      </w:r>
-      <w:r>
-        <w:tab/>
-      </w:r>
-      <w:r>
-        <w:t>Table Title</w:t>
-      </w:r>
-      <w:r>
-        <w:t>.</w:t>
-      </w:r>
-      <w:bookmarkEnd w:id="50"/>
     </w:p>
     <w:tbl>
       <w:tblPr>
@@ -4195,19 +4023,9 @@
               <w:pStyle w:val="TableCell"/>
               <w:jc w:val="center"/>
             </w:pPr>
-            <w:proofErr w:type="spellStart"/>
             <w:r>
-              <w:t>Augue</w:t>
+              <w:t>Augue vel tellus</w:t>
             </w:r>
-            <w:proofErr w:type="spellEnd"/>
-            <w:r>
-              <w:t xml:space="preserve"> vel </w:t>
-            </w:r>
-            <w:proofErr w:type="spellStart"/>
-            <w:r>
-              <w:t>tellus</w:t>
-            </w:r>
-            <w:proofErr w:type="spellEnd"/>
           </w:p>
         </w:tc>
         <w:tc>
@@ -4220,13 +4038,8 @@
               <w:jc w:val="center"/>
             </w:pPr>
             <w:r>
-              <w:t xml:space="preserve">Sed </w:t>
+              <w:t>Sed sagittis</w:t>
             </w:r>
-            <w:proofErr w:type="spellStart"/>
-            <w:r>
-              <w:t>sagittis</w:t>
-            </w:r>
-            <w:proofErr w:type="spellEnd"/>
           </w:p>
         </w:tc>
       </w:tr>
@@ -4240,13 +4053,8 @@
               <w:pStyle w:val="TableCell"/>
             </w:pPr>
             <w:r>
-              <w:t xml:space="preserve">Est </w:t>
+              <w:t>Est blandit</w:t>
             </w:r>
-            <w:proofErr w:type="spellStart"/>
-            <w:r>
-              <w:t>blandit</w:t>
-            </w:r>
-            <w:proofErr w:type="spellEnd"/>
           </w:p>
         </w:tc>
         <w:tc>
@@ -4288,13 +4096,8 @@
               <w:pStyle w:val="TableCell"/>
             </w:pPr>
             <w:r>
-              <w:t xml:space="preserve">Sed </w:t>
+              <w:t>Sed est</w:t>
             </w:r>
-            <w:proofErr w:type="spellStart"/>
-            <w:r>
-              <w:t>est</w:t>
-            </w:r>
-            <w:proofErr w:type="spellEnd"/>
           </w:p>
         </w:tc>
         <w:tc>
@@ -4350,7 +4153,7 @@
       <w:pPr>
         <w:pStyle w:val="C-BodyText"/>
       </w:pPr>
-      <w:bookmarkStart w:id="51" w:name="_Toc171427394"/>
+      <w:bookmarkStart w:id="50" w:name="_Toc171427394"/>
       <w:r>
         <w:rPr>
           <w:rStyle w:val="Heading5Char"/>
@@ -4363,32 +4166,32 @@
         </w:rPr>
         <w:t>.</w:t>
       </w:r>
+      <w:bookmarkEnd w:id="50"/>
+      <w:r>
+        <w:t xml:space="preserve"> The Table Title should come immediately before the table itself</w:t>
+      </w:r>
+      <w:r>
+        <w:t>; the style appears in the Quick Styles menu as “Table Title,”</w:t>
+      </w:r>
+      <w:r>
+        <w:t xml:space="preserve"> </w:t>
+      </w:r>
+      <w:r>
+        <w:t>In order to preserve formatting of the TOC entry, insert a Tab character between the table number and the table title, as shown above.</w:t>
+      </w:r>
+    </w:p>
+    <w:p>
+      <w:pPr>
+        <w:pStyle w:val="C-BodyText"/>
+      </w:pPr>
+      <w:bookmarkStart w:id="51" w:name="_Toc171427395"/>
+      <w:r>
+        <w:rPr>
+          <w:rStyle w:val="Heading5Char"/>
+        </w:rPr>
+        <w:t>Table Cell Style.</w:t>
+      </w:r>
       <w:bookmarkEnd w:id="51"/>
-      <w:r>
-        <w:t xml:space="preserve"> The Table Title should come immediately before the table itself</w:t>
-      </w:r>
-      <w:r>
-        <w:t>; the style appears in the Quick Styles menu as “Table Title,”</w:t>
-      </w:r>
-      <w:r>
-        <w:t xml:space="preserve"> </w:t>
-      </w:r>
-      <w:r>
-        <w:t>In order to preserve formatting of the TOC entry, insert a Tab character between the table number and the table title, as shown above.</w:t>
-      </w:r>
-    </w:p>
-    <w:p>
-      <w:pPr>
-        <w:pStyle w:val="C-BodyText"/>
-      </w:pPr>
-      <w:bookmarkStart w:id="52" w:name="_Toc171427395"/>
-      <w:r>
-        <w:rPr>
-          <w:rStyle w:val="Heading5Char"/>
-        </w:rPr>
-        <w:t>Table Cell Style.</w:t>
-      </w:r>
-      <w:bookmarkEnd w:id="52"/>
       <w:r>
         <w:t xml:space="preserve"> To apply this style to the table cells, highlight the table and choose “Table Cell” from the Quick Styles menu. The default will be to left-align the text inside the cells; to center text, as in the second and third columns above, </w:t>
       </w:r>
@@ -4410,7 +4213,7 @@
       <w:pPr>
         <w:pStyle w:val="C-BodyText"/>
       </w:pPr>
-      <w:bookmarkStart w:id="53" w:name="_Toc171427396"/>
+      <w:bookmarkStart w:id="52" w:name="_Toc171427396"/>
       <w:r>
         <w:rPr>
           <w:rStyle w:val="Heading5Char"/>
@@ -4423,28 +4226,46 @@
         </w:rPr>
         <w:t>.</w:t>
       </w:r>
+      <w:bookmarkEnd w:id="52"/>
+      <w:r>
+        <w:t xml:space="preserve"> The Table Description style, shown in the Quick Styles menu as “Table Description,” is used to format the brief description of the table immediately following said table. This style also includes space after to differentiate it from later paragraphs.</w:t>
+      </w:r>
+    </w:p>
+    <w:p>
+      <w:pPr>
+        <w:pStyle w:val="Heading3"/>
+      </w:pPr>
+      <w:bookmarkStart w:id="53" w:name="_Toc171427397"/>
+      <w:r>
+        <w:t>Styles Used in Other Parts of the Document</w:t>
+      </w:r>
       <w:bookmarkEnd w:id="53"/>
-      <w:r>
-        <w:t xml:space="preserve"> The Table Description style, shown in the Quick Styles menu as “Table Description,” is used to format the brief description of the table immediately following said table. This style also includes space after to differentiate it from later paragraphs.</w:t>
-      </w:r>
-    </w:p>
-    <w:p>
-      <w:pPr>
-        <w:pStyle w:val="Heading3"/>
-      </w:pPr>
-      <w:bookmarkStart w:id="54" w:name="_Toc171427397"/>
-      <w:r>
-        <w:t>Styles Used in Other Parts of the Document</w:t>
+    </w:p>
+    <w:p>
+      <w:pPr>
+        <w:pStyle w:val="Heading4"/>
+      </w:pPr>
+      <w:bookmarkStart w:id="54" w:name="_Toc171427398"/>
+      <w:r>
+        <w:t>Title Style</w:t>
       </w:r>
       <w:bookmarkEnd w:id="54"/>
     </w:p>
     <w:p>
       <w:pPr>
+        <w:pStyle w:val="BodyText"/>
+      </w:pPr>
+      <w:r>
+        <w:t>The only time the Title style is used is on the first page of the document. It is exactly 2” from the top of the document.</w:t>
+      </w:r>
+    </w:p>
+    <w:p>
+      <w:pPr>
         <w:pStyle w:val="Heading4"/>
       </w:pPr>
-      <w:bookmarkStart w:id="55" w:name="_Toc171427398"/>
-      <w:r>
-        <w:t>Title Style</w:t>
+      <w:bookmarkStart w:id="55" w:name="_Toc171427399"/>
+      <w:r>
+        <w:t>Author Style</w:t>
       </w:r>
       <w:bookmarkEnd w:id="55"/>
     </w:p>
@@ -4453,16 +4274,16 @@
         <w:pStyle w:val="BodyText"/>
       </w:pPr>
       <w:r>
-        <w:t>The only time the Title style is used is on the first page of the document. It is exactly 2” from the top of the document.</w:t>
+        <w:t>The Author style is also used only on the first page of the document and begins exactly 2” below the title.</w:t>
       </w:r>
     </w:p>
     <w:p>
       <w:pPr>
         <w:pStyle w:val="Heading4"/>
       </w:pPr>
-      <w:bookmarkStart w:id="56" w:name="_Toc171427399"/>
-      <w:r>
-        <w:t>Author Style</w:t>
+      <w:bookmarkStart w:id="56" w:name="_Toc171427400"/>
+      <w:r>
+        <w:t>Centered Text Style</w:t>
       </w:r>
       <w:bookmarkEnd w:id="56"/>
     </w:p>
@@ -4471,16 +4292,17 @@
         <w:pStyle w:val="BodyText"/>
       </w:pPr>
       <w:r>
-        <w:t>The Author style is also used only on the first page of the document and begins exactly 2” below the title.</w:t>
+        <w:t>The Centered Text style is to be used on the first page for the Degree information.</w:t>
       </w:r>
     </w:p>
     <w:p>
       <w:pPr>
         <w:pStyle w:val="Heading4"/>
       </w:pPr>
-      <w:bookmarkStart w:id="57" w:name="_Toc171427400"/>
-      <w:r>
-        <w:t>Centered Text Style</w:t>
+      <w:bookmarkStart w:id="57" w:name="_Toc171427401"/>
+      <w:r>
+        <w:lastRenderedPageBreak/>
+        <w:t>Harvard,Month,Year Style</w:t>
       </w:r>
       <w:bookmarkEnd w:id="57"/>
     </w:p>
@@ -4489,27 +4311,16 @@
         <w:pStyle w:val="BodyText"/>
       </w:pPr>
       <w:r>
-        <w:t>The Centered Text style is to be used on the first page for the Degree information.</w:t>
+        <w:t>The Harvard,Month,Year style is for use on the front page for the University name and the month and year of graduation.</w:t>
       </w:r>
     </w:p>
     <w:p>
       <w:pPr>
         <w:pStyle w:val="Heading4"/>
       </w:pPr>
-      <w:bookmarkStart w:id="58" w:name="_Toc171427401"/>
-      <w:proofErr w:type="spellStart"/>
-      <w:proofErr w:type="gramStart"/>
-      <w:r>
-        <w:lastRenderedPageBreak/>
-        <w:t>Harvard,Month</w:t>
-      </w:r>
-      <w:proofErr w:type="gramEnd"/>
-      <w:r>
-        <w:t>,Year</w:t>
-      </w:r>
-      <w:proofErr w:type="spellEnd"/>
-      <w:r>
-        <w:t xml:space="preserve"> Style</w:t>
+      <w:bookmarkStart w:id="58" w:name="_Toc171427402"/>
+      <w:r>
+        <w:t>Copyright Style</w:t>
       </w:r>
       <w:bookmarkEnd w:id="58"/>
     </w:p>
@@ -4518,29 +4329,16 @@
         <w:pStyle w:val="BodyText"/>
       </w:pPr>
       <w:r>
-        <w:t xml:space="preserve">The </w:t>
-      </w:r>
-      <w:proofErr w:type="spellStart"/>
-      <w:proofErr w:type="gramStart"/>
-      <w:r>
-        <w:t>Harvard,Month</w:t>
-      </w:r>
-      <w:proofErr w:type="gramEnd"/>
-      <w:r>
-        <w:t>,Year</w:t>
-      </w:r>
-      <w:proofErr w:type="spellEnd"/>
-      <w:r>
-        <w:t xml:space="preserve"> style is for use on the front page for the University name and the month and year of graduation.</w:t>
+        <w:t>The Copyright style is for use on the second page for copyright information.</w:t>
       </w:r>
     </w:p>
     <w:p>
       <w:pPr>
         <w:pStyle w:val="Heading4"/>
       </w:pPr>
-      <w:bookmarkStart w:id="59" w:name="_Toc171427402"/>
-      <w:r>
-        <w:t>Copyright Style</w:t>
+      <w:bookmarkStart w:id="59" w:name="_Toc171427403"/>
+      <w:r>
+        <w:t>No-TOC-Heading Style</w:t>
       </w:r>
       <w:bookmarkEnd w:id="59"/>
     </w:p>
@@ -4549,16 +4347,19 @@
         <w:pStyle w:val="BodyText"/>
       </w:pPr>
       <w:r>
-        <w:t>The Copyright style is for use on the second page for copyright information.</w:t>
+        <w:t>The No-TOC-Heading style is for use when chapter-type headings should not be included in the table of contents, such as the Abstract.</w:t>
+      </w:r>
+      <w:r>
+        <w:t xml:space="preserve"> Its appearance is exactly the same as the Chapter Title style but will not be included when the table of contents is updated.</w:t>
       </w:r>
     </w:p>
     <w:p>
       <w:pPr>
         <w:pStyle w:val="Heading4"/>
       </w:pPr>
-      <w:bookmarkStart w:id="60" w:name="_Toc171427403"/>
-      <w:r>
-        <w:t>No-TOC-Heading Style</w:t>
+      <w:bookmarkStart w:id="60" w:name="_Toc171427404"/>
+      <w:r>
+        <w:t>Bibliography Entry Style</w:t>
       </w:r>
       <w:bookmarkEnd w:id="60"/>
     </w:p>
@@ -4567,36 +4368,7 @@
         <w:pStyle w:val="BodyText"/>
       </w:pPr>
       <w:r>
-        <w:t>The No-TOC-Heading style is for use when chapter-type headings should not be included in the table of contents, such as the Abstract.</w:t>
-      </w:r>
-      <w:r>
-        <w:t xml:space="preserve"> Its appearance is exactly the same as the Chapter Title style but will not be included when the table of contents is updated.</w:t>
-      </w:r>
-    </w:p>
-    <w:p>
-      <w:pPr>
-        <w:pStyle w:val="Heading4"/>
-      </w:pPr>
-      <w:bookmarkStart w:id="61" w:name="_Toc171427404"/>
-      <w:r>
-        <w:t>Bibliography Entry Style</w:t>
-      </w:r>
-      <w:bookmarkEnd w:id="61"/>
-    </w:p>
-    <w:p>
-      <w:pPr>
-        <w:pStyle w:val="BodyText"/>
-      </w:pPr>
-      <w:r>
-        <w:t xml:space="preserve">The Bibliography Entry style is single-spaced with a double-space between entries and has a hanging indent of one-half inch. The sample text includes only a few examples of different style guides for different types of </w:t>
-      </w:r>
-      <w:proofErr w:type="gramStart"/>
-      <w:r>
-        <w:t>document</w:t>
-      </w:r>
-      <w:proofErr w:type="gramEnd"/>
-      <w:r>
-        <w:t>: please be sure to format your bibliography entries using the style guide required for your thesis type.</w:t>
+        <w:t>The Bibliography Entry style is single-spaced with a double-space between entries and has a hanging indent of one-half inch. The sample text includes only a few examples of different style guides for different types of document: please be sure to format your bibliography entries using the style guide required for your thesis type.</w:t>
       </w:r>
     </w:p>
     <w:p>
@@ -4675,8 +4447,8 @@
       <w:pPr>
         <w:pStyle w:val="Heading2"/>
       </w:pPr>
-      <w:bookmarkStart w:id="62" w:name="_Toc171427405"/>
-      <w:bookmarkStart w:id="63" w:name="_Hlk100312797"/>
+      <w:bookmarkStart w:id="61" w:name="_Toc171427405"/>
+      <w:bookmarkStart w:id="62" w:name="_Hlk100312797"/>
       <w:r>
         <w:lastRenderedPageBreak/>
         <w:t>Appendix 1</w:t>
@@ -4690,7 +4462,7 @@
       <w:r>
         <w:t>Title</w:t>
       </w:r>
-      <w:bookmarkEnd w:id="62"/>
+      <w:bookmarkEnd w:id="61"/>
     </w:p>
     <w:p>
       <w:pPr>
@@ -4723,7 +4495,7 @@
       <w:pPr>
         <w:pStyle w:val="TableTitle"/>
       </w:pPr>
-      <w:bookmarkStart w:id="64" w:name="_Toc500509876"/>
+      <w:bookmarkStart w:id="63" w:name="_Toc500509876"/>
       <w:r>
         <w:t xml:space="preserve">Table </w:t>
       </w:r>
@@ -4736,7 +4508,7 @@
       <w:r>
         <w:t>Table Title</w:t>
       </w:r>
-      <w:bookmarkEnd w:id="64"/>
+      <w:bookmarkEnd w:id="63"/>
       <w:r>
         <w:t>.</w:t>
       </w:r>
@@ -4779,19 +4551,9 @@
             <w:pPr>
               <w:pStyle w:val="TableCell"/>
             </w:pPr>
-            <w:proofErr w:type="spellStart"/>
             <w:r>
-              <w:t>Augue</w:t>
+              <w:t>Augue vel tellus</w:t>
             </w:r>
-            <w:proofErr w:type="spellEnd"/>
-            <w:r>
-              <w:t xml:space="preserve"> vel </w:t>
-            </w:r>
-            <w:proofErr w:type="spellStart"/>
-            <w:r>
-              <w:t>tellus</w:t>
-            </w:r>
-            <w:proofErr w:type="spellEnd"/>
           </w:p>
         </w:tc>
         <w:tc>
@@ -4803,13 +4565,8 @@
               <w:pStyle w:val="TableCell"/>
             </w:pPr>
             <w:r>
-              <w:t xml:space="preserve">Sed </w:t>
+              <w:t>Sed sagittis</w:t>
             </w:r>
-            <w:proofErr w:type="spellStart"/>
-            <w:r>
-              <w:t>sagittis</w:t>
-            </w:r>
-            <w:proofErr w:type="spellEnd"/>
           </w:p>
         </w:tc>
       </w:tr>
@@ -4823,13 +4580,8 @@
               <w:pStyle w:val="TableCell"/>
             </w:pPr>
             <w:r>
-              <w:t xml:space="preserve">Est </w:t>
+              <w:t>Est blandit</w:t>
             </w:r>
-            <w:proofErr w:type="spellStart"/>
-            <w:r>
-              <w:t>blandit</w:t>
-            </w:r>
-            <w:proofErr w:type="spellEnd"/>
           </w:p>
         </w:tc>
         <w:tc>
@@ -4869,13 +4621,8 @@
               <w:pStyle w:val="TableCell"/>
             </w:pPr>
             <w:r>
-              <w:t xml:space="preserve">Sed </w:t>
+              <w:t>Sed est</w:t>
             </w:r>
-            <w:proofErr w:type="spellStart"/>
-            <w:r>
-              <w:t>est</w:t>
-            </w:r>
-            <w:proofErr w:type="spellEnd"/>
           </w:p>
         </w:tc>
         <w:tc>
@@ -4929,7 +4676,7 @@
       <w:pPr>
         <w:pStyle w:val="Heading2"/>
       </w:pPr>
-      <w:bookmarkStart w:id="65" w:name="_Toc171427406"/>
+      <w:bookmarkStart w:id="64" w:name="_Toc171427406"/>
       <w:r>
         <w:lastRenderedPageBreak/>
         <w:t>Appendix 2</w:t>
@@ -4941,7 +4688,7 @@
         <w:br/>
         <w:t>Title</w:t>
       </w:r>
-      <w:bookmarkEnd w:id="65"/>
+      <w:bookmarkEnd w:id="64"/>
     </w:p>
     <w:p>
       <w:pPr>
@@ -4954,11 +4701,11 @@
         <w:t>.</w:t>
       </w:r>
     </w:p>
+    <w:bookmarkStart w:id="65" w:name="_Toc473816964"/>
     <w:p>
       <w:pPr>
         <w:pStyle w:val="Figure"/>
       </w:pPr>
-      <w:bookmarkStart w:id="66" w:name="_Toc473816964"/>
       <w:r>
         <w:rPr>
           <w:noProof/>
@@ -5027,7 +4774,7 @@
       <w:pPr>
         <w:pStyle w:val="FigureTitle"/>
       </w:pPr>
-      <w:bookmarkStart w:id="67" w:name="_Toc500510492"/>
+      <w:bookmarkStart w:id="66" w:name="_Toc500510492"/>
       <w:r>
         <w:t>Figure 2</w:t>
       </w:r>
@@ -5037,8 +4784,8 @@
       <w:r>
         <w:t>Figure Title</w:t>
       </w:r>
+      <w:bookmarkEnd w:id="65"/>
       <w:bookmarkEnd w:id="66"/>
-      <w:bookmarkEnd w:id="67"/>
       <w:r>
         <w:t>.</w:t>
       </w:r>
@@ -5077,7 +4824,7 @@
         <w:t>your thesis work goes as well as possible for you!</w:t>
       </w:r>
     </w:p>
-    <w:bookmarkStart w:id="68" w:name="_Toc171427407" w:displacedByCustomXml="next"/>
+    <w:bookmarkStart w:id="67" w:name="_Toc171427407" w:displacedByCustomXml="next"/>
     <w:sdt>
       <w:sdtPr>
         <w:alias w:val="Blibiography/reference/Works Cited"/>
@@ -5103,21 +4850,13 @@
         </w:p>
       </w:sdtContent>
     </w:sdt>
-    <w:bookmarkEnd w:id="68" w:displacedByCustomXml="prev"/>
+    <w:bookmarkEnd w:id="67" w:displacedByCustomXml="prev"/>
     <w:p>
       <w:pPr>
         <w:pStyle w:val="BodyText"/>
       </w:pPr>
       <w:r>
-        <w:t xml:space="preserve">Note that you should use just one of the following reference styles, depending on which format style your Thesis Director has asked you to use.  If you have any questions about the correcting formatting for the many different types of sources you might be referencing (e.g. books, articles, online articles, newspaper articles) then check with a publication manual for the particular reference style you are using, and/or use a reference generation program such as Zotero or </w:t>
-      </w:r>
-      <w:proofErr w:type="spellStart"/>
-      <w:r>
-        <w:t>Refworks</w:t>
-      </w:r>
-      <w:proofErr w:type="spellEnd"/>
-      <w:r>
-        <w:t xml:space="preserve">. </w:t>
+        <w:t xml:space="preserve">Note that you should use just one of the following reference styles, depending on which format style your Thesis Director has asked you to use.  If you have any questions about the correcting formatting for the many different types of sources you might be referencing (e.g. books, articles, online articles, newspaper articles) then check with a publication manual for the particular reference style you are using, and/or use a reference generation program such as Zotero or Refworks. </w:t>
       </w:r>
     </w:p>
     <w:p>
@@ -5175,7 +4914,7 @@
       <w:r>
         <w:t xml:space="preserve"> Place of publication: Publisher, Year.</w:t>
       </w:r>
-      <w:bookmarkEnd w:id="63"/>
+      <w:bookmarkEnd w:id="62"/>
     </w:p>
     <w:sectPr>
       <w:pgSz w:w="12240" w:h="15840"/>
@@ -5204,15 +4943,7 @@
         <w:t>The Table of Contents (TOC) is designed to be generated automatically from your headings. It is important not to type in this a</w:t>
       </w:r>
       <w:r>
-        <w:t xml:space="preserve">rea. Instead, </w:t>
-      </w:r>
-      <w:proofErr w:type="gramStart"/>
-      <w:r>
-        <w:t>To</w:t>
-      </w:r>
-      <w:proofErr w:type="gramEnd"/>
-      <w:r>
-        <w:t xml:space="preserve"> update the TOC</w:t>
+        <w:t>rea. Instead, To update the TOC</w:t>
       </w:r>
       <w:r>
         <w:t xml:space="preserve"> right-click anywhere in it (not including the title) and select “Update Field”. You will be given the choice of “Update page numbers only” or “Update entire table”. The former will, as it says, change only the page numbers, and only for items already in the TOC; the latter will update the titles as well, and will add new items in accordance with any new headings/section titles you may have created. These will be determined by the use of the appropriate styles. If a header is missing from the TOC after updating the entire table, check that the header in question is using the appropriate heading style, then update the entire TOC again.</w:t>
@@ -5307,51 +5038,11 @@
         <w:annotationRef/>
       </w:r>
       <w:r>
-        <w:t>You will need to type the chapter number manually for each chapter. Also remember that you need to use a soft return (</w:t>
-      </w:r>
-      <w:proofErr w:type="spellStart"/>
-      <w:r>
-        <w:t>Shift+Enter</w:t>
-      </w:r>
-      <w:proofErr w:type="spellEnd"/>
-      <w:r>
-        <w:t>) between the chapter number and its title.</w:t>
+        <w:t>You will need to type the chapter number manually for each chapter. Also remember that you need to use a soft return (Shift+Enter) between the chapter number and its title.</w:t>
       </w:r>
     </w:p>
   </w:comment>
-  <w:comment w:id="30" w:author="Goldberg Pires, Trudi" w:date="2023-03-09T09:43:00Z" w:initials="GPT">
-    <w:p>
-      <w:pPr>
-        <w:pStyle w:val="CommentText"/>
-      </w:pPr>
-      <w:r>
-        <w:rPr>
-          <w:rStyle w:val="CommentReference"/>
-        </w:rPr>
-        <w:annotationRef/>
-      </w:r>
-      <w:r>
-        <w:t xml:space="preserve">Please manually insert an </w:t>
-      </w:r>
-      <w:proofErr w:type="spellStart"/>
-      <w:r>
-        <w:t>em</w:t>
-      </w:r>
-      <w:proofErr w:type="spellEnd"/>
-      <w:r>
-        <w:t xml:space="preserve"> dash by going to Insert – Symbol – and selecting it from the panel.</w:t>
-      </w:r>
-    </w:p>
-    <w:p>
-      <w:pPr>
-        <w:pStyle w:val="CommentText"/>
-      </w:pPr>
-      <w:r>
-        <w:t>Please delete this text and comment if not using.</w:t>
-      </w:r>
-    </w:p>
-  </w:comment>
-  <w:comment w:id="33" w:author="TEMPLATE NOTES" w:date="2017-02-28T17:50:00Z" w:initials="TN">
+  <w:comment w:id="32" w:author="TEMPLATE NOTES" w:date="2017-02-28T17:50:00Z" w:initials="TN">
     <w:p>
       <w:pPr>
         <w:pStyle w:val="CommentText"/>
@@ -5411,15 +5102,8 @@
   <w15:commentEx w15:paraId="14FACE43" w15:done="0"/>
   <w15:commentEx w15:paraId="74C793F6" w15:done="0"/>
   <w15:commentEx w15:paraId="27844A57" w15:done="0"/>
-  <w15:commentEx w15:paraId="316A0717" w15:done="0"/>
   <w15:commentEx w15:paraId="4B9EC210" w15:done="0"/>
 </w15:commentsEx>
-</file>
-
-<file path=word/commentsExtensible.xml><?xml version="1.0" encoding="utf-8"?>
-<w16cex:commentsExtensible xmlns:wpc="http://schemas.microsoft.com/office/word/2010/wordprocessingCanvas" xmlns:cx="http://schemas.microsoft.com/office/drawing/2014/chartex" xmlns:cx1="http://schemas.microsoft.com/office/drawing/2015/9/8/chartex" xmlns:cx2="http://schemas.microsoft.com/office/drawing/2015/10/21/chartex" xmlns:cx3="http://schemas.microsoft.com/office/drawing/2016/5/9/chartex" xmlns:cx4="http://schemas.microsoft.com/office/drawing/2016/5/10/chartex" xmlns:cx5="http://schemas.microsoft.com/office/drawing/2016/5/11/chartex" xmlns:cx6="http://schemas.microsoft.com/office/drawing/2016/5/12/chartex" xmlns:cx7="http://schemas.microsoft.com/office/drawing/2016/5/13/chartex" xmlns:cx8="http://schemas.microsoft.com/office/drawing/2016/5/14/chartex" xmlns:cr="http://schemas.microsoft.com/office/comments/2020/reactions" xmlns:mc="http://schemas.openxmlformats.org/markup-compatibility/2006" xmlns:aink="http://schemas.microsoft.com/office/drawing/2016/ink" xmlns:am3d="http://schemas.microsoft.com/office/drawing/2017/model3d" xmlns:o="urn:schemas-microsoft-com:office:office" xmlns:oel="http://schemas.microsoft.com/office/2019/extlst" xmlns:r="http://schemas.openxmlformats.org/officeDocument/2006/relationships" xmlns:m="http://schemas.openxmlformats.org/officeDocument/2006/math" xmlns:v="urn:schemas-microsoft-com:vml" xmlns:wp14="http://schemas.microsoft.com/office/word/2010/wordprocessingDrawing" xmlns:wp="http://schemas.openxmlformats.org/drawingml/2006/wordprocessingDrawing" xmlns:w10="urn:schemas-microsoft-com:office:word" xmlns:w="http://schemas.openxmlformats.org/wordprocessingml/2006/main" xmlns:w14="http://schemas.microsoft.com/office/word/2010/wordml" xmlns:w15="http://schemas.microsoft.com/office/word/2012/wordml" xmlns:w16cex="http://schemas.microsoft.com/office/word/2018/wordml/cex" xmlns:w16cid="http://schemas.microsoft.com/office/word/2016/wordml/cid" xmlns:w16="http://schemas.microsoft.com/office/word/2018/wordml" xmlns:w16du="http://schemas.microsoft.com/office/word/2023/wordml/word16du" xmlns:w16sdtdh="http://schemas.microsoft.com/office/word/2020/wordml/sdtdatahash" xmlns:w16sdtfl="http://schemas.microsoft.com/office/word/2024/wordml/sdtformatlock" xmlns:w16se="http://schemas.microsoft.com/office/word/2015/wordml/symex" xmlns:wpg="http://schemas.microsoft.com/office/word/2010/wordprocessingGroup" xmlns:wpi="http://schemas.microsoft.com/office/word/2010/wordprocessingInk" xmlns:wne="http://schemas.microsoft.com/office/word/2006/wordml" xmlns:wps="http://schemas.microsoft.com/office/word/2010/wordprocessingShape" mc:Ignorable="w14 w15 w16se w16cid w16 w16cex w16sdtdh w16sdtfl cr w16du wp14">
-  <w16cex:commentExtensible w16cex:durableId="27B428C5" w16cex:dateUtc="2023-03-09T14:43:00Z"/>
-</w16cex:commentsExtensible>
 </file>
 
 <file path=word/commentsIds.xml><?xml version="1.0" encoding="utf-8"?>
@@ -5430,7 +5114,6 @@
   <w16cid:commentId w16cid:paraId="14FACE43" w16cid:durableId="2485AFE6"/>
   <w16cid:commentId w16cid:paraId="74C793F6" w16cid:durableId="2485AFE7"/>
   <w16cid:commentId w16cid:paraId="27844A57" w16cid:durableId="2485AFE8"/>
-  <w16cid:commentId w16cid:paraId="316A0717" w16cid:durableId="27B428C5"/>
   <w16cid:commentId w16cid:paraId="4B9EC210" w16cid:durableId="2485AFE9"/>
 </w16cid:commentsIds>
 </file>
@@ -5651,25 +5334,6 @@
         <w:footnoteRef/>
       </w:r>
       <w:r>
-        <w:t xml:space="preserve"> This is a footnote</w:t>
-      </w:r>
-      <w:r>
-        <w:t>.</w:t>
-      </w:r>
-    </w:p>
-  </w:footnote>
-  <w:footnote w:id="2">
-    <w:p>
-      <w:pPr>
-        <w:pStyle w:val="FootnoteText"/>
-      </w:pPr>
-      <w:r>
-        <w:rPr>
-          <w:rStyle w:val="FootnoteReference"/>
-        </w:rPr>
-        <w:footnoteRef/>
-      </w:r>
-      <w:r>
         <w:t xml:space="preserve"> This is the format for more than one footnote.</w:t>
       </w:r>
     </w:p>
@@ -6043,9 +5707,6 @@
 <w15:people xmlns:wpc="http://schemas.microsoft.com/office/word/2010/wordprocessingCanvas" xmlns:cx="http://schemas.microsoft.com/office/drawing/2014/chartex" xmlns:cx1="http://schemas.microsoft.com/office/drawing/2015/9/8/chartex" xmlns:cx2="http://schemas.microsoft.com/office/drawing/2015/10/21/chartex" xmlns:cx3="http://schemas.microsoft.com/office/drawing/2016/5/9/chartex" xmlns:cx4="http://schemas.microsoft.com/office/drawing/2016/5/10/chartex" xmlns:cx5="http://schemas.microsoft.com/office/drawing/2016/5/11/chartex" xmlns:cx6="http://schemas.microsoft.com/office/drawing/2016/5/12/chartex" xmlns:cx7="http://schemas.microsoft.com/office/drawing/2016/5/13/chartex" xmlns:cx8="http://schemas.microsoft.com/office/drawing/2016/5/14/chartex" xmlns:mc="http://schemas.openxmlformats.org/markup-compatibility/2006" xmlns:aink="http://schemas.microsoft.com/office/drawing/2016/ink" xmlns:am3d="http://schemas.microsoft.com/office/drawing/2017/model3d" xmlns:o="urn:schemas-microsoft-com:office:office" xmlns:oel="http://schemas.microsoft.com/office/2019/extlst" xmlns:r="http://schemas.openxmlformats.org/officeDocument/2006/relationships" xmlns:m="http://schemas.openxmlformats.org/officeDocument/2006/math" xmlns:v="urn:schemas-microsoft-com:vml" xmlns:wp14="http://schemas.microsoft.com/office/word/2010/wordprocessingDrawing" xmlns:wp="http://schemas.openxmlformats.org/drawingml/2006/wordprocessingDrawing" xmlns:w10="urn:schemas-microsoft-com:office:word" xmlns:w="http://schemas.openxmlformats.org/wordprocessingml/2006/main" xmlns:w14="http://schemas.microsoft.com/office/word/2010/wordml" xmlns:w15="http://schemas.microsoft.com/office/word/2012/wordml" xmlns:w16cex="http://schemas.microsoft.com/office/word/2018/wordml/cex" xmlns:w16cid="http://schemas.microsoft.com/office/word/2016/wordml/cid" xmlns:w16="http://schemas.microsoft.com/office/word/2018/wordml" xmlns:w16du="http://schemas.microsoft.com/office/word/2023/wordml/word16du" xmlns:w16sdtdh="http://schemas.microsoft.com/office/word/2020/wordml/sdtdatahash" xmlns:w16sdtfl="http://schemas.microsoft.com/office/word/2024/wordml/sdtformatlock" xmlns:w16se="http://schemas.microsoft.com/office/word/2015/wordml/symex" xmlns:wpg="http://schemas.microsoft.com/office/word/2010/wordprocessingGroup" xmlns:wpi="http://schemas.microsoft.com/office/word/2010/wordprocessingInk" xmlns:wne="http://schemas.microsoft.com/office/word/2006/wordml" xmlns:wps="http://schemas.microsoft.com/office/word/2010/wordprocessingShape" mc:Ignorable="w14 w15 w16se w16cid w16 w16cex w16sdtdh w16sdtfl w16du wp14">
   <w15:person w15:author="TEMPLATE NOTE">
     <w15:presenceInfo w15:providerId="None" w15:userId="TEMPLATE NOTE"/>
-  </w15:person>
-  <w15:person w15:author="Goldberg Pires, Trudi">
-    <w15:presenceInfo w15:providerId="AD" w15:userId="S::tpires@fas.harvard.edu::e2eaafde-af2e-48c6-a75c-19791c4beb6e"/>
   </w15:person>
 </w15:people>
 </file>
@@ -7663,6 +7324,9 @@
   <w:rsids>
     <w:rsidRoot w:val="009401DB"/>
     <w:rsid w:val="0000368C"/>
+    <w:rsid w:val="00371E6B"/>
+    <w:rsid w:val="006A1CAC"/>
+    <w:rsid w:val="007D12E9"/>
     <w:rsid w:val="009401DB"/>
   </w:rsids>
   <m:mathPr>
@@ -8452,6 +8116,19 @@
 </file>
 
 <file path=customXml/item2.xml><?xml version="1.0" encoding="utf-8"?>
+<?mso-contentType ?>
+<FormTemplates xmlns="http://schemas.microsoft.com/sharepoint/v3/contenttype/forms">
+  <Display>DocumentLibraryForm</Display>
+  <Edit>DocumentLibraryForm</Edit>
+  <New>DocumentLibraryForm</New>
+</FormTemplates>
+</file>
+
+<file path=customXml/item3.xml><?xml version="1.0" encoding="utf-8"?>
+<b:Sources xmlns:b="http://schemas.openxmlformats.org/officeDocument/2006/bibliography" xmlns="http://schemas.openxmlformats.org/officeDocument/2006/bibliography" SelectedStyle="\CHICAGO.XSL" StyleName="Chicago" Version="16"/>
+</file>
+
+<file path=customXml/item4.xml><?xml version="1.0" encoding="utf-8"?>
 <ct:contentTypeSchema xmlns:ct="http://schemas.microsoft.com/office/2006/metadata/contentType" xmlns:ma="http://schemas.microsoft.com/office/2006/metadata/properties/metaAttributes" ct:_="" ma:_="" ma:contentTypeName="Document" ma:contentTypeID="0x010100276E619CE5B0C9458323E0289773CDB2" ma:contentTypeVersion="13" ma:contentTypeDescription="Create a new document." ma:contentTypeScope="" ma:versionID="a63989fa12e49b30413b2cc17eee567c">
   <xsd:schema xmlns:xsd="http://www.w3.org/2001/XMLSchema" xmlns:xs="http://www.w3.org/2001/XMLSchema" xmlns:p="http://schemas.microsoft.com/office/2006/metadata/properties" xmlns:ns2="8fa0fc1d-bd80-47fb-a35f-9b4442274e73" xmlns:ns3="b547c7a7-201d-4fd1-b061-320e39927fa6" targetNamespace="http://schemas.microsoft.com/office/2006/metadata/properties" ma:root="true" ma:fieldsID="97c49544893c4cf780a07531db0e7f35" ns2:_="" ns3:_="">
     <xsd:import namespace="8fa0fc1d-bd80-47fb-a35f-9b4442274e73"/>
@@ -8660,19 +8337,6 @@
 </ct:contentTypeSchema>
 </file>
 
-<file path=customXml/item3.xml><?xml version="1.0" encoding="utf-8"?>
-<b:Sources xmlns:b="http://schemas.openxmlformats.org/officeDocument/2006/bibliography" xmlns="http://schemas.openxmlformats.org/officeDocument/2006/bibliography" SelectedStyle="\CHICAGO.XSL" StyleName="Chicago" Version="16"/>
-</file>
-
-<file path=customXml/item4.xml><?xml version="1.0" encoding="utf-8"?>
-<?mso-contentType ?>
-<FormTemplates xmlns="http://schemas.microsoft.com/sharepoint/v3/contenttype/forms">
-  <Display>DocumentLibraryForm</Display>
-  <Edit>DocumentLibraryForm</Edit>
-  <New>DocumentLibraryForm</New>
-</FormTemplates>
-</file>
-
 <file path=customXml/itemProps1.xml><?xml version="1.0" encoding="utf-8"?>
 <ds:datastoreItem xmlns:ds="http://schemas.openxmlformats.org/officeDocument/2006/customXml" ds:itemID="{2ACA577D-FEEF-482F-BA77-960FB70F6C19}">
   <ds:schemaRefs>
@@ -8685,6 +8349,22 @@
 </file>
 
 <file path=customXml/itemProps2.xml><?xml version="1.0" encoding="utf-8"?>
+<ds:datastoreItem xmlns:ds="http://schemas.openxmlformats.org/officeDocument/2006/customXml" ds:itemID="{9801C557-CEF7-427D-B819-762B914EB920}">
+  <ds:schemaRefs>
+    <ds:schemaRef ds:uri="http://schemas.microsoft.com/sharepoint/v3/contenttype/forms"/>
+  </ds:schemaRefs>
+</ds:datastoreItem>
+</file>
+
+<file path=customXml/itemProps3.xml><?xml version="1.0" encoding="utf-8"?>
+<ds:datastoreItem xmlns:ds="http://schemas.openxmlformats.org/officeDocument/2006/customXml" ds:itemID="{60C05EF6-3C86-4BF8-8F65-939956D2A6F8}">
+  <ds:schemaRefs>
+    <ds:schemaRef ds:uri="http://schemas.openxmlformats.org/officeDocument/2006/bibliography"/>
+  </ds:schemaRefs>
+</ds:datastoreItem>
+</file>
+
+<file path=customXml/itemProps4.xml><?xml version="1.0" encoding="utf-8"?>
 <ds:datastoreItem xmlns:ds="http://schemas.openxmlformats.org/officeDocument/2006/customXml" ds:itemID="{1D4DC707-92E4-4316-A04E-EB82A5B6829D}">
   <ds:schemaRefs>
     <ds:schemaRef ds:uri="http://schemas.microsoft.com/office/2006/metadata/contentType"/>
@@ -8701,20 +8381,4 @@
     <ds:schemaRef ds:uri="http://schemas.microsoft.com/internal/obd"/>
   </ds:schemaRefs>
 </ds:datastoreItem>
-</file>
-
-<file path=customXml/itemProps3.xml><?xml version="1.0" encoding="utf-8"?>
-<ds:datastoreItem xmlns:ds="http://schemas.openxmlformats.org/officeDocument/2006/customXml" ds:itemID="{60C05EF6-3C86-4BF8-8F65-939956D2A6F8}">
-  <ds:schemaRefs>
-    <ds:schemaRef ds:uri="http://schemas.openxmlformats.org/officeDocument/2006/bibliography"/>
-  </ds:schemaRefs>
-</ds:datastoreItem>
-</file>
-
-<file path=customXml/itemProps4.xml><?xml version="1.0" encoding="utf-8"?>
-<ds:datastoreItem xmlns:ds="http://schemas.openxmlformats.org/officeDocument/2006/customXml" ds:itemID="{9801C557-CEF7-427D-B819-762B914EB920}">
-  <ds:schemaRefs>
-    <ds:schemaRef ds:uri="http://schemas.microsoft.com/sharepoint/v3/contenttype/forms"/>
-  </ds:schemaRefs>
-</ds:datastoreItem>
 </file>
</xml_diff>

<commit_message>
added logbook for proposed viva and presentation structure
</commit_message>
<xml_diff>
--- a/admin/Report/thesis paper/Final Report.docx
+++ b/admin/Report/thesis paper/Final Report.docx
@@ -640,22 +640,9 @@
         <w:br/>
       </w:r>
       <w:r>
-        <w:t xml:space="preserve">Table of </w:t>
-      </w:r>
-      <w:commentRangeStart w:id="21"/>
-      <w:r>
-        <w:t>Contents</w:t>
+        <w:t>Table of Contents</w:t>
       </w:r>
       <w:bookmarkEnd w:id="20"/>
-      <w:commentRangeEnd w:id="21"/>
-      <w:r>
-        <w:rPr>
-          <w:rStyle w:val="CommentReference"/>
-          <w:sz w:val="24"/>
-          <w:szCs w:val="26"/>
-        </w:rPr>
-        <w:commentReference w:id="21"/>
-      </w:r>
     </w:p>
     <w:p>
       <w:pPr>
@@ -2706,7 +2693,7 @@
       <w:pPr>
         <w:pStyle w:val="C-BodyText"/>
         <w:sectPr>
-          <w:headerReference w:type="first" r:id="rId19"/>
+          <w:headerReference w:type="first" r:id="rId16"/>
           <w:pgSz w:w="12240" w:h="15840"/>
           <w:pgMar w:top="1440" w:right="1440" w:bottom="1440" w:left="2160" w:header="720" w:footer="720" w:gutter="0"/>
           <w:pgNumType w:fmt="lowerRoman"/>
@@ -2719,47 +2706,15 @@
       <w:pPr>
         <w:pStyle w:val="Heading2"/>
       </w:pPr>
-      <w:bookmarkStart w:id="22" w:name="_Toc171427377"/>
+      <w:bookmarkStart w:id="21" w:name="_Toc171427377"/>
       <w:r>
         <w:lastRenderedPageBreak/>
-        <w:t xml:space="preserve">List of </w:t>
-      </w:r>
-      <w:commentRangeStart w:id="23"/>
-      <w:r>
-        <w:t>Tables</w:t>
-      </w:r>
-      <w:r>
-        <w:t xml:space="preserve"> </w:t>
-      </w:r>
-      <w:commentRangeEnd w:id="23"/>
-      <w:r>
-        <w:rPr>
-          <w:rStyle w:val="CommentReference"/>
-          <w:sz w:val="24"/>
-          <w:szCs w:val="26"/>
-        </w:rPr>
-        <w:commentReference w:id="23"/>
-      </w:r>
-      <w:r>
-        <w:t>(</w:t>
-      </w:r>
-      <w:commentRangeStart w:id="24"/>
-      <w:r>
-        <w:t>optional</w:t>
-      </w:r>
-      <w:commentRangeEnd w:id="24"/>
-      <w:r>
-        <w:rPr>
-          <w:rStyle w:val="CommentReference"/>
-          <w:sz w:val="24"/>
-          <w:szCs w:val="26"/>
-        </w:rPr>
-        <w:commentReference w:id="24"/>
-      </w:r>
-      <w:r>
-        <w:t>)</w:t>
-      </w:r>
-      <w:bookmarkEnd w:id="22"/>
+        <w:t>List of Tables</w:t>
+      </w:r>
+      <w:r>
+        <w:t xml:space="preserve"> (optional)</w:t>
+      </w:r>
+      <w:bookmarkEnd w:id="21"/>
     </w:p>
     <w:p>
       <w:pPr>
@@ -2928,47 +2883,15 @@
       <w:pPr>
         <w:pStyle w:val="Heading2"/>
       </w:pPr>
-      <w:bookmarkStart w:id="25" w:name="_Toc171427378"/>
+      <w:bookmarkStart w:id="22" w:name="_Toc171427378"/>
       <w:r>
         <w:lastRenderedPageBreak/>
-        <w:t xml:space="preserve">List of </w:t>
-      </w:r>
-      <w:commentRangeStart w:id="26"/>
-      <w:r>
-        <w:t>Figures</w:t>
-      </w:r>
-      <w:r>
-        <w:t xml:space="preserve"> </w:t>
-      </w:r>
-      <w:commentRangeEnd w:id="26"/>
-      <w:r>
-        <w:rPr>
-          <w:rStyle w:val="CommentReference"/>
-          <w:sz w:val="24"/>
-          <w:szCs w:val="26"/>
-        </w:rPr>
-        <w:commentReference w:id="26"/>
-      </w:r>
-      <w:r>
-        <w:t>(</w:t>
-      </w:r>
-      <w:commentRangeStart w:id="27"/>
-      <w:r>
-        <w:t>optional</w:t>
-      </w:r>
-      <w:commentRangeEnd w:id="27"/>
-      <w:r>
-        <w:rPr>
-          <w:rStyle w:val="CommentReference"/>
-          <w:sz w:val="24"/>
-          <w:szCs w:val="26"/>
-        </w:rPr>
-        <w:commentReference w:id="27"/>
-      </w:r>
-      <w:r>
-        <w:t>)</w:t>
-      </w:r>
-      <w:bookmarkEnd w:id="25"/>
+        <w:t>List of Figures</w:t>
+      </w:r>
+      <w:r>
+        <w:t xml:space="preserve"> (optional)</w:t>
+      </w:r>
+      <w:bookmarkEnd w:id="22"/>
     </w:p>
     <w:p>
       <w:pPr>
@@ -3137,37 +3060,225 @@
       <w:pPr>
         <w:pStyle w:val="Heading2"/>
       </w:pPr>
-      <w:bookmarkStart w:id="28" w:name="_Toc171427379"/>
       <w:r>
         <w:lastRenderedPageBreak/>
-        <w:t xml:space="preserve">Chapter </w:t>
-      </w:r>
-      <w:commentRangeStart w:id="29"/>
-      <w:r>
-        <w:t>I</w:t>
-      </w:r>
-      <w:commentRangeEnd w:id="29"/>
-      <w:r>
-        <w:rPr>
-          <w:rStyle w:val="CommentReference"/>
-          <w:sz w:val="24"/>
-          <w:szCs w:val="26"/>
-        </w:rPr>
-        <w:commentReference w:id="29"/>
-      </w:r>
-      <w:r>
-        <w:t>.</w:t>
-      </w:r>
-      <w:bookmarkEnd w:id="28"/>
+        <w:t xml:space="preserve">Chapter 1: </w:t>
+      </w:r>
+      <w:r>
+        <w:t>Introduction</w:t>
+      </w:r>
+    </w:p>
+    <w:p>
+      <w:pPr>
+        <w:pStyle w:val="BodyText"/>
+        <w:rPr>
+          <w:lang w:val="en-SG"/>
+        </w:rPr>
+      </w:pPr>
+      <w:r>
+        <w:rPr>
+          <w:lang w:val="en-SG"/>
+        </w:rPr>
+        <w:t>Ethical judgement in real-world contexts is fluid, multifactorial, and deeply situational. Moral reasoning rarely operates over fixed rules or isolated facts; instead, it emerges from a convergence of competing values, social norms, emotional responses, personal histories, and contextual constraints. What is “right” in one circumstance may be harmful in another. What is condemned in principle may be tolerated in practice. Ethics, in lived human experience, is not merely a problem of classification—it is an act of discernment.</w:t>
+      </w:r>
+    </w:p>
+    <w:p>
+      <w:pPr>
+        <w:pStyle w:val="BodyText"/>
+        <w:rPr>
+          <w:lang w:val="en-SG"/>
+        </w:rPr>
+      </w:pPr>
+      <w:r>
+        <w:rPr>
+          <w:lang w:val="en-SG"/>
+        </w:rPr>
+        <w:t xml:space="preserve">Contemporary artificial intelligence systems, however, approach ethics in a fundamentally different way. Large language models and related architectures operate by learning statistical regularities over vast corpora of human-produced text. When applied to moral tasks, these systems are trained to predict which response </w:t>
+      </w:r>
+      <w:r>
+        <w:rPr>
+          <w:i/>
+          <w:iCs/>
+          <w:lang w:val="en-SG"/>
+        </w:rPr>
+        <w:t>most closely resembles</w:t>
+      </w:r>
+      <w:r>
+        <w:rPr>
+          <w:lang w:val="en-SG"/>
+        </w:rPr>
+        <w:t xml:space="preserve"> those found in curated datasets of ethical judgements. In doing so, moral language is implicitly treated as truth-apt content: “right” and “wrong” become labels to be inferred, much like sentiment or topic categories.</w:t>
+      </w:r>
+    </w:p>
+    <w:p>
+      <w:pPr>
+        <w:pStyle w:val="BodyText"/>
+        <w:rPr>
+          <w:lang w:val="en-SG"/>
+        </w:rPr>
+      </w:pPr>
+      <w:r>
+        <w:rPr>
+          <w:lang w:val="en-SG"/>
+        </w:rPr>
+        <w:t>This raises a foundational question:</w:t>
+      </w:r>
+      <w:r>
+        <w:rPr>
+          <w:lang w:val="en-SG"/>
+        </w:rPr>
+        <w:br/>
+        <w:t>Can a system that operates solely through statistical pattern recognition meaningfully engage with ethics as it is practised in the real world?</w:t>
+      </w:r>
+    </w:p>
+    <w:p>
+      <w:pPr>
+        <w:pStyle w:val="BodyText"/>
+        <w:rPr>
+          <w:lang w:val="en-SG"/>
+        </w:rPr>
+      </w:pPr>
+      <w:r>
+        <w:rPr>
+          <w:lang w:val="en-SG"/>
+        </w:rPr>
+        <w:t xml:space="preserve">More sharply, ethical judgement often involves not merely selecting among pre-existing options, but </w:t>
+      </w:r>
+      <w:r>
+        <w:rPr>
+          <w:i/>
+          <w:iCs/>
+          <w:lang w:val="en-SG"/>
+        </w:rPr>
+        <w:t>creating</w:t>
+      </w:r>
+      <w:r>
+        <w:rPr>
+          <w:lang w:val="en-SG"/>
+        </w:rPr>
+        <w:t xml:space="preserve"> a response from within a landscape of uncertainty—where no rule cleanly applies, and where competing goods must be weighed. Humans do not simply retrieve moral answers; they </w:t>
+      </w:r>
+      <w:r>
+        <w:rPr>
+          <w:i/>
+          <w:iCs/>
+          <w:lang w:val="en-SG"/>
+        </w:rPr>
+        <w:t>form</w:t>
+      </w:r>
+      <w:r>
+        <w:rPr>
+          <w:lang w:val="en-SG"/>
+        </w:rPr>
+        <w:t xml:space="preserve"> them, drawing on affect, imagination, lived </w:t>
+      </w:r>
+      <w:r>
+        <w:rPr>
+          <w:lang w:val="en-SG"/>
+        </w:rPr>
+        <w:lastRenderedPageBreak/>
+        <w:t>experience, and self-reflection. Ethical reasoning is thus generative in a sense that exceeds recombination of prior examples.</w:t>
+      </w:r>
+    </w:p>
+    <w:p>
+      <w:pPr>
+        <w:pStyle w:val="BodyText"/>
+        <w:rPr>
+          <w:lang w:val="en-SG"/>
+        </w:rPr>
+      </w:pPr>
+      <w:r>
+        <w:rPr>
+          <w:lang w:val="en-SG"/>
+        </w:rPr>
+        <w:t>If ethical discernment requires this form of situated, generative engagement, then a further question emerges:</w:t>
+      </w:r>
+      <w:r>
+        <w:rPr>
+          <w:lang w:val="en-SG"/>
+        </w:rPr>
+        <w:br/>
+        <w:t>Is the capacity for ethics inseparable from consciousness?</w:t>
+      </w:r>
+    </w:p>
+    <w:p>
+      <w:pPr>
+        <w:pStyle w:val="BodyText"/>
+        <w:rPr>
+          <w:lang w:val="en-SG"/>
+        </w:rPr>
+      </w:pPr>
+      <w:r>
+        <w:rPr>
+          <w:lang w:val="en-SG"/>
+        </w:rPr>
+        <w:t xml:space="preserve">Under this view, moral judgement is not merely cognitive, but expressive. It reflects an internal stance—an orientation toward the world—rather than a detached evaluation of facts. If only conscious beings can genuinely </w:t>
+      </w:r>
+      <w:r>
+        <w:rPr>
+          <w:i/>
+          <w:iCs/>
+          <w:lang w:val="en-SG"/>
+        </w:rPr>
+        <w:t>take</w:t>
+      </w:r>
+      <w:r>
+        <w:rPr>
+          <w:lang w:val="en-SG"/>
+        </w:rPr>
+        <w:t xml:space="preserve"> such stances, then ethical competence may function as a marker of consciousness rather than merely intelligence.</w:t>
+      </w:r>
+    </w:p>
+    <w:p>
+      <w:pPr>
+        <w:pStyle w:val="BodyText"/>
+        <w:rPr>
+          <w:lang w:val="en-SG"/>
+        </w:rPr>
+      </w:pPr>
+      <w:r>
+        <w:rPr>
+          <w:lang w:val="en-SG"/>
+        </w:rPr>
+        <w:t xml:space="preserve">This project investigates the tension between these two paradigms. On one side lies the human conception of ethics as fluid, expressive, and contextually grounded. On the other lies the computational framing of ethics as a predictive task over labelled data. By examining how current AI systems behave on moral datasets and probes, this work asks whether existing benchmarks measure ethical </w:t>
+      </w:r>
+      <w:r>
+        <w:rPr>
+          <w:i/>
+          <w:iCs/>
+          <w:lang w:val="en-SG"/>
+        </w:rPr>
+        <w:t>understanding</w:t>
+      </w:r>
+      <w:r>
+        <w:rPr>
+          <w:lang w:val="en-SG"/>
+        </w:rPr>
+        <w:t xml:space="preserve"> or merely ethical </w:t>
+      </w:r>
+      <w:r>
+        <w:rPr>
+          <w:i/>
+          <w:iCs/>
+          <w:lang w:val="en-SG"/>
+        </w:rPr>
+        <w:t>imitation</w:t>
+      </w:r>
+      <w:r>
+        <w:rPr>
+          <w:lang w:val="en-SG"/>
+        </w:rPr>
+        <w:t>, and whether success on such tasks can meaningfully be interpreted as evidence of moral reasoning—or even proto-consciousness—at all.</w:t>
+      </w:r>
     </w:p>
     <w:p>
       <w:pPr>
         <w:pStyle w:val="BodyText"/>
         <w:sectPr>
-          <w:headerReference w:type="default" r:id="rId20"/>
-          <w:footerReference w:type="default" r:id="rId21"/>
-          <w:headerReference w:type="first" r:id="rId22"/>
-          <w:footerReference w:type="first" r:id="rId23"/>
+          <w:headerReference w:type="default" r:id="rId17"/>
+          <w:footerReference w:type="default" r:id="rId18"/>
+          <w:headerReference w:type="first" r:id="rId19"/>
+          <w:footerReference w:type="first" r:id="rId20"/>
           <w:pgSz w:w="12240" w:h="15840"/>
           <w:pgMar w:top="1440" w:right="1440" w:bottom="1440" w:left="2160" w:header="720" w:footer="720" w:gutter="0"/>
           <w:pgNumType w:start="1"/>
@@ -3177,12 +3288,6 @@
         </w:sectPr>
       </w:pPr>
       <w:r>
-        <w:t xml:space="preserve">Current AI systems demonstrate high performance on ethically complex benchmarks, but this performance reflects pattern-level imitation of human moral judgments rather than ethical discernment grounded in first-person normativity. No widely used dataset fully captures the fluid, multifactorial, and non-truth-apt nature of real-world ethics, particularly under non-cognitivist meta-ethical frameworks. This absence suggests that ethical reasoning benchmarks implicitly assume cognitivism and that dataset-based evaluation may be structurally incapable of detecting consciousness-relevant ethical </w:t>
-      </w:r>
-      <w:r>
-        <w:t>properties.</w:t>
-      </w:r>
-      <w:r>
         <w:rPr>
           <w:rStyle w:val="FootnoteReference"/>
         </w:rPr>
@@ -3193,1248 +3298,64 @@
       <w:pPr>
         <w:pStyle w:val="Heading2"/>
       </w:pPr>
-      <w:bookmarkStart w:id="30" w:name="_Toc476584781"/>
-      <w:bookmarkStart w:id="31" w:name="_Toc171427380"/>
+      <w:bookmarkStart w:id="23" w:name="_Toc171427380"/>
       <w:r>
         <w:lastRenderedPageBreak/>
+        <w:t>Chapter 2: Ethics, Cognitive and Moral Language</w:t>
+      </w:r>
+    </w:p>
+    <w:p>
+      <w:pPr>
+        <w:pStyle w:val="Heading4"/>
+      </w:pPr>
+      <w:r>
+        <w:t>2.1 Normative Ethics vs Meta-Ethics</w:t>
+      </w:r>
+      <w:r>
+        <w:br/>
+        <w:t>2.2 Cognitivist Accounts of Moral Judgement</w:t>
+      </w:r>
+      <w:r>
+        <w:br/>
+        <w:t>2.3 Non-Cognitivism and Emotivism</w:t>
+      </w:r>
+      <w:r>
+        <w:br/>
+        <w:t>2.4 Moral Language as Expressive Act</w:t>
+      </w:r>
+      <w:r>
+        <w:br/>
+        <w:t>2.5 Ethical Discernment and Situated Agency</w:t>
+      </w:r>
+      <w:r>
+        <w:br/>
+        <w:t>2.6 Ethics and Consciousness</w:t>
+      </w:r>
+      <w:r>
+        <w:br/>
+        <w:t>2.7 Implications for Artificial Agent</w:t>
+      </w:r>
+    </w:p>
+    <w:p>
+      <w:pPr>
+        <w:pStyle w:val="Heading2"/>
+      </w:pPr>
+      <w:r>
         <w:t xml:space="preserve">Chapter </w:t>
       </w:r>
-      <w:commentRangeStart w:id="32"/>
-      <w:r>
-        <w:t>II</w:t>
-      </w:r>
-      <w:commentRangeEnd w:id="32"/>
-      <w:r>
-        <w:rPr>
-          <w:rStyle w:val="CommentReference"/>
-          <w:sz w:val="24"/>
-          <w:szCs w:val="26"/>
-        </w:rPr>
-        <w:commentReference w:id="32"/>
-      </w:r>
-      <w:r>
-        <w:t>.</w:t>
-      </w:r>
-      <w:bookmarkEnd w:id="30"/>
-      <w:r>
-        <w:br/>
-      </w:r>
-      <w:r>
-        <w:t>Chapter Styles</w:t>
-      </w:r>
-      <w:bookmarkEnd w:id="31"/>
-    </w:p>
-    <w:p>
-      <w:pPr>
-        <w:pStyle w:val="BodyText"/>
-      </w:pPr>
-      <w:r>
-        <w:t>There are several styles that are used within chapters that you’ll need to know how to use.</w:t>
-      </w:r>
-      <w:r>
-        <w:t xml:space="preserve"> Other styles in the document are used in specific circumstances only, but we’ll cover those later.</w:t>
-      </w:r>
-      <w:r>
-        <w:t xml:space="preserve"> </w:t>
-      </w:r>
-    </w:p>
-    <w:p>
-      <w:pPr>
-        <w:pStyle w:val="Heading3"/>
-      </w:pPr>
-      <w:bookmarkStart w:id="33" w:name="_Toc171427381"/>
-      <w:r>
-        <w:t>Heading 3</w:t>
-      </w:r>
-      <w:r>
-        <w:t>, SectionTitle/A-Head</w:t>
-      </w:r>
-      <w:bookmarkEnd w:id="33"/>
-    </w:p>
-    <w:p>
-      <w:pPr>
-        <w:pStyle w:val="BodyText"/>
-      </w:pPr>
-      <w:r>
-        <w:t xml:space="preserve">The Chapter Title </w:t>
-      </w:r>
-      <w:r>
-        <w:t xml:space="preserve">or “Major heading” </w:t>
-      </w:r>
-      <w:r>
-        <w:t>style</w:t>
-      </w:r>
-      <w:r>
-        <w:t xml:space="preserve"> (shown in the Quick Styles menu as “Ch Title”)</w:t>
-      </w:r>
-      <w:r>
-        <w:t xml:space="preserve"> is used at the beginning of each chapter, including the appendices. For an example, see “Chapter 1 About Chapters” above.</w:t>
-      </w:r>
-      <w:r>
-        <w:t xml:space="preserve"> The first line of the title text will always begin 2” from the top of the page.</w:t>
-      </w:r>
-      <w:r>
-        <w:t xml:space="preserve"> </w:t>
-      </w:r>
-      <w:r>
-        <w:t>The style immediately following the Chapter Title style will default to the Body Text style, to be used for the introduction of the chapter.</w:t>
-      </w:r>
-    </w:p>
-    <w:p>
-      <w:pPr>
-        <w:pStyle w:val="BodyText"/>
-      </w:pPr>
-      <w:r>
-        <w:t>Chapter titles will automatically be included in the Table of Contents, but in order for them to appear after they’re first added, you’ll need to right-click on the TOC and choose “Update entire table.”</w:t>
-      </w:r>
-      <w:r>
-        <w:t xml:space="preserve"> To</w:t>
-      </w:r>
-      <w:r>
-        <w:t xml:space="preserve"> ensure that the chapter title</w:t>
-      </w:r>
-      <w:r>
-        <w:t xml:space="preserve"> is formatted correctly</w:t>
-      </w:r>
-      <w:r>
-        <w:t xml:space="preserve"> both on the page and in the corresponding TOC entry</w:t>
-      </w:r>
-      <w:r>
-        <w:t>, there are two commands you’ll need to use for each:</w:t>
-      </w:r>
-    </w:p>
-    <w:p>
-      <w:pPr>
-        <w:pStyle w:val="BulletedList"/>
-      </w:pPr>
-      <w:r>
-        <w:t xml:space="preserve">In the TOC entry for Chapter 1, you’ll notice that there’s a half-inch space between the words “Chapter 1:” and the chapter title. This is accomplished by using a Tab character in the title itself. The Chapter Title style has been designed </w:t>
-      </w:r>
-      <w:r>
-        <w:lastRenderedPageBreak/>
-        <w:t>so that this Tab character will not interfere with the centering of the header and therefore will not appear to be present on this page at all; if the TOC entry does not contain that half-inch space, remember to add a Tab character.</w:t>
-      </w:r>
-    </w:p>
-    <w:p>
-      <w:pPr>
-        <w:pStyle w:val="BulletedList"/>
-      </w:pPr>
-      <w:r>
-        <w:t>In the Chapter 1 example above, you’ll notice that the chapter title falls on two different lines, with the words “Chapter 1:” on the first line and the chapter title itself on the second line. If you use the Enter key to separate these (called a “hard return”), they will appear much farther apart on the page and will appear in the TOC as two separate entries. To prevent this, you’ll need to use what’s called a “soft-return” by pressing Shift + Enter</w:t>
-      </w:r>
-      <w:r>
-        <w:t xml:space="preserve"> (just after the Tab character mentioned previously)</w:t>
-      </w:r>
-      <w:r>
-        <w:t>. This command tells the computer that you want the second line to be considered part of the same header or paragraph even as it appears on a new line.</w:t>
+      <w:r>
+        <w:t>3</w:t>
+      </w:r>
+      <w:r>
+        <w:t xml:space="preserve">: </w:t>
+      </w:r>
+      <w:r>
+        <w:t>Related Work and Existing Benchmarks</w:t>
       </w:r>
     </w:p>
     <w:p>
       <w:pPr>
         <w:pStyle w:val="Heading4"/>
-      </w:pPr>
-      <w:bookmarkStart w:id="34" w:name="_Toc171427382"/>
-      <w:r>
-        <w:t>Heading</w:t>
-      </w:r>
-      <w:r>
-        <w:t xml:space="preserve"> 4, B-Head</w:t>
-      </w:r>
-      <w:bookmarkEnd w:id="34"/>
-    </w:p>
-    <w:p>
-      <w:pPr>
-        <w:pStyle w:val="BodyText"/>
-      </w:pPr>
-      <w:r>
-        <w:t>The Section Title or A-Head style (shown in the Quick Styles menu as “Sect Title”) is used as a header for a section within a chapter. For an example, see “Chapter Styles” above. Note: there should always be introductory text for the chapter before the Section Title. The style immediately following the Section Title style will default to the Body Text style, to be used for the introduction of the section.</w:t>
-      </w:r>
-    </w:p>
-    <w:p>
-      <w:pPr>
-        <w:pStyle w:val="BodyText"/>
-      </w:pPr>
-      <w:r>
-        <w:t>Section titles will automatically be added to the Table of Contents, directly below the previous chapter title and with a half-inch indent, each time you update the whole TOC.</w:t>
-      </w:r>
-    </w:p>
-    <w:p>
-      <w:pPr>
-        <w:pStyle w:val="Heading4"/>
-      </w:pPr>
-      <w:bookmarkStart w:id="35" w:name="_Toc171427383"/>
-      <w:r>
-        <w:lastRenderedPageBreak/>
-        <w:t>B-Head Style</w:t>
-      </w:r>
-      <w:bookmarkEnd w:id="35"/>
-    </w:p>
-    <w:p>
-      <w:pPr>
-        <w:pStyle w:val="BodyText"/>
-      </w:pPr>
-      <w:r>
-        <w:t xml:space="preserve">The B-Head style (shown in the Quick Styles menu as “B-Head”) is used as a header for a subsection within a section of a chapter. For an example, see “B-Head Style” above. Note: there should always be introductory text for the </w:t>
-      </w:r>
-      <w:r>
-        <w:t>section</w:t>
-      </w:r>
-      <w:r>
-        <w:t xml:space="preserve"> before the </w:t>
-      </w:r>
-      <w:r>
-        <w:t>B-Head</w:t>
-      </w:r>
-      <w:r>
-        <w:t xml:space="preserve">. The style immediately following the </w:t>
-      </w:r>
-      <w:r>
-        <w:t>B-Head</w:t>
-      </w:r>
-      <w:r>
-        <w:t xml:space="preserve"> style will default to the Body Text style, to be used for the introduction of the </w:t>
-      </w:r>
-      <w:r>
-        <w:t>sub</w:t>
-      </w:r>
-      <w:r>
-        <w:t>section.</w:t>
-      </w:r>
-    </w:p>
-    <w:p>
-      <w:pPr>
-        <w:pStyle w:val="BodyText"/>
-      </w:pPr>
-      <w:r>
-        <w:t>B-Heads</w:t>
-      </w:r>
-      <w:r>
-        <w:t xml:space="preserve"> will automatically be added to the Table of Contents, directly below the previous </w:t>
-      </w:r>
-      <w:r>
-        <w:t>section</w:t>
-      </w:r>
-      <w:r>
-        <w:t xml:space="preserve"> title and with a </w:t>
-      </w:r>
-      <w:r>
-        <w:t>one</w:t>
-      </w:r>
-      <w:r>
-        <w:t>-inch indent, each time you update the whole TOC.</w:t>
-      </w:r>
-    </w:p>
-    <w:p>
-      <w:pPr>
-        <w:pStyle w:val="Heading4"/>
-      </w:pPr>
-      <w:bookmarkStart w:id="36" w:name="_Toc171427384"/>
-      <w:r>
-        <w:t>B</w:t>
-      </w:r>
-      <w:r>
-        <w:t>-Head</w:t>
-      </w:r>
-      <w:r>
-        <w:t xml:space="preserve"> Style</w:t>
-      </w:r>
-      <w:bookmarkEnd w:id="36"/>
-    </w:p>
-    <w:p>
-      <w:pPr>
-        <w:pStyle w:val="BodyText"/>
-      </w:pPr>
-      <w:r>
-        <w:t>The Body Text style (shown in the Quick Styles menu as “Body Text”) is used for standard paragraph styles. This paragraph is using the Body Text style; the default style for the next paragraph is also Body Text.</w:t>
-      </w:r>
-    </w:p>
-    <w:p>
-      <w:pPr>
-        <w:pStyle w:val="Heading4"/>
-      </w:pPr>
-      <w:bookmarkStart w:id="37" w:name="_Toc171427385"/>
-      <w:r>
-        <w:t>C-Head</w:t>
-      </w:r>
-      <w:r>
-        <w:t xml:space="preserve"> Style and A</w:t>
-      </w:r>
-      <w:r>
-        <w:t xml:space="preserve">ccompanying </w:t>
-      </w:r>
-      <w:r>
-        <w:t>P</w:t>
-      </w:r>
-      <w:r>
-        <w:t>aragraph</w:t>
-      </w:r>
-      <w:bookmarkEnd w:id="37"/>
-    </w:p>
-    <w:p>
-      <w:pPr>
-        <w:pStyle w:val="BodyText"/>
-      </w:pPr>
-      <w:r>
-        <w:t>The C-Head style (shown in the Quick Styles menu as “</w:t>
-      </w:r>
-      <w:r>
-        <w:t>C</w:t>
-      </w:r>
-      <w:r>
-        <w:t xml:space="preserve">-Head”) is used as a header for a subsection within a </w:t>
-      </w:r>
-      <w:r>
-        <w:t>subsection</w:t>
-      </w:r>
-      <w:r>
-        <w:t>. For example</w:t>
-      </w:r>
-      <w:r>
-        <w:t>:</w:t>
-      </w:r>
-    </w:p>
-    <w:p>
-      <w:pPr>
-        <w:pStyle w:val="C-BodyText"/>
-      </w:pPr>
-      <w:bookmarkStart w:id="38" w:name="_Toc171427386"/>
-      <w:r>
-        <w:rPr>
-          <w:rStyle w:val="Heading5Char"/>
-        </w:rPr>
-        <w:t xml:space="preserve">Body Text with </w:t>
-      </w:r>
-      <w:r>
-        <w:rPr>
-          <w:rStyle w:val="Heading5Char"/>
-        </w:rPr>
-        <w:t>C-Head</w:t>
-      </w:r>
-      <w:bookmarkEnd w:id="38"/>
-      <w:r>
-        <w:t>. This is a C-Head and accompanying paragraph.</w:t>
-      </w:r>
-      <w:r>
-        <w:t xml:space="preserve"> </w:t>
-      </w:r>
-      <w:r>
-        <w:t>Note that the C-Head is on the same line as the rest of the paragraph; it’s not indented; and there is no additional spa</w:t>
-      </w:r>
-      <w:r>
-        <w:t>ce before the C-Head as there is with other headers.</w:t>
-      </w:r>
-    </w:p>
-    <w:p>
-      <w:pPr>
-        <w:pStyle w:val="BodyText"/>
-      </w:pPr>
-      <w:r>
-        <w:t>C-Heads will automatically be added to the Table of Contents, directly below the previous subsection title and with a 1.5-inch indent, each time you update the whole TOC.</w:t>
-      </w:r>
-    </w:p>
-    <w:p>
-      <w:pPr>
-        <w:pStyle w:val="BodyText"/>
-      </w:pPr>
-      <w:r>
-        <w:lastRenderedPageBreak/>
-        <w:t>To apply the C-Head style, select the paragraph to which it belongs and click on the “Body Text w/ C-Head” style in the Quick Styles menu; then select the C-Head itself and click on the “C-Head” style.</w:t>
-      </w:r>
-    </w:p>
-    <w:p>
-      <w:pPr>
-        <w:pStyle w:val="BodyText"/>
-      </w:pPr>
-      <w:r>
-        <w:t xml:space="preserve">Remember, </w:t>
-      </w:r>
-      <w:r>
-        <w:t xml:space="preserve">there should always be introductory text for the </w:t>
-      </w:r>
-      <w:r>
-        <w:t>sub</w:t>
-      </w:r>
-      <w:r>
-        <w:t xml:space="preserve">section before the </w:t>
-      </w:r>
-      <w:r>
-        <w:t>C</w:t>
-      </w:r>
-      <w:r>
-        <w:t xml:space="preserve">-Head. The style immediately following the </w:t>
-      </w:r>
-      <w:r>
-        <w:t>C</w:t>
-      </w:r>
-      <w:r>
-        <w:t xml:space="preserve">-Head style will default </w:t>
-      </w:r>
-      <w:r>
-        <w:t>to the Body Text style</w:t>
-      </w:r>
-      <w:r>
-        <w:t>.</w:t>
-      </w:r>
-    </w:p>
-    <w:p>
-      <w:pPr>
-        <w:pStyle w:val="Heading4"/>
-      </w:pPr>
-      <w:bookmarkStart w:id="39" w:name="_Toc171427387"/>
-      <w:r>
-        <w:t>Numbered List Style</w:t>
-      </w:r>
-      <w:bookmarkEnd w:id="39"/>
-    </w:p>
-    <w:p>
-      <w:pPr>
-        <w:pStyle w:val="BodyText"/>
-      </w:pPr>
-      <w:r>
-        <w:t>To create a numbered list, select the lines of text which you want to make a list (whether they’re already in a Word list structure or not) and choose the “Numbered List” style in the Quick Styles menu. If the list was in a Word list structure previously, it will simply update the styles. If the list was previously formatted by hand, you will need to check that list items begin and end at the correct points and that any typed numbering is removed.</w:t>
-      </w:r>
-    </w:p>
-    <w:p>
-      <w:pPr>
-        <w:pStyle w:val="NumberedList"/>
-      </w:pPr>
-      <w:r>
-        <w:t xml:space="preserve">This is the </w:t>
-      </w:r>
-      <w:r>
-        <w:t>Numbered</w:t>
-      </w:r>
-      <w:r>
-        <w:t xml:space="preserve"> l</w:t>
-      </w:r>
-      <w:r>
-        <w:t>ist</w:t>
-      </w:r>
-      <w:r>
-        <w:t xml:space="preserve"> s</w:t>
-      </w:r>
-      <w:r>
-        <w:t>tyle</w:t>
-      </w:r>
-      <w:r>
-        <w:t>.</w:t>
-      </w:r>
-    </w:p>
-    <w:p>
-      <w:pPr>
-        <w:pStyle w:val="NumberedList"/>
-      </w:pPr>
-      <w:r>
-        <w:t>To add a list item, simply hit Enter at the end of the previous list item.</w:t>
-      </w:r>
-    </w:p>
-    <w:p>
-      <w:pPr>
-        <w:pStyle w:val="NumberedList"/>
-      </w:pPr>
-      <w:r>
-        <w:t>To end the list, hit Enter and then select the “Body Text” style from the Quick Styles menu.</w:t>
-      </w:r>
-    </w:p>
-    <w:p>
-      <w:pPr>
-        <w:pStyle w:val="BodyText"/>
-      </w:pPr>
-      <w:r>
-        <w:t xml:space="preserve">If you wish to create a second numbered list, follow the directions for creating a list above, then right-click on the list and choose “Restart at 1.” If this does not work, right-click and choose “Set Numbering Value” and set it to create a new list starting from 1. If either of these methods creates a list starting with 1 but with the second item in the </w:t>
-      </w:r>
-      <w:r>
-        <w:lastRenderedPageBreak/>
-        <w:t>list continuing numbering from a previous list, you may need to right-click on that second item and again choose “Set Numbering Value,” this time choosing to start from 2.</w:t>
-      </w:r>
-    </w:p>
-    <w:p>
-      <w:pPr>
-        <w:pStyle w:val="Heading4"/>
-      </w:pPr>
-      <w:bookmarkStart w:id="40" w:name="_Toc171427388"/>
-      <w:r>
-        <w:t>Bulleted List Style</w:t>
-      </w:r>
-      <w:bookmarkEnd w:id="40"/>
-    </w:p>
-    <w:p>
-      <w:pPr>
-        <w:pStyle w:val="BodyText"/>
-      </w:pPr>
-      <w:r>
-        <w:t>To create a bulleted list, select the lines of text which you want to make a list (whether they’re already in a Word list structure or not) and choose the “Bulleted List” style in the Quick Styles menu. If the list was in a Word list structure previously, it will simply update the styles. If the list was previously formatted by hand, you will need to check that list items begin and end at the correct points and that any typed bullets are removed.</w:t>
-      </w:r>
-    </w:p>
-    <w:p>
-      <w:pPr>
-        <w:pStyle w:val="BulletedList"/>
-      </w:pPr>
-      <w:r>
-        <w:t xml:space="preserve">This is the </w:t>
-      </w:r>
-      <w:r>
-        <w:t>Bulleted</w:t>
-      </w:r>
-      <w:r>
-        <w:t xml:space="preserve"> list style.</w:t>
-      </w:r>
-    </w:p>
-    <w:p>
-      <w:pPr>
-        <w:pStyle w:val="BulletedList"/>
-      </w:pPr>
-      <w:r>
-        <w:t>To add a list item, simply hit Enter at the end of the previous list item.</w:t>
-      </w:r>
-    </w:p>
-    <w:p>
-      <w:pPr>
-        <w:pStyle w:val="BulletedList"/>
-      </w:pPr>
-      <w:r>
-        <w:t>To end the list, hit Enter and then select the “Body Text” style from the Quick Styles menu.</w:t>
-      </w:r>
-    </w:p>
-    <w:p>
-      <w:pPr>
-        <w:pStyle w:val="BodyText"/>
-      </w:pPr>
-      <w:r>
-        <w:t>This is what some body text after a bulleted list would look l</w:t>
-      </w:r>
-      <w:r>
-        <w:t>i</w:t>
-      </w:r>
-      <w:r>
-        <w:t>ke.</w:t>
-      </w:r>
-    </w:p>
-    <w:p>
-      <w:pPr>
-        <w:pStyle w:val="Heading4"/>
-      </w:pPr>
-      <w:bookmarkStart w:id="41" w:name="_Block_Quote_Style"/>
-      <w:bookmarkStart w:id="42" w:name="_Toc171427389"/>
-      <w:bookmarkEnd w:id="41"/>
-      <w:r>
-        <w:t>Block Quote Style</w:t>
-      </w:r>
-      <w:bookmarkEnd w:id="42"/>
-    </w:p>
-    <w:p>
-      <w:pPr>
-        <w:pStyle w:val="BodyText"/>
-      </w:pPr>
-      <w:r>
-        <w:t>The Block Quote Style is used for quoting large selections of text, rather than a word or phrase.</w:t>
-      </w:r>
-    </w:p>
-    <w:p>
-      <w:pPr>
-        <w:pStyle w:val="BlockQuote"/>
-      </w:pPr>
-      <w:r>
-        <w:t>Blockquotes are further indented to distinguish them from body text. They’re also single-spaced rather than double-spaced.</w:t>
-      </w:r>
-    </w:p>
-    <w:p>
-      <w:pPr>
-        <w:pStyle w:val="BlockQuote"/>
-      </w:pPr>
-      <w:r>
-        <w:t>A multi-paragraph block quote will look like this, with a space between the paragraphs to differentiate them.</w:t>
-      </w:r>
-    </w:p>
-    <w:p>
-      <w:pPr>
-        <w:pStyle w:val="Heading4"/>
-      </w:pPr>
-      <w:bookmarkStart w:id="43" w:name="_Toc171427390"/>
-      <w:r>
-        <w:lastRenderedPageBreak/>
-        <w:t>Figures</w:t>
-      </w:r>
-      <w:bookmarkEnd w:id="43"/>
-    </w:p>
-    <w:p>
-      <w:pPr>
-        <w:pStyle w:val="BodyText"/>
-      </w:pPr>
-      <w:r>
-        <w:t xml:space="preserve">To insert a figure, </w:t>
-      </w:r>
-      <w:r>
-        <w:t>place your cursor at the beginning of the Figure Title line. Y</w:t>
-      </w:r>
-      <w:r>
-        <w:t xml:space="preserve">ou can </w:t>
-      </w:r>
-      <w:r>
-        <w:t>either copy and paste a figure into the document or use the Insert Pictures command in the Insert ribbon. Once you have the image inserted, click on the picture and select the dropdown menu that appears: make sure the “In Line With Text” option is selected</w:t>
-      </w:r>
-      <w:r>
-        <w:t>, in order to keep the picture aligned properly and associated with the correct text. Example</w:t>
-      </w:r>
-      <w:r>
-        <w:t xml:space="preserve"> (the gray box is merely a placeholder to show you how it should look)</w:t>
-      </w:r>
-      <w:r>
-        <w:t>:</w:t>
-      </w:r>
-    </w:p>
-    <w:p>
-      <w:pPr>
-        <w:pStyle w:val="BodyText"/>
-      </w:pPr>
-      <w:r>
-        <w:t xml:space="preserve">In order not to be drawn into your Table of Figures, you need to assign your figure its own paragraph and style. Click to the right of the figure, making sure your cursor is to the left of the paragraph marker, and select </w:t>
-      </w:r>
-      <w:r>
-        <w:rPr>
-          <w:i/>
-        </w:rPr>
-        <w:t>Figure</w:t>
-      </w:r>
-      <w:r>
-        <w:t xml:space="preserve"> from the Styles list.</w:t>
-      </w:r>
-    </w:p>
-    <w:bookmarkStart w:id="44" w:name="_Toc473816963"/>
-    <w:p>
-      <w:pPr>
-        <w:pStyle w:val="BodyText"/>
-      </w:pPr>
-      <w:r>
-        <w:rPr>
-          <w:noProof/>
-        </w:rPr>
-        <mc:AlternateContent>
-          <mc:Choice Requires="wps">
-            <w:drawing>
-              <wp:inline distT="0" distB="0" distL="0" distR="0" wp14:anchorId="30470671" wp14:editId="2FCEE595">
-                <wp:extent cx="5157216" cy="1005840"/>
-                <wp:effectExtent l="0" t="0" r="24765" b="22860"/>
-                <wp:docPr id="4" name="Rectangle 4" descr="Image of grey box"/>
-                <wp:cNvGraphicFramePr/>
-                <a:graphic xmlns:a="http://schemas.openxmlformats.org/drawingml/2006/main">
-                  <a:graphicData uri="http://schemas.microsoft.com/office/word/2010/wordprocessingShape">
-                    <wps:wsp>
-                      <wps:cNvSpPr/>
-                      <wps:spPr>
-                        <a:xfrm>
-                          <a:off x="0" y="0"/>
-                          <a:ext cx="5157216" cy="1005840"/>
-                        </a:xfrm>
-                        <a:prstGeom prst="rect">
-                          <a:avLst/>
-                        </a:prstGeom>
-                      </wps:spPr>
-                      <wps:style>
-                        <a:lnRef idx="2">
-                          <a:schemeClr val="accent3">
-                            <a:shade val="50000"/>
-                          </a:schemeClr>
-                        </a:lnRef>
-                        <a:fillRef idx="1">
-                          <a:schemeClr val="accent3"/>
-                        </a:fillRef>
-                        <a:effectRef idx="0">
-                          <a:schemeClr val="accent3"/>
-                        </a:effectRef>
-                        <a:fontRef idx="minor">
-                          <a:schemeClr val="lt1"/>
-                        </a:fontRef>
-                      </wps:style>
-                      <wps:bodyPr rot="0" spcFirstLastPara="0" vertOverflow="overflow" horzOverflow="overflow" vert="horz" wrap="square" lIns="91440" tIns="45720" rIns="91440" bIns="45720" numCol="1" spcCol="0" rtlCol="0" fromWordArt="0" anchor="ctr" anchorCtr="0" forceAA="0" compatLnSpc="1">
-                        <a:prstTxWarp prst="textNoShape">
-                          <a:avLst/>
-                        </a:prstTxWarp>
-                        <a:noAutofit/>
-                      </wps:bodyPr>
-                    </wps:wsp>
-                  </a:graphicData>
-                </a:graphic>
-              </wp:inline>
-            </w:drawing>
-          </mc:Choice>
-          <mc:Fallback>
-            <w:pict>
-              <v:rect w14:anchorId="541875C2" id="Rectangle 4" o:spid="_x0000_s1026" alt="Image of grey box" style="width:406.1pt;height:79.2pt;visibility:visible;mso-wrap-style:square;mso-left-percent:-10001;mso-top-percent:-10001;mso-position-horizontal:absolute;mso-position-horizontal-relative:char;mso-position-vertical:absolute;mso-position-vertical-relative:line;mso-left-percent:-10001;mso-top-percent:-10001;v-text-anchor:middle" o:gfxdata="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" fillcolor="#a5a5a5 [3206]" strokecolor="#525252 [1606]" strokeweight="1pt">
-                <w10:anchorlock/>
-              </v:rect>
-            </w:pict>
-          </mc:Fallback>
-        </mc:AlternateContent>
-      </w:r>
-    </w:p>
-    <w:p>
-      <w:pPr>
-        <w:pStyle w:val="FigureTitle"/>
-      </w:pPr>
-      <w:bookmarkStart w:id="45" w:name="_Toc500510491"/>
-      <w:r>
-        <w:t xml:space="preserve">Figure 1. </w:t>
-      </w:r>
-      <w:r>
-        <w:tab/>
-      </w:r>
-      <w:r>
-        <w:t>Figure Title</w:t>
-      </w:r>
-      <w:r>
-        <w:t>.</w:t>
-      </w:r>
-      <w:bookmarkEnd w:id="44"/>
-      <w:bookmarkEnd w:id="45"/>
-    </w:p>
-    <w:p>
-      <w:pPr>
-        <w:pStyle w:val="FigureDescription"/>
-      </w:pPr>
-      <w:r>
-        <w:t>Description of Figure 1, legend brief citation, etc.</w:t>
-      </w:r>
-    </w:p>
-    <w:p>
-      <w:pPr>
-        <w:pStyle w:val="C-BodyText"/>
-      </w:pPr>
-      <w:bookmarkStart w:id="46" w:name="_Toc171427391"/>
-      <w:r>
-        <w:rPr>
-          <w:rStyle w:val="Heading5Char"/>
-        </w:rPr>
-        <w:t>Figure Title Style.</w:t>
-      </w:r>
-      <w:bookmarkEnd w:id="46"/>
-      <w:r>
-        <w:t xml:space="preserve"> The Figure Title </w:t>
-      </w:r>
-      <w:r>
-        <w:t>s</w:t>
-      </w:r>
-      <w:r>
-        <w:t>tyle, which appears in the Quick Styles menu as “Figure Title,” is used to name a figure in a way that will appear in the TOC. The title will automatically be added to the List of Figures following an update of the entire table.</w:t>
-      </w:r>
-      <w:r>
-        <w:t xml:space="preserve"> Remember to place a tab between the figure number and the title, as shown above, in order to preserve formatting in the TOC.</w:t>
-      </w:r>
-      <w:r>
-        <w:t xml:space="preserve"> Note: the style of the paragraph following Figure Title defaults to Figure Description.</w:t>
-      </w:r>
-    </w:p>
-    <w:p>
-      <w:pPr>
-        <w:pStyle w:val="C-BodyText"/>
-      </w:pPr>
-      <w:bookmarkStart w:id="47" w:name="_Toc171427392"/>
-      <w:r>
-        <w:rPr>
-          <w:rStyle w:val="Heading5Char"/>
-        </w:rPr>
-        <w:lastRenderedPageBreak/>
-        <w:t>Figure Description Style.</w:t>
-      </w:r>
-      <w:bookmarkEnd w:id="47"/>
-      <w:r>
-        <w:t xml:space="preserve"> The Figure Description style, which appears in the Quick Styles menu as “Figure Description,” is used to briefly describe the accompanying figure</w:t>
-      </w:r>
-      <w:r>
-        <w:t>; the space after it separates it from the body text below the figure.</w:t>
-      </w:r>
-    </w:p>
-    <w:p>
-      <w:pPr>
-        <w:pStyle w:val="Heading4"/>
-      </w:pPr>
-      <w:bookmarkStart w:id="48" w:name="_Toc171427393"/>
-      <w:r>
-        <w:t>Tables</w:t>
-      </w:r>
-      <w:bookmarkEnd w:id="48"/>
-    </w:p>
-    <w:p>
-      <w:pPr>
-        <w:pStyle w:val="BodyText"/>
-      </w:pPr>
-      <w:r>
-        <w:t>Tables can copied and pasted from another document or created in the Word document itself using the Insert Table command on the Insert tab of the ribbon. A sample table:</w:t>
-      </w:r>
-    </w:p>
-    <w:p>
-      <w:pPr>
-        <w:pStyle w:val="TableTitle"/>
-      </w:pPr>
-      <w:bookmarkStart w:id="49" w:name="_Toc500509875"/>
-      <w:r>
-        <w:t>Table 1</w:t>
-      </w:r>
-      <w:r>
-        <w:t xml:space="preserve">. </w:t>
-      </w:r>
-      <w:r>
-        <w:tab/>
-      </w:r>
-      <w:r>
-        <w:t>Table Title</w:t>
-      </w:r>
-      <w:r>
-        <w:t>.</w:t>
-      </w:r>
-      <w:bookmarkEnd w:id="49"/>
-    </w:p>
-    <w:tbl>
-      <w:tblPr>
-        <w:tblW w:w="0" w:type="auto"/>
-        <w:tblCellMar>
-          <w:top w:w="216" w:type="dxa"/>
-          <w:left w:w="216" w:type="dxa"/>
-          <w:bottom w:w="288" w:type="dxa"/>
-          <w:right w:w="216" w:type="dxa"/>
-        </w:tblCellMar>
-        <w:tblLook w:val="04A0" w:firstRow="1" w:lastRow="0" w:firstColumn="1" w:lastColumn="0" w:noHBand="0" w:noVBand="1"/>
-      </w:tblPr>
-      <w:tblGrid>
-        <w:gridCol w:w="2880"/>
-        <w:gridCol w:w="2878"/>
-        <w:gridCol w:w="2882"/>
-      </w:tblGrid>
-      <w:tr>
-        <w:tc>
-          <w:tcPr>
-            <w:tcW w:w="2880" w:type="dxa"/>
-          </w:tcPr>
-          <w:p>
-            <w:pPr>
-              <w:pStyle w:val="TableCell"/>
-            </w:pPr>
-            <w:r>
-              <w:t>Lorem ipsum</w:t>
-            </w:r>
-          </w:p>
-        </w:tc>
-        <w:tc>
-          <w:tcPr>
-            <w:tcW w:w="2878" w:type="dxa"/>
-          </w:tcPr>
-          <w:p>
-            <w:pPr>
-              <w:pStyle w:val="TableCell"/>
-              <w:jc w:val="center"/>
-            </w:pPr>
-            <w:r>
-              <w:t>Augue vel tellus</w:t>
-            </w:r>
-          </w:p>
-        </w:tc>
-        <w:tc>
-          <w:tcPr>
-            <w:tcW w:w="2882" w:type="dxa"/>
-          </w:tcPr>
-          <w:p>
-            <w:pPr>
-              <w:pStyle w:val="TableCell"/>
-              <w:jc w:val="center"/>
-            </w:pPr>
-            <w:r>
-              <w:t>Sed sagittis</w:t>
-            </w:r>
-          </w:p>
-        </w:tc>
-      </w:tr>
-      <w:tr>
-        <w:tc>
-          <w:tcPr>
-            <w:tcW w:w="2880" w:type="dxa"/>
-          </w:tcPr>
-          <w:p>
-            <w:pPr>
-              <w:pStyle w:val="TableCell"/>
-            </w:pPr>
-            <w:r>
-              <w:t>Est blandit</w:t>
-            </w:r>
-          </w:p>
-        </w:tc>
-        <w:tc>
-          <w:tcPr>
-            <w:tcW w:w="2878" w:type="dxa"/>
-          </w:tcPr>
-          <w:p>
-            <w:pPr>
-              <w:pStyle w:val="TableCell"/>
-              <w:jc w:val="center"/>
-            </w:pPr>
-            <w:r>
-              <w:t>0</w:t>
-            </w:r>
-          </w:p>
-        </w:tc>
-        <w:tc>
-          <w:tcPr>
-            <w:tcW w:w="2882" w:type="dxa"/>
-          </w:tcPr>
-          <w:p>
-            <w:pPr>
-              <w:pStyle w:val="TableCell"/>
-              <w:jc w:val="center"/>
-            </w:pPr>
-            <w:r>
-              <w:t>1</w:t>
-            </w:r>
-          </w:p>
-        </w:tc>
-      </w:tr>
-      <w:tr>
-        <w:tc>
-          <w:tcPr>
-            <w:tcW w:w="2880" w:type="dxa"/>
-          </w:tcPr>
-          <w:p>
-            <w:pPr>
-              <w:pStyle w:val="TableCell"/>
-            </w:pPr>
-            <w:r>
-              <w:t>Sed est</w:t>
-            </w:r>
-          </w:p>
-        </w:tc>
-        <w:tc>
-          <w:tcPr>
-            <w:tcW w:w="2878" w:type="dxa"/>
-          </w:tcPr>
-          <w:p>
-            <w:pPr>
-              <w:pStyle w:val="TableCell"/>
-              <w:jc w:val="center"/>
-            </w:pPr>
-            <w:r>
-              <w:t>0</w:t>
-            </w:r>
-          </w:p>
-        </w:tc>
-        <w:tc>
-          <w:tcPr>
-            <w:tcW w:w="2882" w:type="dxa"/>
-          </w:tcPr>
-          <w:p>
-            <w:pPr>
-              <w:pStyle w:val="TableCell"/>
-              <w:jc w:val="center"/>
-            </w:pPr>
-            <w:r>
-              <w:t>1</w:t>
-            </w:r>
-          </w:p>
-        </w:tc>
-      </w:tr>
-    </w:tbl>
-    <w:p>
-      <w:pPr>
-        <w:pStyle w:val="TableDescription"/>
-      </w:pPr>
-      <w:r>
-        <w:t>Table description style</w:t>
-      </w:r>
-      <w:r>
-        <w:t>, legend, brief citation etc.</w:t>
-      </w:r>
-    </w:p>
-    <w:p>
-      <w:pPr>
-        <w:pStyle w:val="BodyText"/>
-      </w:pPr>
-      <w:r>
-        <w:t>Following insertion using either method, table styles should be applied as follows.</w:t>
-      </w:r>
-    </w:p>
-    <w:p>
-      <w:pPr>
-        <w:pStyle w:val="C-BodyText"/>
-      </w:pPr>
-      <w:bookmarkStart w:id="50" w:name="_Toc171427394"/>
-      <w:r>
-        <w:rPr>
-          <w:rStyle w:val="Heading5Char"/>
-        </w:rPr>
-        <w:t>Table Title Style</w:t>
-      </w:r>
-      <w:r>
-        <w:rPr>
-          <w:rStyle w:val="Heading5Char"/>
-        </w:rPr>
-        <w:t>.</w:t>
-      </w:r>
-      <w:bookmarkEnd w:id="50"/>
-      <w:r>
-        <w:t xml:space="preserve"> The Table Title should come immediately before the table itself</w:t>
-      </w:r>
-      <w:r>
-        <w:t>; the style appears in the Quick Styles menu as “Table Title,”</w:t>
-      </w:r>
-      <w:r>
-        <w:t xml:space="preserve"> </w:t>
-      </w:r>
-      <w:r>
-        <w:t>In order to preserve formatting of the TOC entry, insert a Tab character between the table number and the table title, as shown above.</w:t>
-      </w:r>
-    </w:p>
-    <w:p>
-      <w:pPr>
-        <w:pStyle w:val="C-BodyText"/>
-      </w:pPr>
-      <w:bookmarkStart w:id="51" w:name="_Toc171427395"/>
-      <w:r>
-        <w:rPr>
-          <w:rStyle w:val="Heading5Char"/>
-        </w:rPr>
-        <w:t>Table Cell Style.</w:t>
-      </w:r>
-      <w:bookmarkEnd w:id="51"/>
-      <w:r>
-        <w:t xml:space="preserve"> To apply this style to the table cells, highlight the table and choose “Table Cell” from the Quick Styles menu. The default will be to left-align the text inside the cells; to center text, as in the second and third columns above, </w:t>
-      </w:r>
-      <w:r>
-        <w:t xml:space="preserve">you can </w:t>
-      </w:r>
-      <w:r>
-        <w:t xml:space="preserve">simply select </w:t>
-      </w:r>
-      <w:r>
-        <w:lastRenderedPageBreak/>
-        <w:t>those cells and</w:t>
-      </w:r>
-      <w:r>
-        <w:t xml:space="preserve"> choose Center. To control vertical alignment as necessary, select the applicable cells and choose the Layout tab that appears in the ribbon. On the right in the Alignment section, choose the graphic that matches the alignment you prefer, from top left to bottom right to centered horizontally and vertically.</w:t>
-      </w:r>
-    </w:p>
-    <w:p>
-      <w:pPr>
-        <w:pStyle w:val="C-BodyText"/>
-      </w:pPr>
-      <w:bookmarkStart w:id="52" w:name="_Toc171427396"/>
-      <w:r>
-        <w:rPr>
-          <w:rStyle w:val="Heading5Char"/>
-        </w:rPr>
-        <w:t>Table Description Style</w:t>
-      </w:r>
-      <w:r>
-        <w:rPr>
-          <w:rStyle w:val="Heading5Char"/>
-        </w:rPr>
-        <w:t>.</w:t>
-      </w:r>
-      <w:bookmarkEnd w:id="52"/>
-      <w:r>
-        <w:t xml:space="preserve"> The Table Description style, shown in the Quick Styles menu as “Table Description,” is used to format the brief description of the table immediately following said table. This style also includes space after to differentiate it from later paragraphs.</w:t>
-      </w:r>
-    </w:p>
-    <w:p>
-      <w:pPr>
-        <w:pStyle w:val="Heading3"/>
-      </w:pPr>
-      <w:bookmarkStart w:id="53" w:name="_Toc171427397"/>
-      <w:r>
-        <w:t>Styles Used in Other Parts of the Document</w:t>
-      </w:r>
-      <w:bookmarkEnd w:id="53"/>
-    </w:p>
-    <w:p>
-      <w:pPr>
-        <w:pStyle w:val="Heading4"/>
-      </w:pPr>
-      <w:bookmarkStart w:id="54" w:name="_Toc171427398"/>
-      <w:r>
-        <w:t>Title Style</w:t>
-      </w:r>
-      <w:bookmarkEnd w:id="54"/>
-    </w:p>
-    <w:p>
-      <w:pPr>
-        <w:pStyle w:val="BodyText"/>
-      </w:pPr>
-      <w:r>
-        <w:t>The only time the Title style is used is on the first page of the document. It is exactly 2” from the top of the document.</w:t>
-      </w:r>
-    </w:p>
-    <w:p>
-      <w:pPr>
-        <w:pStyle w:val="Heading4"/>
-      </w:pPr>
-      <w:bookmarkStart w:id="55" w:name="_Toc171427399"/>
-      <w:r>
-        <w:t>Author Style</w:t>
-      </w:r>
-      <w:bookmarkEnd w:id="55"/>
-    </w:p>
-    <w:p>
-      <w:pPr>
-        <w:pStyle w:val="BodyText"/>
-      </w:pPr>
-      <w:r>
-        <w:t>The Author style is also used only on the first page of the document and begins exactly 2” below the title.</w:t>
-      </w:r>
-    </w:p>
-    <w:p>
-      <w:pPr>
-        <w:pStyle w:val="Heading4"/>
-      </w:pPr>
-      <w:bookmarkStart w:id="56" w:name="_Toc171427400"/>
-      <w:r>
-        <w:t>Centered Text Style</w:t>
-      </w:r>
-      <w:bookmarkEnd w:id="56"/>
-    </w:p>
-    <w:p>
-      <w:pPr>
-        <w:pStyle w:val="BodyText"/>
-      </w:pPr>
-      <w:r>
-        <w:t>The Centered Text style is to be used on the first page for the Degree information.</w:t>
-      </w:r>
-    </w:p>
-    <w:p>
-      <w:pPr>
-        <w:pStyle w:val="Heading4"/>
-      </w:pPr>
-      <w:bookmarkStart w:id="57" w:name="_Toc171427401"/>
-      <w:r>
-        <w:lastRenderedPageBreak/>
-        <w:t>Harvard,Month,Year Style</w:t>
-      </w:r>
-      <w:bookmarkEnd w:id="57"/>
-    </w:p>
-    <w:p>
-      <w:pPr>
-        <w:pStyle w:val="BodyText"/>
-      </w:pPr>
-      <w:r>
-        <w:t>The Harvard,Month,Year style is for use on the front page for the University name and the month and year of graduation.</w:t>
-      </w:r>
-    </w:p>
-    <w:p>
-      <w:pPr>
-        <w:pStyle w:val="Heading4"/>
-      </w:pPr>
-      <w:bookmarkStart w:id="58" w:name="_Toc171427402"/>
-      <w:r>
-        <w:t>Copyright Style</w:t>
-      </w:r>
-      <w:bookmarkEnd w:id="58"/>
-    </w:p>
-    <w:p>
-      <w:pPr>
-        <w:pStyle w:val="BodyText"/>
-      </w:pPr>
-      <w:r>
-        <w:t>The Copyright style is for use on the second page for copyright information.</w:t>
-      </w:r>
-    </w:p>
-    <w:p>
-      <w:pPr>
-        <w:pStyle w:val="Heading4"/>
-      </w:pPr>
-      <w:bookmarkStart w:id="59" w:name="_Toc171427403"/>
-      <w:r>
-        <w:t>No-TOC-Heading Style</w:t>
-      </w:r>
-      <w:bookmarkEnd w:id="59"/>
-    </w:p>
-    <w:p>
-      <w:pPr>
-        <w:pStyle w:val="BodyText"/>
-      </w:pPr>
-      <w:r>
-        <w:t>The No-TOC-Heading style is for use when chapter-type headings should not be included in the table of contents, such as the Abstract.</w:t>
-      </w:r>
-      <w:r>
-        <w:t xml:space="preserve"> Its appearance is exactly the same as the Chapter Title style but will not be included when the table of contents is updated.</w:t>
-      </w:r>
-    </w:p>
-    <w:p>
-      <w:pPr>
-        <w:pStyle w:val="Heading4"/>
-      </w:pPr>
-      <w:bookmarkStart w:id="60" w:name="_Toc171427404"/>
-      <w:r>
-        <w:t>Bibliography Entry Style</w:t>
-      </w:r>
-      <w:bookmarkEnd w:id="60"/>
-    </w:p>
-    <w:p>
-      <w:pPr>
-        <w:pStyle w:val="BodyText"/>
-      </w:pPr>
-      <w:r>
-        <w:t>The Bibliography Entry style is single-spaced with a double-space between entries and has a hanging indent of one-half inch. The sample text includes only a few examples of different style guides for different types of document: please be sure to format your bibliography entries using the style guide required for your thesis type.</w:t>
-      </w:r>
-    </w:p>
-    <w:p>
-      <w:pPr>
-        <w:pStyle w:val="BibliographyEntry"/>
-      </w:pPr>
-      <w:r>
-        <w:t xml:space="preserve">Last Name, Full First Name. </w:t>
-      </w:r>
-      <w:r>
-        <w:rPr>
-          <w:i/>
-        </w:rPr>
-        <w:t>Basic MLA Style Only</w:t>
-      </w:r>
-      <w:r>
-        <w:t>. City: Publisher, Year. Print.</w:t>
-      </w:r>
-    </w:p>
-    <w:p>
-      <w:pPr>
-        <w:pStyle w:val="BibliographyEntry"/>
-      </w:pPr>
-      <w:r>
-        <w:t xml:space="preserve">Last Name, First and Middle Initials (Year). </w:t>
-      </w:r>
-      <w:r>
-        <w:rPr>
-          <w:i/>
-        </w:rPr>
-        <w:t>Basic APA Style Only.</w:t>
-      </w:r>
-      <w:r>
-        <w:t xml:space="preserve"> City, State Abbreviation: Publisher.</w:t>
-      </w:r>
-    </w:p>
-    <w:p>
-      <w:pPr>
-        <w:pStyle w:val="BibliographyEntry"/>
-      </w:pPr>
-      <w:r>
-        <w:t xml:space="preserve">Last Name, First Name. </w:t>
-      </w:r>
-      <w:r>
-        <w:rPr>
-          <w:i/>
-        </w:rPr>
-        <w:t>Basic CMS Style Only, Requires Footnotes or Endnotes.</w:t>
-      </w:r>
-      <w:r>
-        <w:t xml:space="preserve"> Place of publication: Publisher, Year.</w:t>
-      </w:r>
-    </w:p>
-    <w:p>
-      <w:pPr>
-        <w:pStyle w:val="BodyText"/>
-      </w:pPr>
-    </w:p>
-    <w:p>
-      <w:pPr>
-        <w:pStyle w:val="BodyText"/>
-      </w:pPr>
-    </w:p>
-    <w:p>
-      <w:pPr>
-        <w:pStyle w:val="BodyText"/>
         <w:sectPr>
           <w:pgSz w:w="12240" w:h="15840"/>
           <w:pgMar w:top="1440" w:right="1440" w:bottom="1440" w:left="2160" w:header="720" w:footer="720" w:gutter="0"/>
@@ -4442,228 +3363,428 @@
           <w:docGrid w:linePitch="360"/>
         </w:sectPr>
       </w:pPr>
+      <w:r>
+        <w:t>3.1 Ethics in Artificial Intelligence</w:t>
+      </w:r>
+      <w:r>
+        <w:br/>
+        <w:t>3.2 Moral Reasoning in Machine Learning</w:t>
+      </w:r>
+      <w:r>
+        <w:br/>
+        <w:t>3.3 Overview of Major Moral Datasets</w:t>
+      </w:r>
+      <w:r>
+        <w:br/>
+        <w:t>   3.3.1 ETHICS</w:t>
+      </w:r>
+      <w:r>
+        <w:br/>
+        <w:t xml:space="preserve">   3.3.2 </w:t>
+      </w:r>
+      <w:proofErr w:type="spellStart"/>
+      <w:r>
+        <w:t>NormBank</w:t>
+      </w:r>
+      <w:proofErr w:type="spellEnd"/>
+      <w:r>
+        <w:br/>
+        <w:t xml:space="preserve">   3.3.3 </w:t>
+      </w:r>
+      <w:proofErr w:type="spellStart"/>
+      <w:r>
+        <w:t>MoralBench</w:t>
+      </w:r>
+      <w:proofErr w:type="spellEnd"/>
+      <w:r>
+        <w:br/>
+        <w:t>   3.3.4 Delphi and Related Systems</w:t>
+      </w:r>
+      <w:r>
+        <w:br/>
+        <w:t>3.4 Implicit Cognitivism in Benchmark Design</w:t>
+      </w:r>
+      <w:r>
+        <w:br/>
+        <w:t>3.5 Limitations of Current Evaluation Paradigms</w:t>
+      </w:r>
+      <w:r>
+        <w:br/>
+        <w:t>3.6 Gaps in Existing Literature</w:t>
+      </w:r>
+      <w:r>
+        <w:br/>
+      </w:r>
     </w:p>
     <w:p>
       <w:pPr>
         <w:pStyle w:val="Heading2"/>
       </w:pPr>
-      <w:bookmarkStart w:id="61" w:name="_Toc171427405"/>
-      <w:bookmarkStart w:id="62" w:name="_Hlk100312797"/>
       <w:r>
         <w:lastRenderedPageBreak/>
-        <w:t>Appendix 1</w:t>
-      </w:r>
-      <w:r>
-        <w:t>.</w:t>
+        <w:t xml:space="preserve">Chapter </w:t>
+      </w:r>
+      <w:r>
+        <w:t>4</w:t>
+      </w:r>
+      <w:r>
+        <w:t xml:space="preserve">: </w:t>
+      </w:r>
+      <w:r>
+        <w:t>Theoretical Framework</w:t>
+      </w:r>
+    </w:p>
+    <w:p>
+      <w:pPr>
+        <w:pStyle w:val="Heading4"/>
+      </w:pPr>
+      <w:r>
+        <w:t>4.1 Ethics as Non-Truth-Apt Discourse</w:t>
       </w:r>
       <w:r>
         <w:br/>
-      </w:r>
-      <w:r>
-        <w:t>Title</w:t>
-      </w:r>
-      <w:bookmarkEnd w:id="61"/>
+        <w:t>4.2 Moral Expression vs Moral Description</w:t>
+      </w:r>
+      <w:r>
+        <w:br/>
+        <w:t>4.3 Normative Authority and Value Imposition</w:t>
+      </w:r>
+      <w:r>
+        <w:br/>
+        <w:t>4.4 Overconfidence and Normative Flattening</w:t>
+      </w:r>
+      <w:r>
+        <w:br/>
+        <w:t>4.5 Ethics as Generative Discernment</w:t>
+      </w:r>
+      <w:r>
+        <w:br/>
+        <w:t xml:space="preserve">4.6 </w:t>
+      </w:r>
+      <w:proofErr w:type="spellStart"/>
+      <w:r>
+        <w:t>Operationalising</w:t>
+      </w:r>
+      <w:proofErr w:type="spellEnd"/>
+      <w:r>
+        <w:t xml:space="preserve"> Meta-Ethical Distinctions</w:t>
+      </w:r>
+      <w:r>
+        <w:br/>
+        <w:t>4.7 Conceptual Model of Ethical Misalignment in AI</w:t>
+      </w:r>
+    </w:p>
+    <w:p>
+      <w:pPr>
+        <w:pStyle w:val="Heading2"/>
+      </w:pPr>
+      <w:r>
+        <w:t xml:space="preserve">Chapter </w:t>
+      </w:r>
+      <w:r>
+        <w:t>5</w:t>
+      </w:r>
+      <w:r>
+        <w:t xml:space="preserve">: </w:t>
+      </w:r>
+      <w:proofErr w:type="spellStart"/>
+      <w:r>
+        <w:t>Methdology</w:t>
+      </w:r>
+      <w:proofErr w:type="spellEnd"/>
+    </w:p>
+    <w:p>
+      <w:pPr>
+        <w:pStyle w:val="Heading4"/>
+      </w:pPr>
+      <w:r>
+        <w:t>5.1 Research Design</w:t>
+      </w:r>
+      <w:r>
+        <w:br/>
+        <w:t>5.2 Dataset Selection and Rationale</w:t>
+      </w:r>
+      <w:r>
+        <w:br/>
+        <w:t>5.3 Model Selection</w:t>
+      </w:r>
+      <w:r>
+        <w:br/>
+        <w:t>5.4 Prompt and Probe Construction</w:t>
+      </w:r>
+      <w:r>
+        <w:br/>
+        <w:t>5.5 Experimental Conditions</w:t>
+      </w:r>
+      <w:r>
+        <w:br/>
+        <w:t>5.6 Evaluation Criteria</w:t>
+      </w:r>
+      <w:r>
+        <w:br/>
+        <w:t>5.7 Ethical Considerations</w:t>
+      </w:r>
+      <w:r>
+        <w:br/>
+        <w:t>5.8 Reproducibility and Transparency</w:t>
+      </w:r>
+    </w:p>
+    <w:p>
+      <w:pPr>
+        <w:pStyle w:val="Heading2"/>
+      </w:pPr>
+      <w:r>
+        <w:t xml:space="preserve">Chapter </w:t>
+      </w:r>
+      <w:r>
+        <w:t>6: Experimental Framework</w:t>
+      </w:r>
+    </w:p>
+    <w:p>
+      <w:pPr>
+        <w:pStyle w:val="Heading4"/>
+      </w:pPr>
+      <w:r>
+        <w:lastRenderedPageBreak/>
+        <w:t>6.1 Task Categories</w:t>
+      </w:r>
+      <w:r>
+        <w:br/>
+        <w:t>   6.1.1 Moral Disagreement Scenarios</w:t>
+      </w:r>
+      <w:r>
+        <w:br/>
+        <w:t>   6.1.2 Expressive vs Descriptive Prompts</w:t>
+      </w:r>
+      <w:r>
+        <w:br/>
+        <w:t>   6.1.3 Contextual Ambiguity Tasks</w:t>
+      </w:r>
+      <w:r>
+        <w:br/>
+        <w:t>6.2 Metrics</w:t>
+      </w:r>
+      <w:r>
+        <w:br/>
+        <w:t>   6.2.1 Moral Overconfidence Index</w:t>
+      </w:r>
+      <w:r>
+        <w:br/>
+        <w:t>   6.2.2 Normative Flattening Score</w:t>
+      </w:r>
+      <w:r>
+        <w:br/>
+        <w:t>   6.2.3 Expressive–Cognitive Confusion Rate</w:t>
+      </w:r>
+      <w:r>
+        <w:br/>
+        <w:t>6.3 Baseline Models</w:t>
+      </w:r>
+      <w:r>
+        <w:br/>
+        <w:t>6.4 Experimental Pipeline</w:t>
+      </w:r>
+      <w:r>
+        <w:br/>
+        <w:t>6.5 Statistical Analysis Methods</w:t>
+      </w:r>
+    </w:p>
+    <w:p>
+      <w:pPr>
+        <w:pStyle w:val="Heading2"/>
+      </w:pPr>
+      <w:r>
+        <w:t xml:space="preserve">Chapter </w:t>
+      </w:r>
+      <w:r>
+        <w:t>7</w:t>
+      </w:r>
+      <w:r>
+        <w:t xml:space="preserve">: </w:t>
+      </w:r>
+      <w:r>
+        <w:t>Results</w:t>
+      </w:r>
+    </w:p>
+    <w:p>
+      <w:pPr>
+        <w:pStyle w:val="Heading4"/>
+      </w:pPr>
+      <w:r>
+        <w:t>7.1 Overall Model Performance</w:t>
+      </w:r>
+      <w:r>
+        <w:br/>
+        <w:t xml:space="preserve">7.2 </w:t>
+      </w:r>
+      <w:proofErr w:type="spellStart"/>
+      <w:r>
+        <w:t>Behaviour</w:t>
+      </w:r>
+      <w:proofErr w:type="spellEnd"/>
+      <w:r>
+        <w:t xml:space="preserve"> Under Moral Disagreement</w:t>
+      </w:r>
+      <w:r>
+        <w:br/>
+        <w:t>7.3 Expressive vs Descriptive Failure Modes</w:t>
+      </w:r>
+      <w:r>
+        <w:br/>
+        <w:t>7.4 Normative Bias Patterns</w:t>
+      </w:r>
+      <w:r>
+        <w:br/>
+        <w:t>7.5 Cross-Model Comparisons</w:t>
+      </w:r>
+      <w:r>
+        <w:br/>
+        <w:t>7.6 Quantitative Summar</w:t>
+      </w:r>
+    </w:p>
+    <w:p>
+      <w:pPr>
+        <w:pStyle w:val="Heading2"/>
+      </w:pPr>
+      <w:r>
+        <w:t xml:space="preserve">Chapter </w:t>
+      </w:r>
+      <w:r>
+        <w:t>8</w:t>
+      </w:r>
+      <w:r>
+        <w:t xml:space="preserve">: </w:t>
+      </w:r>
+      <w:r>
+        <w:t>Analysis and Implications</w:t>
+      </w:r>
+    </w:p>
+    <w:p>
+      <w:pPr>
+        <w:pStyle w:val="Heading4"/>
+      </w:pPr>
+      <w:r>
+        <w:lastRenderedPageBreak/>
+        <w:t>8.1 Interpretation of Findings</w:t>
+      </w:r>
+      <w:r>
+        <w:br/>
+        <w:t>8.2 Ethics as Imitation vs Discernment</w:t>
+      </w:r>
+      <w:r>
+        <w:br/>
+        <w:t>8.3 The Illusion of Moral Competence</w:t>
+      </w:r>
+      <w:r>
+        <w:br/>
+        <w:t>8.4 Implications for AI Safety</w:t>
+      </w:r>
+      <w:r>
+        <w:br/>
+        <w:t>8.5 Implications for Governance and Regulation</w:t>
+      </w:r>
+      <w:r>
+        <w:br/>
+        <w:t>8.6 Relevance to Theories of Consciousness</w:t>
+      </w:r>
+      <w:r>
+        <w:br/>
+        <w:t>8.7 Limits of Statistical Moral Modelling</w:t>
+      </w:r>
+    </w:p>
+    <w:p>
+      <w:pPr>
+        <w:pStyle w:val="Heading2"/>
+      </w:pPr>
+      <w:r>
+        <w:t xml:space="preserve">Chapter </w:t>
+      </w:r>
+      <w:r>
+        <w:t>9</w:t>
+      </w:r>
+      <w:r>
+        <w:t xml:space="preserve">: </w:t>
+      </w:r>
+      <w:r>
+        <w:t>Conclusion and Future Work</w:t>
+      </w:r>
+    </w:p>
+    <w:p>
+      <w:pPr>
+        <w:pStyle w:val="Heading4"/>
+        <w:rPr>
+          <w:lang w:val="en-SG"/>
+        </w:rPr>
+      </w:pPr>
+      <w:r>
+        <w:rPr>
+          <w:lang w:val="en-SG"/>
+        </w:rPr>
+        <w:t>9.1 Summary of Contributions</w:t>
+      </w:r>
+      <w:r>
+        <w:rPr>
+          <w:lang w:val="en-SG"/>
+        </w:rPr>
+        <w:br/>
+        <w:t>9.2 Answers to Research Questions</w:t>
+      </w:r>
+      <w:r>
+        <w:rPr>
+          <w:lang w:val="en-SG"/>
+        </w:rPr>
+        <w:br/>
+        <w:t>9.3 Theoretical Significance</w:t>
+      </w:r>
+      <w:r>
+        <w:rPr>
+          <w:lang w:val="en-SG"/>
+        </w:rPr>
+        <w:br/>
+        <w:t>9.4 Practical Applications</w:t>
+      </w:r>
+      <w:r>
+        <w:rPr>
+          <w:lang w:val="en-SG"/>
+        </w:rPr>
+        <w:br/>
+        <w:t>9.5 Limitations</w:t>
+      </w:r>
+      <w:r>
+        <w:rPr>
+          <w:lang w:val="en-SG"/>
+        </w:rPr>
+        <w:br/>
+        <w:t>9.6 Directions for Future Research</w:t>
+      </w:r>
     </w:p>
     <w:p>
       <w:pPr>
         <w:pStyle w:val="BodyText"/>
-      </w:pPr>
-      <w:r>
-        <w:t>The following tables can be copied and pasted into other sections of this document, then changed to the appropriate size and filled with content.</w:t>
-      </w:r>
+        <w:ind w:firstLine="0"/>
+        <w:rPr>
+          <w:lang w:val="en-SG"/>
+        </w:rPr>
+      </w:pPr>
     </w:p>
     <w:p>
       <w:pPr>
         <w:pStyle w:val="BodyText"/>
       </w:pPr>
-      <w:r>
-        <w:t>To add a row, hover your mouse to the left of one of the gray lines between or after rows; to add a column, hover your mouse above one of the gray lines between or after columns. In either case, a thicker line will appear with a “+” sign at the top; click this</w:t>
-      </w:r>
-      <w:r>
-        <w:t xml:space="preserve"> to add a row or column. Note that when doing so, the width of columns and height of rows will distribute evenly.</w:t>
-      </w:r>
     </w:p>
     <w:p>
       <w:pPr>
         <w:pStyle w:val="BodyText"/>
       </w:pPr>
-      <w:r>
-        <w:t>To delete cells, highlight them and right-click, choosing the Delete Cells option. This will give you two types of options: you can delete only the highlighted cells and choose whether to move the remaining cells up or left; or you can delete the entire row or column that the highlighted cells belong to.</w:t>
-      </w:r>
-    </w:p>
-    <w:p>
-      <w:pPr>
-        <w:pStyle w:val="TableTitle"/>
-      </w:pPr>
-      <w:bookmarkStart w:id="63" w:name="_Toc500509876"/>
-      <w:r>
-        <w:t xml:space="preserve">Table </w:t>
-      </w:r>
-      <w:r>
-        <w:t>2</w:t>
-      </w:r>
-      <w:r>
-        <w:t xml:space="preserve">. </w:t>
-      </w:r>
-      <w:r>
-        <w:t>Table Title</w:t>
-      </w:r>
-      <w:bookmarkEnd w:id="63"/>
-      <w:r>
-        <w:t>.</w:t>
-      </w:r>
-    </w:p>
-    <w:tbl>
-      <w:tblPr>
-        <w:tblW w:w="0" w:type="auto"/>
-        <w:tblCellMar>
-          <w:top w:w="216" w:type="dxa"/>
-          <w:left w:w="216" w:type="dxa"/>
-          <w:bottom w:w="288" w:type="dxa"/>
-          <w:right w:w="216" w:type="dxa"/>
-        </w:tblCellMar>
-        <w:tblLook w:val="04A0" w:firstRow="1" w:lastRow="0" w:firstColumn="1" w:lastColumn="0" w:noHBand="0" w:noVBand="1"/>
-      </w:tblPr>
-      <w:tblGrid>
-        <w:gridCol w:w="2880"/>
-        <w:gridCol w:w="2878"/>
-        <w:gridCol w:w="2882"/>
-      </w:tblGrid>
-      <w:tr>
-        <w:tc>
-          <w:tcPr>
-            <w:tcW w:w="3116" w:type="dxa"/>
-          </w:tcPr>
-          <w:p>
-            <w:pPr>
-              <w:pStyle w:val="TableCell"/>
-            </w:pPr>
-            <w:r>
-              <w:t>Lorem ipsum</w:t>
-            </w:r>
-          </w:p>
-        </w:tc>
-        <w:tc>
-          <w:tcPr>
-            <w:tcW w:w="3117" w:type="dxa"/>
-          </w:tcPr>
-          <w:p>
-            <w:pPr>
-              <w:pStyle w:val="TableCell"/>
-            </w:pPr>
-            <w:r>
-              <w:t>Augue vel tellus</w:t>
-            </w:r>
-          </w:p>
-        </w:tc>
-        <w:tc>
-          <w:tcPr>
-            <w:tcW w:w="3117" w:type="dxa"/>
-          </w:tcPr>
-          <w:p>
-            <w:pPr>
-              <w:pStyle w:val="TableCell"/>
-            </w:pPr>
-            <w:r>
-              <w:t>Sed sagittis</w:t>
-            </w:r>
-          </w:p>
-        </w:tc>
-      </w:tr>
-      <w:tr>
-        <w:tc>
-          <w:tcPr>
-            <w:tcW w:w="3116" w:type="dxa"/>
-          </w:tcPr>
-          <w:p>
-            <w:pPr>
-              <w:pStyle w:val="TableCell"/>
-            </w:pPr>
-            <w:r>
-              <w:t>Est blandit</w:t>
-            </w:r>
-          </w:p>
-        </w:tc>
-        <w:tc>
-          <w:tcPr>
-            <w:tcW w:w="3117" w:type="dxa"/>
-          </w:tcPr>
-          <w:p>
-            <w:pPr>
-              <w:pStyle w:val="TableCell"/>
-            </w:pPr>
-            <w:r>
-              <w:t>0</w:t>
-            </w:r>
-          </w:p>
-        </w:tc>
-        <w:tc>
-          <w:tcPr>
-            <w:tcW w:w="3117" w:type="dxa"/>
-          </w:tcPr>
-          <w:p>
-            <w:pPr>
-              <w:pStyle w:val="TableCell"/>
-            </w:pPr>
-            <w:r>
-              <w:t>1</w:t>
-            </w:r>
-          </w:p>
-        </w:tc>
-      </w:tr>
-      <w:tr>
-        <w:tc>
-          <w:tcPr>
-            <w:tcW w:w="3116" w:type="dxa"/>
-          </w:tcPr>
-          <w:p>
-            <w:pPr>
-              <w:pStyle w:val="TableCell"/>
-            </w:pPr>
-            <w:r>
-              <w:t>Sed est</w:t>
-            </w:r>
-          </w:p>
-        </w:tc>
-        <w:tc>
-          <w:tcPr>
-            <w:tcW w:w="3117" w:type="dxa"/>
-          </w:tcPr>
-          <w:p>
-            <w:pPr>
-              <w:pStyle w:val="TableCell"/>
-            </w:pPr>
-            <w:r>
-              <w:t>0</w:t>
-            </w:r>
-          </w:p>
-        </w:tc>
-        <w:tc>
-          <w:tcPr>
-            <w:tcW w:w="3117" w:type="dxa"/>
-          </w:tcPr>
-          <w:p>
-            <w:pPr>
-              <w:pStyle w:val="TableCell"/>
-            </w:pPr>
-            <w:r>
-              <w:t>1</w:t>
-            </w:r>
-          </w:p>
-        </w:tc>
-      </w:tr>
-    </w:tbl>
-    <w:p>
-      <w:pPr>
-        <w:pStyle w:val="TableDescription"/>
-      </w:pPr>
-      <w:r>
-        <w:t>Table description style</w:t>
-      </w:r>
     </w:p>
     <w:p>
       <w:pPr>
         <w:pStyle w:val="BodyText"/>
+      </w:pPr>
+    </w:p>
+    <w:p>
+      <w:pPr>
+        <w:pStyle w:val="Heading2"/>
         <w:sectPr>
           <w:pgSz w:w="12240" w:h="15840"/>
           <w:pgMar w:top="1440" w:right="1440" w:bottom="1440" w:left="2160" w:header="720" w:footer="720" w:gutter="0"/>
@@ -4671,160 +3792,13 @@
           <w:docGrid w:linePitch="360"/>
         </w:sectPr>
       </w:pPr>
-    </w:p>
-    <w:p>
-      <w:pPr>
-        <w:pStyle w:val="Heading2"/>
-      </w:pPr>
-      <w:bookmarkStart w:id="64" w:name="_Toc171427406"/>
-      <w:r>
-        <w:lastRenderedPageBreak/>
-        <w:t>Appendix 2</w:t>
-      </w:r>
-      <w:r>
-        <w:t>.</w:t>
-      </w:r>
       <w:r>
         <w:br/>
-        <w:t>Title</w:t>
-      </w:r>
-      <w:bookmarkEnd w:id="64"/>
-    </w:p>
-    <w:p>
-      <w:pPr>
-        <w:pStyle w:val="BodyText"/>
-      </w:pPr>
-      <w:r>
-        <w:t>The following is placeholder text to show you how an appendix might fill out with an image, figure title and description. Delete and replace with your own as necessary</w:t>
-      </w:r>
-      <w:r>
-        <w:t>.</w:t>
-      </w:r>
-    </w:p>
-    <w:bookmarkStart w:id="65" w:name="_Toc473816964"/>
-    <w:p>
-      <w:pPr>
-        <w:pStyle w:val="Figure"/>
-      </w:pPr>
-      <w:r>
-        <w:rPr>
-          <w:noProof/>
-          <w:shd w:val="clear" w:color="auto" w:fill="auto"/>
-        </w:rPr>
-        <mc:AlternateContent>
-          <mc:Choice Requires="wps">
-            <w:drawing>
-              <wp:inline distT="0" distB="0" distL="0" distR="0" wp14:anchorId="2F4A5860" wp14:editId="522D2D25">
-                <wp:extent cx="5157216" cy="1005840"/>
-                <wp:effectExtent l="0" t="0" r="24765" b="22860"/>
-                <wp:docPr id="1" name="Rectangle 1" descr="Image of grey box"/>
-                <wp:cNvGraphicFramePr/>
-                <a:graphic xmlns:a="http://schemas.openxmlformats.org/drawingml/2006/main">
-                  <a:graphicData uri="http://schemas.microsoft.com/office/word/2010/wordprocessingShape">
-                    <wps:wsp>
-                      <wps:cNvSpPr/>
-                      <wps:spPr>
-                        <a:xfrm>
-                          <a:off x="0" y="0"/>
-                          <a:ext cx="5157216" cy="1005840"/>
-                        </a:xfrm>
-                        <a:prstGeom prst="rect">
-                          <a:avLst/>
-                        </a:prstGeom>
-                      </wps:spPr>
-                      <wps:style>
-                        <a:lnRef idx="2">
-                          <a:schemeClr val="accent3">
-                            <a:shade val="50000"/>
-                          </a:schemeClr>
-                        </a:lnRef>
-                        <a:fillRef idx="1">
-                          <a:schemeClr val="accent3"/>
-                        </a:fillRef>
-                        <a:effectRef idx="0">
-                          <a:schemeClr val="accent3"/>
-                        </a:effectRef>
-                        <a:fontRef idx="minor">
-                          <a:schemeClr val="lt1"/>
-                        </a:fontRef>
-                      </wps:style>
-                      <wps:bodyPr rot="0" spcFirstLastPara="0" vertOverflow="overflow" horzOverflow="overflow" vert="horz" wrap="square" lIns="91440" tIns="45720" rIns="91440" bIns="45720" numCol="1" spcCol="0" rtlCol="0" fromWordArt="0" anchor="ctr" anchorCtr="0" forceAA="0" compatLnSpc="1">
-                        <a:prstTxWarp prst="textNoShape">
-                          <a:avLst/>
-                        </a:prstTxWarp>
-                        <a:noAutofit/>
-                      </wps:bodyPr>
-                    </wps:wsp>
-                  </a:graphicData>
-                </a:graphic>
-              </wp:inline>
-            </w:drawing>
-          </mc:Choice>
-          <mc:Fallback>
-            <w:pict>
-              <v:rect w14:anchorId="1CF398C0" id="Rectangle 1" o:spid="_x0000_s1026" alt="Image of grey box" style="width:406.1pt;height:79.2pt;visibility:visible;mso-wrap-style:square;mso-left-percent:-10001;mso-top-percent:-10001;mso-position-horizontal:absolute;mso-position-horizontal-relative:char;mso-position-vertical:absolute;mso-position-vertical-relative:line;mso-left-percent:-10001;mso-top-percent:-10001;v-text-anchor:middle" o:gfxdata="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" fillcolor="#a5a5a5 [3206]" strokecolor="#525252 [1606]" strokeweight="1pt">
-                <w10:anchorlock/>
-              </v:rect>
-            </w:pict>
-          </mc:Fallback>
-        </mc:AlternateContent>
-      </w:r>
-    </w:p>
-    <w:p>
-      <w:pPr>
-        <w:pStyle w:val="FigureTitle"/>
-      </w:pPr>
-      <w:bookmarkStart w:id="66" w:name="_Toc500510492"/>
-      <w:r>
-        <w:t>Figure 2</w:t>
-      </w:r>
-      <w:r>
-        <w:t xml:space="preserve">. </w:t>
-      </w:r>
-      <w:r>
-        <w:t>Figure Title</w:t>
-      </w:r>
-      <w:bookmarkEnd w:id="65"/>
-      <w:bookmarkEnd w:id="66"/>
-      <w:r>
-        <w:t>.</w:t>
-      </w:r>
-    </w:p>
-    <w:p>
-      <w:pPr>
-        <w:pStyle w:val="FigureDescription"/>
-      </w:pPr>
-      <w:r>
-        <w:t xml:space="preserve">Sample text for Figure </w:t>
-      </w:r>
-      <w:r>
-        <w:t>2</w:t>
-      </w:r>
-      <w:r>
-        <w:t xml:space="preserve"> description</w:t>
-      </w:r>
-    </w:p>
-    <w:p>
-      <w:pPr>
-        <w:pStyle w:val="BodyText"/>
-        <w:sectPr>
-          <w:pgSz w:w="12240" w:h="15840"/>
-          <w:pgMar w:top="1440" w:right="1440" w:bottom="1440" w:left="2160" w:header="720" w:footer="720" w:gutter="0"/>
-          <w:cols w:space="720"/>
-          <w:docGrid w:linePitch="360"/>
-        </w:sectPr>
-      </w:pPr>
-      <w:r>
-        <w:t>We hope that this thesis template helps you to concentrate on the substance of your writing as opposed to spending time on formatting details, and that</w:t>
-      </w:r>
-      <w:r>
-        <w:t xml:space="preserve"> </w:t>
-      </w:r>
-      <w:r>
-        <w:t>your thesis work goes as well as possible for you!</w:t>
-      </w:r>
-    </w:p>
-    <w:bookmarkStart w:id="67" w:name="_Toc171427407" w:displacedByCustomXml="next"/>
+      </w:r>
+      <w:bookmarkStart w:id="24" w:name="_Hlk100312797"/>
+      <w:bookmarkEnd w:id="23"/>
+    </w:p>
+    <w:bookmarkStart w:id="25" w:name="_Toc171427407" w:displacedByCustomXml="next"/>
     <w:sdt>
       <w:sdtPr>
         <w:alias w:val="Blibiography/reference/Works Cited"/>
@@ -4850,13 +3824,21 @@
         </w:p>
       </w:sdtContent>
     </w:sdt>
-    <w:bookmarkEnd w:id="67" w:displacedByCustomXml="prev"/>
+    <w:bookmarkEnd w:id="25" w:displacedByCustomXml="prev"/>
     <w:p>
       <w:pPr>
         <w:pStyle w:val="BodyText"/>
       </w:pPr>
       <w:r>
-        <w:t xml:space="preserve">Note that you should use just one of the following reference styles, depending on which format style your Thesis Director has asked you to use.  If you have any questions about the correcting formatting for the many different types of sources you might be referencing (e.g. books, articles, online articles, newspaper articles) then check with a publication manual for the particular reference style you are using, and/or use a reference generation program such as Zotero or Refworks. </w:t>
+        <w:t xml:space="preserve">Note that you should use just one of the following reference styles, depending on which format style your Thesis Director has asked you to use.  If you have any questions about the correcting formatting for the many different types of sources you might be referencing (e.g. books, articles, online articles, newspaper articles) then check with a publication manual for the particular reference style you are using, and/or use a reference generation program such as Zotero or </w:t>
+      </w:r>
+      <w:proofErr w:type="spellStart"/>
+      <w:r>
+        <w:t>Refworks</w:t>
+      </w:r>
+      <w:proofErr w:type="spellEnd"/>
+      <w:r>
+        <w:t xml:space="preserve">. </w:t>
       </w:r>
     </w:p>
     <w:p>
@@ -4914,7 +3896,7 @@
       <w:r>
         <w:t xml:space="preserve"> Place of publication: Publisher, Year.</w:t>
       </w:r>
-      <w:bookmarkEnd w:id="62"/>
+      <w:bookmarkEnd w:id="24"/>
     </w:p>
     <w:sectPr>
       <w:pgSz w:w="12240" w:h="15840"/>
@@ -4924,198 +3906,6 @@
     </w:sectPr>
   </w:body>
 </w:document>
-</file>
-
-<file path=word/comments.xml><?xml version="1.0" encoding="utf-8"?>
-<w:comments xmlns:wpc="http://schemas.microsoft.com/office/word/2010/wordprocessingCanvas" xmlns:cx="http://schemas.microsoft.com/office/drawing/2014/chartex" xmlns:cx1="http://schemas.microsoft.com/office/drawing/2015/9/8/chartex" xmlns:cx2="http://schemas.microsoft.com/office/drawing/2015/10/21/chartex" xmlns:cx3="http://schemas.microsoft.com/office/drawing/2016/5/9/chartex" xmlns:cx4="http://schemas.microsoft.com/office/drawing/2016/5/10/chartex" xmlns:cx5="http://schemas.microsoft.com/office/drawing/2016/5/11/chartex" xmlns:cx6="http://schemas.microsoft.com/office/drawing/2016/5/12/chartex" xmlns:cx7="http://schemas.microsoft.com/office/drawing/2016/5/13/chartex" xmlns:cx8="http://schemas.microsoft.com/office/drawing/2016/5/14/chartex" xmlns:mc="http://schemas.openxmlformats.org/markup-compatibility/2006" xmlns:aink="http://schemas.microsoft.com/office/drawing/2016/ink" xmlns:am3d="http://schemas.microsoft.com/office/drawing/2017/model3d" xmlns:o="urn:schemas-microsoft-com:office:office" xmlns:oel="http://schemas.microsoft.com/office/2019/extlst" xmlns:r="http://schemas.openxmlformats.org/officeDocument/2006/relationships" xmlns:m="http://schemas.openxmlformats.org/officeDocument/2006/math" xmlns:v="urn:schemas-microsoft-com:vml" xmlns:wp14="http://schemas.microsoft.com/office/word/2010/wordprocessingDrawing" xmlns:wp="http://schemas.openxmlformats.org/drawingml/2006/wordprocessingDrawing" xmlns:w10="urn:schemas-microsoft-com:office:word" xmlns:w="http://schemas.openxmlformats.org/wordprocessingml/2006/main" xmlns:w14="http://schemas.microsoft.com/office/word/2010/wordml" xmlns:w15="http://schemas.microsoft.com/office/word/2012/wordml" xmlns:w16cex="http://schemas.microsoft.com/office/word/2018/wordml/cex" xmlns:w16cid="http://schemas.microsoft.com/office/word/2016/wordml/cid" xmlns:w16="http://schemas.microsoft.com/office/word/2018/wordml" xmlns:w16du="http://schemas.microsoft.com/office/word/2023/wordml/word16du" xmlns:w16sdtdh="http://schemas.microsoft.com/office/word/2020/wordml/sdtdatahash" xmlns:w16sdtfl="http://schemas.microsoft.com/office/word/2024/wordml/sdtformatlock" xmlns:w16se="http://schemas.microsoft.com/office/word/2015/wordml/symex" xmlns:wpg="http://schemas.microsoft.com/office/word/2010/wordprocessingGroup" xmlns:wpi="http://schemas.microsoft.com/office/word/2010/wordprocessingInk" xmlns:wne="http://schemas.microsoft.com/office/word/2006/wordml" xmlns:wps="http://schemas.microsoft.com/office/word/2010/wordprocessingShape" mc:Ignorable="w14 w15 w16se w16cid w16 w16cex w16sdtdh w16sdtfl w16du wp14">
-  <w:comment w:id="21" w:author="TEMPLATE NOTE" w:date="2017-02-01T15:03:00Z" w:initials="TN">
-    <w:p>
-      <w:pPr>
-        <w:pStyle w:val="CommentText"/>
-      </w:pPr>
-      <w:r>
-        <w:rPr>
-          <w:rStyle w:val="CommentReference"/>
-        </w:rPr>
-        <w:annotationRef/>
-      </w:r>
-      <w:r>
-        <w:t>The Table of Contents (TOC) is designed to be generated automatically from your headings. It is important not to type in this a</w:t>
-      </w:r>
-      <w:r>
-        <w:t>rea. Instead, To update the TOC</w:t>
-      </w:r>
-      <w:r>
-        <w:t xml:space="preserve"> right-click anywhere in it (not including the title) and select “Update Field”. You will be given the choice of “Update page numbers only” or “Update entire table”. The former will, as it says, change only the page numbers, and only for items already in the TOC; the latter will update the titles as well, and will add new items in accordance with any new headings/section titles you may have created. These will be determined by the use of the appropriate styles. If a header is missing from the TOC after updating the entire table, check that the header in question is using the appropriate heading style, then update the entire TOC again.</w:t>
-      </w:r>
-    </w:p>
-  </w:comment>
-  <w:comment w:id="23" w:author="TEMPLATE NOTE" w:date="2017-02-01T15:03:00Z" w:initials="TN">
-    <w:p>
-      <w:pPr>
-        <w:pStyle w:val="CommentText"/>
-      </w:pPr>
-      <w:r>
-        <w:rPr>
-          <w:rStyle w:val="CommentReference"/>
-        </w:rPr>
-        <w:annotationRef/>
-      </w:r>
-      <w:r>
-        <w:t>To update the List of Tables, which is a specialized TOC, right-click anywhere in it (not including the title) and select “Update Field”. You will be given the choice of “Update page numbers only” or “Update entire table”. The former will, as it says, change only the page numbers, and only for items already in the TOC; the latter will update the titles as well, and will add new items in accordance with any new table titles you may have created. These will be determined by the use of the appropriate styles. If a table title is missing from the list after updating the entire table, check that the table title in question is using the Table Title style, then update the entire TOC again.</w:t>
-      </w:r>
-    </w:p>
-  </w:comment>
-  <w:comment w:id="24" w:author="TEMPLATE NOTE" w:date="2017-02-01T15:03:00Z" w:initials="TN">
-    <w:p>
-      <w:pPr>
-        <w:pStyle w:val="CommentText"/>
-      </w:pPr>
-      <w:r>
-        <w:rPr>
-          <w:rStyle w:val="CommentReference"/>
-        </w:rPr>
-        <w:annotationRef/>
-      </w:r>
-      <w:r>
-        <w:t xml:space="preserve">If not using a List of Tables, delete this section by selecting it in its entirety, including the title and the Section Break, and pressing Backspace or Delete. To see the Section Break, show formatting symbols by clicking the </w:t>
-      </w:r>
-      <w:r>
-        <w:t>¶</w:t>
-      </w:r>
-      <w:r>
-        <w:t xml:space="preserve"> button in the Paragraph section of the Home ribbon, or by pressing Ctrl+Shift+8. Repeat the command to hide them again. Failure to delete the Section Break along with the text will result in a superfluous blank page; accidentally deleting a Section Break you didn’t intend to will remove the page break between sections.</w:t>
-      </w:r>
-    </w:p>
-  </w:comment>
-  <w:comment w:id="26" w:author="TEMPLATE NOTE" w:date="2017-02-01T15:02:00Z" w:initials="TN">
-    <w:p>
-      <w:pPr>
-        <w:pStyle w:val="CommentText"/>
-      </w:pPr>
-      <w:r>
-        <w:rPr>
-          <w:rStyle w:val="CommentReference"/>
-        </w:rPr>
-        <w:annotationRef/>
-      </w:r>
-      <w:r>
-        <w:t>To update the List of Figures, which is a specialized TOC, right-click anywhere in it (not including the title) and select “Update Field”. You will be given the choice of “Update page numbers only” or “Update entire table”. The former will, as it says, change only the page numbers, and only for items already in the TOC; the latter will update the titles as well, and will add new items in accordance with any new figure titles you may have created. These will be determined by the use of the appropriate styles. If a figure title is missing from the list after updating the entire table, check that the figure title in question is using the Figure Title style, then update the entire TOC again.</w:t>
-      </w:r>
-    </w:p>
-  </w:comment>
-  <w:comment w:id="27" w:author="TEMPLATE NOTE" w:date="2017-02-01T15:02:00Z" w:initials="TN">
-    <w:p>
-      <w:pPr>
-        <w:pStyle w:val="CommentText"/>
-      </w:pPr>
-      <w:r>
-        <w:rPr>
-          <w:rStyle w:val="CommentReference"/>
-        </w:rPr>
-        <w:annotationRef/>
-      </w:r>
-      <w:r>
-        <w:t xml:space="preserve">If not using a List of Figures, delete this section by selecting it in its entirety, including the title and the Section Break, and pressing Backspace or Delete. To see the Section Break, show formatting symbols by clicking the </w:t>
-      </w:r>
-      <w:r>
-        <w:t>¶</w:t>
-      </w:r>
-      <w:r>
-        <w:t xml:space="preserve"> button in the Paragraph section of the Home ribbon, or by pressing Ctrl+Shift+8. Repeat the command to hide them again. Failure to delete the Section Break along with the text will result in a superfluous blank page; accidentally deleting a Section Break you didn’t intend to will remove the page break between sections.</w:t>
-      </w:r>
-    </w:p>
-  </w:comment>
-  <w:comment w:id="29" w:author="TEMPLATE NOTES" w:date="2017-02-02T14:39:00Z" w:initials="TN">
-    <w:p>
-      <w:pPr>
-        <w:pStyle w:val="CommentText"/>
-      </w:pPr>
-      <w:r>
-        <w:rPr>
-          <w:rStyle w:val="CommentReference"/>
-        </w:rPr>
-        <w:annotationRef/>
-      </w:r>
-      <w:r>
-        <w:t>You will need to type the chapter number manually for each chapter. Also remember that you need to use a soft return (Shift+Enter) between the chapter number and its title.</w:t>
-      </w:r>
-    </w:p>
-  </w:comment>
-  <w:comment w:id="32" w:author="TEMPLATE NOTES" w:date="2017-02-28T17:50:00Z" w:initials="TN">
-    <w:p>
-      <w:pPr>
-        <w:pStyle w:val="CommentText"/>
-      </w:pPr>
-      <w:r>
-        <w:rPr>
-          <w:rStyle w:val="CommentReference"/>
-        </w:rPr>
-        <w:annotationRef/>
-      </w:r>
-      <w:r>
-        <w:t>In order to get the proper spacing for a chapter heading, go to the Layout tab and click on the Breaks button, then select Next Page under Section Breaks.</w:t>
-      </w:r>
-      <w:r>
-        <w:t xml:space="preserve"> (</w:t>
-      </w:r>
-      <w:r>
-        <w:rPr>
-          <w:b/>
-        </w:rPr>
-        <w:t>Note</w:t>
-      </w:r>
-      <w:r>
-        <w:t>:</w:t>
-      </w:r>
-      <w:r>
-        <w:t xml:space="preserve"> </w:t>
-      </w:r>
-      <w:r>
-        <w:t xml:space="preserve">typically, </w:t>
-      </w:r>
-      <w:r>
-        <w:t>Word will insert a stray paragraph return</w:t>
-      </w:r>
-      <w:r>
-        <w:t xml:space="preserve"> above your heading</w:t>
-      </w:r>
-      <w:r>
-        <w:t xml:space="preserve"> that will need to be deleted</w:t>
-      </w:r>
-      <w:r>
-        <w:t>.</w:t>
-      </w:r>
-      <w:r>
-        <w:t>)</w:t>
-      </w:r>
-    </w:p>
-  </w:comment>
-</w:comments>
-</file>
-
-<file path=word/commentsExtended.xml><?xml version="1.0" encoding="utf-8"?>
-<w15:commentsEx xmlns:wpc="http://schemas.microsoft.com/office/word/2010/wordprocessingCanvas" xmlns:cx="http://schemas.microsoft.com/office/drawing/2014/chartex" xmlns:cx1="http://schemas.microsoft.com/office/drawing/2015/9/8/chartex" xmlns:cx2="http://schemas.microsoft.com/office/drawing/2015/10/21/chartex" xmlns:cx3="http://schemas.microsoft.com/office/drawing/2016/5/9/chartex" xmlns:cx4="http://schemas.microsoft.com/office/drawing/2016/5/10/chartex" xmlns:cx5="http://schemas.microsoft.com/office/drawing/2016/5/11/chartex" xmlns:cx6="http://schemas.microsoft.com/office/drawing/2016/5/12/chartex" xmlns:cx7="http://schemas.microsoft.com/office/drawing/2016/5/13/chartex" xmlns:cx8="http://schemas.microsoft.com/office/drawing/2016/5/14/chartex" xmlns:mc="http://schemas.openxmlformats.org/markup-compatibility/2006" xmlns:aink="http://schemas.microsoft.com/office/drawing/2016/ink" xmlns:am3d="http://schemas.microsoft.com/office/drawing/2017/model3d" xmlns:o="urn:schemas-microsoft-com:office:office" xmlns:oel="http://schemas.microsoft.com/office/2019/extlst" xmlns:r="http://schemas.openxmlformats.org/officeDocument/2006/relationships" xmlns:m="http://schemas.openxmlformats.org/officeDocument/2006/math" xmlns:v="urn:schemas-microsoft-com:vml" xmlns:wp14="http://schemas.microsoft.com/office/word/2010/wordprocessingDrawing" xmlns:wp="http://schemas.openxmlformats.org/drawingml/2006/wordprocessingDrawing" xmlns:w10="urn:schemas-microsoft-com:office:word" xmlns:w="http://schemas.openxmlformats.org/wordprocessingml/2006/main" xmlns:w14="http://schemas.microsoft.com/office/word/2010/wordml" xmlns:w15="http://schemas.microsoft.com/office/word/2012/wordml" xmlns:w16cex="http://schemas.microsoft.com/office/word/2018/wordml/cex" xmlns:w16cid="http://schemas.microsoft.com/office/word/2016/wordml/cid" xmlns:w16="http://schemas.microsoft.com/office/word/2018/wordml" xmlns:w16du="http://schemas.microsoft.com/office/word/2023/wordml/word16du" xmlns:w16sdtdh="http://schemas.microsoft.com/office/word/2020/wordml/sdtdatahash" xmlns:w16sdtfl="http://schemas.microsoft.com/office/word/2024/wordml/sdtformatlock" xmlns:w16se="http://schemas.microsoft.com/office/word/2015/wordml/symex" xmlns:wpg="http://schemas.microsoft.com/office/word/2010/wordprocessingGroup" xmlns:wpi="http://schemas.microsoft.com/office/word/2010/wordprocessingInk" xmlns:wne="http://schemas.microsoft.com/office/word/2006/wordml" xmlns:wps="http://schemas.microsoft.com/office/word/2010/wordprocessingShape" mc:Ignorable="w14 w15 w16se w16cid w16 w16cex w16sdtdh w16sdtfl w16du wp14">
-  <w15:commentEx w15:paraId="7BF796B1" w15:done="0"/>
-  <w15:commentEx w15:paraId="645D00D4" w15:done="0"/>
-  <w15:commentEx w15:paraId="5EF5C105" w15:done="0"/>
-  <w15:commentEx w15:paraId="14FACE43" w15:done="0"/>
-  <w15:commentEx w15:paraId="74C793F6" w15:done="0"/>
-  <w15:commentEx w15:paraId="27844A57" w15:done="0"/>
-  <w15:commentEx w15:paraId="4B9EC210" w15:done="0"/>
-</w15:commentsEx>
-</file>
-
-<file path=word/commentsIds.xml><?xml version="1.0" encoding="utf-8"?>
-<w16cid:commentsIds xmlns:wpc="http://schemas.microsoft.com/office/word/2010/wordprocessingCanvas" xmlns:cx="http://schemas.microsoft.com/office/drawing/2014/chartex" xmlns:cx1="http://schemas.microsoft.com/office/drawing/2015/9/8/chartex" xmlns:cx2="http://schemas.microsoft.com/office/drawing/2015/10/21/chartex" xmlns:cx3="http://schemas.microsoft.com/office/drawing/2016/5/9/chartex" xmlns:cx4="http://schemas.microsoft.com/office/drawing/2016/5/10/chartex" xmlns:cx5="http://schemas.microsoft.com/office/drawing/2016/5/11/chartex" xmlns:cx6="http://schemas.microsoft.com/office/drawing/2016/5/12/chartex" xmlns:cx7="http://schemas.microsoft.com/office/drawing/2016/5/13/chartex" xmlns:cx8="http://schemas.microsoft.com/office/drawing/2016/5/14/chartex" xmlns:mc="http://schemas.openxmlformats.org/markup-compatibility/2006" xmlns:aink="http://schemas.microsoft.com/office/drawing/2016/ink" xmlns:am3d="http://schemas.microsoft.com/office/drawing/2017/model3d" xmlns:o="urn:schemas-microsoft-com:office:office" xmlns:oel="http://schemas.microsoft.com/office/2019/extlst" xmlns:r="http://schemas.openxmlformats.org/officeDocument/2006/relationships" xmlns:m="http://schemas.openxmlformats.org/officeDocument/2006/math" xmlns:v="urn:schemas-microsoft-com:vml" xmlns:wp14="http://schemas.microsoft.com/office/word/2010/wordprocessingDrawing" xmlns:wp="http://schemas.openxmlformats.org/drawingml/2006/wordprocessingDrawing" xmlns:w10="urn:schemas-microsoft-com:office:word" xmlns:w="http://schemas.openxmlformats.org/wordprocessingml/2006/main" xmlns:w14="http://schemas.microsoft.com/office/word/2010/wordml" xmlns:w15="http://schemas.microsoft.com/office/word/2012/wordml" xmlns:w16cex="http://schemas.microsoft.com/office/word/2018/wordml/cex" xmlns:w16cid="http://schemas.microsoft.com/office/word/2016/wordml/cid" xmlns:w16="http://schemas.microsoft.com/office/word/2018/wordml" xmlns:w16du="http://schemas.microsoft.com/office/word/2023/wordml/word16du" xmlns:w16sdtdh="http://schemas.microsoft.com/office/word/2020/wordml/sdtdatahash" xmlns:w16sdtfl="http://schemas.microsoft.com/office/word/2024/wordml/sdtformatlock" xmlns:w16se="http://schemas.microsoft.com/office/word/2015/wordml/symex" xmlns:wpg="http://schemas.microsoft.com/office/word/2010/wordprocessingGroup" xmlns:wpi="http://schemas.microsoft.com/office/word/2010/wordprocessingInk" xmlns:wne="http://schemas.microsoft.com/office/word/2006/wordml" xmlns:wps="http://schemas.microsoft.com/office/word/2010/wordprocessingShape" mc:Ignorable="w14 w15 w16se w16cid w16 w16cex w16sdtdh w16sdtfl w16du wp14">
-  <w16cid:commentId w16cid:paraId="7BF796B1" w16cid:durableId="2485AFE3"/>
-  <w16cid:commentId w16cid:paraId="645D00D4" w16cid:durableId="2485AFE4"/>
-  <w16cid:commentId w16cid:paraId="5EF5C105" w16cid:durableId="2485AFE5"/>
-  <w16cid:commentId w16cid:paraId="14FACE43" w16cid:durableId="2485AFE6"/>
-  <w16cid:commentId w16cid:paraId="74C793F6" w16cid:durableId="2485AFE7"/>
-  <w16cid:commentId w16cid:paraId="27844A57" w16cid:durableId="2485AFE8"/>
-  <w16cid:commentId w16cid:paraId="4B9EC210" w16cid:durableId="2485AFE9"/>
-</w16cid:commentsIds>
 </file>
 
 <file path=word/endnotes.xml><?xml version="1.0" encoding="utf-8"?>
@@ -5701,14 +4491,6 @@
   </w:num>
   <w:numIdMacAtCleanup w:val="3"/>
 </w:numbering>
-</file>
-
-<file path=word/people.xml><?xml version="1.0" encoding="utf-8"?>
-<w15:people xmlns:wpc="http://schemas.microsoft.com/office/word/2010/wordprocessingCanvas" xmlns:cx="http://schemas.microsoft.com/office/drawing/2014/chartex" xmlns:cx1="http://schemas.microsoft.com/office/drawing/2015/9/8/chartex" xmlns:cx2="http://schemas.microsoft.com/office/drawing/2015/10/21/chartex" xmlns:cx3="http://schemas.microsoft.com/office/drawing/2016/5/9/chartex" xmlns:cx4="http://schemas.microsoft.com/office/drawing/2016/5/10/chartex" xmlns:cx5="http://schemas.microsoft.com/office/drawing/2016/5/11/chartex" xmlns:cx6="http://schemas.microsoft.com/office/drawing/2016/5/12/chartex" xmlns:cx7="http://schemas.microsoft.com/office/drawing/2016/5/13/chartex" xmlns:cx8="http://schemas.microsoft.com/office/drawing/2016/5/14/chartex" xmlns:mc="http://schemas.openxmlformats.org/markup-compatibility/2006" xmlns:aink="http://schemas.microsoft.com/office/drawing/2016/ink" xmlns:am3d="http://schemas.microsoft.com/office/drawing/2017/model3d" xmlns:o="urn:schemas-microsoft-com:office:office" xmlns:oel="http://schemas.microsoft.com/office/2019/extlst" xmlns:r="http://schemas.openxmlformats.org/officeDocument/2006/relationships" xmlns:m="http://schemas.openxmlformats.org/officeDocument/2006/math" xmlns:v="urn:schemas-microsoft-com:vml" xmlns:wp14="http://schemas.microsoft.com/office/word/2010/wordprocessingDrawing" xmlns:wp="http://schemas.openxmlformats.org/drawingml/2006/wordprocessingDrawing" xmlns:w10="urn:schemas-microsoft-com:office:word" xmlns:w="http://schemas.openxmlformats.org/wordprocessingml/2006/main" xmlns:w14="http://schemas.microsoft.com/office/word/2010/wordml" xmlns:w15="http://schemas.microsoft.com/office/word/2012/wordml" xmlns:w16cex="http://schemas.microsoft.com/office/word/2018/wordml/cex" xmlns:w16cid="http://schemas.microsoft.com/office/word/2016/wordml/cid" xmlns:w16="http://schemas.microsoft.com/office/word/2018/wordml" xmlns:w16du="http://schemas.microsoft.com/office/word/2023/wordml/word16du" xmlns:w16sdtdh="http://schemas.microsoft.com/office/word/2020/wordml/sdtdatahash" xmlns:w16sdtfl="http://schemas.microsoft.com/office/word/2024/wordml/sdtformatlock" xmlns:w16se="http://schemas.microsoft.com/office/word/2015/wordml/symex" xmlns:wpg="http://schemas.microsoft.com/office/word/2010/wordprocessingGroup" xmlns:wpi="http://schemas.microsoft.com/office/word/2010/wordprocessingInk" xmlns:wne="http://schemas.microsoft.com/office/word/2006/wordml" xmlns:wps="http://schemas.microsoft.com/office/word/2010/wordprocessingShape" mc:Ignorable="w14 w15 w16se w16cid w16 w16cex w16sdtdh w16sdtfl w16du wp14">
-  <w15:person w15:author="TEMPLATE NOTE">
-    <w15:presenceInfo w15:providerId="None" w15:userId="TEMPLATE NOTE"/>
-  </w15:person>
-</w15:people>
 </file>
 
 <file path=word/styles.xml><?xml version="1.0" encoding="utf-8"?>
@@ -7328,6 +6110,8 @@
     <w:rsid w:val="006A1CAC"/>
     <w:rsid w:val="007D12E9"/>
     <w:rsid w:val="009401DB"/>
+    <w:rsid w:val="00D2747B"/>
+    <w:rsid w:val="00FE3591"/>
   </w:rsids>
   <m:mathPr>
     <m:mathFont m:val="Cambria Math"/>
@@ -8105,30 +6889,6 @@
 </file>
 
 <file path=customXml/item1.xml><?xml version="1.0" encoding="utf-8"?>
-<p:properties xmlns:p="http://schemas.microsoft.com/office/2006/metadata/properties" xmlns:xsi="http://www.w3.org/2001/XMLSchema-instance" xmlns:pc="http://schemas.microsoft.com/office/infopath/2007/PartnerControls">
-  <documentManagement>
-    <TaxCatchAll xmlns="b547c7a7-201d-4fd1-b061-320e39927fa6" xsi:nil="true"/>
-    <lcf76f155ced4ddcb4097134ff3c332f xmlns="8fa0fc1d-bd80-47fb-a35f-9b4442274e73">
-      <Terms xmlns="http://schemas.microsoft.com/office/infopath/2007/PartnerControls"/>
-    </lcf76f155ced4ddcb4097134ff3c332f>
-  </documentManagement>
-</p:properties>
-</file>
-
-<file path=customXml/item2.xml><?xml version="1.0" encoding="utf-8"?>
-<?mso-contentType ?>
-<FormTemplates xmlns="http://schemas.microsoft.com/sharepoint/v3/contenttype/forms">
-  <Display>DocumentLibraryForm</Display>
-  <Edit>DocumentLibraryForm</Edit>
-  <New>DocumentLibraryForm</New>
-</FormTemplates>
-</file>
-
-<file path=customXml/item3.xml><?xml version="1.0" encoding="utf-8"?>
-<b:Sources xmlns:b="http://schemas.openxmlformats.org/officeDocument/2006/bibliography" xmlns="http://schemas.openxmlformats.org/officeDocument/2006/bibliography" SelectedStyle="\CHICAGO.XSL" StyleName="Chicago" Version="16"/>
-</file>
-
-<file path=customXml/item4.xml><?xml version="1.0" encoding="utf-8"?>
 <ct:contentTypeSchema xmlns:ct="http://schemas.microsoft.com/office/2006/metadata/contentType" xmlns:ma="http://schemas.microsoft.com/office/2006/metadata/properties/metaAttributes" ct:_="" ma:_="" ma:contentTypeName="Document" ma:contentTypeID="0x010100276E619CE5B0C9458323E0289773CDB2" ma:contentTypeVersion="13" ma:contentTypeDescription="Create a new document." ma:contentTypeScope="" ma:versionID="a63989fa12e49b30413b2cc17eee567c">
   <xsd:schema xmlns:xsd="http://www.w3.org/2001/XMLSchema" xmlns:xs="http://www.w3.org/2001/XMLSchema" xmlns:p="http://schemas.microsoft.com/office/2006/metadata/properties" xmlns:ns2="8fa0fc1d-bd80-47fb-a35f-9b4442274e73" xmlns:ns3="b547c7a7-201d-4fd1-b061-320e39927fa6" targetNamespace="http://schemas.microsoft.com/office/2006/metadata/properties" ma:root="true" ma:fieldsID="97c49544893c4cf780a07531db0e7f35" ns2:_="" ns3:_="">
     <xsd:import namespace="8fa0fc1d-bd80-47fb-a35f-9b4442274e73"/>
@@ -8337,34 +7097,31 @@
 </ct:contentTypeSchema>
 </file>
 
-<file path=customXml/itemProps1.xml><?xml version="1.0" encoding="utf-8"?>
-<ds:datastoreItem xmlns:ds="http://schemas.openxmlformats.org/officeDocument/2006/customXml" ds:itemID="{2ACA577D-FEEF-482F-BA77-960FB70F6C19}">
-  <ds:schemaRefs>
-    <ds:schemaRef ds:uri="http://schemas.microsoft.com/office/2006/metadata/properties"/>
-    <ds:schemaRef ds:uri="http://schemas.microsoft.com/office/infopath/2007/PartnerControls"/>
-    <ds:schemaRef ds:uri="b547c7a7-201d-4fd1-b061-320e39927fa6"/>
-    <ds:schemaRef ds:uri="8fa0fc1d-bd80-47fb-a35f-9b4442274e73"/>
-  </ds:schemaRefs>
-</ds:datastoreItem>
+<file path=customXml/item2.xml><?xml version="1.0" encoding="utf-8"?>
+<b:Sources xmlns:b="http://schemas.openxmlformats.org/officeDocument/2006/bibliography" xmlns="http://schemas.openxmlformats.org/officeDocument/2006/bibliography" SelectedStyle="\CHICAGO.XSL" StyleName="Chicago" Version="16"/>
 </file>
 
-<file path=customXml/itemProps2.xml><?xml version="1.0" encoding="utf-8"?>
-<ds:datastoreItem xmlns:ds="http://schemas.openxmlformats.org/officeDocument/2006/customXml" ds:itemID="{9801C557-CEF7-427D-B819-762B914EB920}">
-  <ds:schemaRefs>
-    <ds:schemaRef ds:uri="http://schemas.microsoft.com/sharepoint/v3/contenttype/forms"/>
-  </ds:schemaRefs>
-</ds:datastoreItem>
+<file path=customXml/item3.xml><?xml version="1.0" encoding="utf-8"?>
+<?mso-contentType ?>
+<FormTemplates xmlns="http://schemas.microsoft.com/sharepoint/v3/contenttype/forms">
+  <Display>DocumentLibraryForm</Display>
+  <Edit>DocumentLibraryForm</Edit>
+  <New>DocumentLibraryForm</New>
+</FormTemplates>
 </file>
 
-<file path=customXml/itemProps3.xml><?xml version="1.0" encoding="utf-8"?>
-<ds:datastoreItem xmlns:ds="http://schemas.openxmlformats.org/officeDocument/2006/customXml" ds:itemID="{60C05EF6-3C86-4BF8-8F65-939956D2A6F8}">
-  <ds:schemaRefs>
-    <ds:schemaRef ds:uri="http://schemas.openxmlformats.org/officeDocument/2006/bibliography"/>
-  </ds:schemaRefs>
-</ds:datastoreItem>
+<file path=customXml/item4.xml><?xml version="1.0" encoding="utf-8"?>
+<p:properties xmlns:p="http://schemas.microsoft.com/office/2006/metadata/properties" xmlns:xsi="http://www.w3.org/2001/XMLSchema-instance" xmlns:pc="http://schemas.microsoft.com/office/infopath/2007/PartnerControls">
+  <documentManagement>
+    <TaxCatchAll xmlns="b547c7a7-201d-4fd1-b061-320e39927fa6" xsi:nil="true"/>
+    <lcf76f155ced4ddcb4097134ff3c332f xmlns="8fa0fc1d-bd80-47fb-a35f-9b4442274e73">
+      <Terms xmlns="http://schemas.microsoft.com/office/infopath/2007/PartnerControls"/>
+    </lcf76f155ced4ddcb4097134ff3c332f>
+  </documentManagement>
+</p:properties>
 </file>
 
-<file path=customXml/itemProps4.xml><?xml version="1.0" encoding="utf-8"?>
+<file path=customXml/itemProps1.xml><?xml version="1.0" encoding="utf-8"?>
 <ds:datastoreItem xmlns:ds="http://schemas.openxmlformats.org/officeDocument/2006/customXml" ds:itemID="{1D4DC707-92E4-4316-A04E-EB82A5B6829D}">
   <ds:schemaRefs>
     <ds:schemaRef ds:uri="http://schemas.microsoft.com/office/2006/metadata/contentType"/>
@@ -8381,4 +7138,31 @@
     <ds:schemaRef ds:uri="http://schemas.microsoft.com/internal/obd"/>
   </ds:schemaRefs>
 </ds:datastoreItem>
+</file>
+
+<file path=customXml/itemProps2.xml><?xml version="1.0" encoding="utf-8"?>
+<ds:datastoreItem xmlns:ds="http://schemas.openxmlformats.org/officeDocument/2006/customXml" ds:itemID="{60C05EF6-3C86-4BF8-8F65-939956D2A6F8}">
+  <ds:schemaRefs>
+    <ds:schemaRef ds:uri="http://schemas.openxmlformats.org/officeDocument/2006/bibliography"/>
+  </ds:schemaRefs>
+</ds:datastoreItem>
+</file>
+
+<file path=customXml/itemProps3.xml><?xml version="1.0" encoding="utf-8"?>
+<ds:datastoreItem xmlns:ds="http://schemas.openxmlformats.org/officeDocument/2006/customXml" ds:itemID="{9801C557-CEF7-427D-B819-762B914EB920}">
+  <ds:schemaRefs>
+    <ds:schemaRef ds:uri="http://schemas.microsoft.com/sharepoint/v3/contenttype/forms"/>
+  </ds:schemaRefs>
+</ds:datastoreItem>
+</file>
+
+<file path=customXml/itemProps4.xml><?xml version="1.0" encoding="utf-8"?>
+<ds:datastoreItem xmlns:ds="http://schemas.openxmlformats.org/officeDocument/2006/customXml" ds:itemID="{2ACA577D-FEEF-482F-BA77-960FB70F6C19}">
+  <ds:schemaRefs>
+    <ds:schemaRef ds:uri="http://schemas.microsoft.com/office/2006/metadata/properties"/>
+    <ds:schemaRef ds:uri="http://schemas.microsoft.com/office/infopath/2007/PartnerControls"/>
+    <ds:schemaRef ds:uri="b547c7a7-201d-4fd1-b061-320e39927fa6"/>
+    <ds:schemaRef ds:uri="8fa0fc1d-bd80-47fb-a35f-9b4442274e73"/>
+  </ds:schemaRefs>
+</ds:datastoreItem>
 </file>
</xml_diff>